<commit_message>
Regenerate the AI documentation DOCX and PDF
Render version 1.1 with its diagrams.
</commit_message>
<xml_diff>
--- a/docs/SmartPot_AI_Documentation.docx
+++ b/docs/SmartPot_AI_Documentation.docx
@@ -359,7 +359,7 @@
                 <w:sz w:val="19"/>
                 <w:szCs w:val="19"/>
               </w:rPr>
-              <w:t xml:space="preserve">1.0 · septiembre 2026</w:t>
+              <w:t xml:space="preserve">1.1 · octubre 2026</w:t>
             </w:r>
             <w:r>
               <w:rPr>
@@ -729,7 +729,7 @@
                 <w:sz w:val="17"/>
                 <w:szCs w:val="17"/>
               </w:rPr>
-              <w:t xml:space="preserve">1.0 · septiembre 2026</w:t>
+              <w:t xml:space="preserve">1.1 · octubre 2026</w:t>
             </w:r>
           </w:p>
         </w:tc>
@@ -1359,7 +1359,7 @@
           <w:sz w:val="20"/>
           <w:szCs w:val="20"/>
         </w:rPr>
-        <w:t xml:space="preserve">SmartPot-AI es el agrónomo de la plataforma. La API le manda la última lectura de un cultivo, su historial y sus actuadores; el asistente responde cómo está (un índice de salud de 0 a 100), por qué, qué va a pasar en las próximas horas y qué conviene hacer. Además aprende sin parar de las lecturas de los cultivos reales de cada especie, sin saber de qué cuenta viene cada una. Es un servicio interno: solo la API lo consulta, con un token.</w:t>
+        <w:t xml:space="preserve">SmartPot-AI es el agrónomo de la plataforma. La API le manda la última lectura de un cultivo, su historial, sus actuadores, dónde está y el clima de afuera; el asistente responde cómo está (un índice de salud de 0 a 100), por qué, qué va a pasar en las próximas horas y qué conviene hacer. Además aprende sin parar de las lecturas de los cultivos reales de cada especie, sin saber de qué cuenta viene cada una. Es un servicio interno: solo la API lo consulta, con un token.</w:t>
       </w:r>
     </w:p>
     <w:p>
@@ -1839,7 +1839,7 @@
                 <w:sz w:val="17"/>
                 <w:szCs w:val="17"/>
               </w:rPr>
-              <w:t xml:space="preserve">Aprendizaje continuo</w:t>
+              <w:t xml:space="preserve">Consejo de lugar</w:t>
             </w:r>
           </w:p>
         </w:tc>
@@ -1847,6 +1847,65 @@
           <w:tcPr>
             <w:tcW w:w="7235" w:type="dxa"/>
             <w:shd w:val="clear" w:color="auto" w:fill="FFFFFF"/>
+            <w:tcMar>
+              <w:top w:w="70" w:type="dxa"/>
+              <w:left w:w="110" w:type="dxa"/>
+              <w:bottom w:w="70" w:type="dxa"/>
+              <w:right w:w="110" w:type="dxa"/>
+            </w:tcMar>
+            <w:vAlign w:val="center"/>
+          </w:tcPr>
+          <w:p>
+            <w:pPr>
+              <w:spacing w:before="0" w:after="0" w:line="252" w:lineRule="auto"/>
+            </w:pPr>
+            <w:r>
+              <w:rPr>
+                <w:color w:val="17261F"/>
+                <w:sz w:val="17"/>
+                <w:szCs w:val="17"/>
+              </w:rPr>
+              <w:t xml:space="preserve">Si el lugar le sirve a la especie y cuándo conviene moverla</w:t>
+            </w:r>
+          </w:p>
+        </w:tc>
+      </w:tr>
+      <w:tr>
+        <w:trPr>
+          <w:cantSplit/>
+        </w:trPr>
+        <w:tc>
+          <w:tcPr>
+            <w:tcW w:w="2125" w:type="dxa"/>
+            <w:shd w:val="clear" w:color="auto" w:fill="F2F7F4"/>
+            <w:tcMar>
+              <w:top w:w="70" w:type="dxa"/>
+              <w:left w:w="110" w:type="dxa"/>
+              <w:bottom w:w="70" w:type="dxa"/>
+              <w:right w:w="110" w:type="dxa"/>
+            </w:tcMar>
+            <w:vAlign w:val="center"/>
+          </w:tcPr>
+          <w:p>
+            <w:pPr>
+              <w:spacing w:before="0" w:after="0" w:line="252" w:lineRule="auto"/>
+            </w:pPr>
+            <w:r>
+              <w:rPr>
+                <w:b/>
+                <w:bCs/>
+                <w:color w:val="0A5A3C"/>
+                <w:sz w:val="17"/>
+                <w:szCs w:val="17"/>
+              </w:rPr>
+              <w:t xml:space="preserve">Aprendizaje continuo</w:t>
+            </w:r>
+          </w:p>
+        </w:tc>
+        <w:tc>
+          <w:tcPr>
+            <w:tcW w:w="7235" w:type="dxa"/>
+            <w:shd w:val="clear" w:color="auto" w:fill="F2F7F4"/>
             <w:tcMar>
               <w:top w:w="70" w:type="dxa"/>
               <w:left w:w="110" w:type="dxa"/>
@@ -2015,10 +2074,9 @@
     </w:p>
     <w:p>
       <w:pPr>
-        <w:pageBreakBefore/>
-        <w:spacing w:before="0" w:after="0" w:line="20" w:lineRule="exact"/>
-        <w:rPr>
-          <w:sz w:val="2"/>
+        <w:spacing w:before="80" w:after="0" w:line="240" w:lineRule="auto"/>
+        <w:rPr>
+          <w:sz w:val="8"/>
         </w:rPr>
       </w:pPr>
     </w:p>
@@ -2053,6 +2111,863 @@
             <w:tcW w:w="9360" w:type="dxa"/>
             <w:shd w:val="clear" w:color="auto" w:fill="0B3D2B"/>
             <w:tcMar>
+              <w:top w:w="60" w:type="dxa"/>
+              <w:left w:w="200" w:type="dxa"/>
+              <w:bottom w:w="60" w:type="dxa"/>
+              <w:right w:w="200" w:type="dxa"/>
+            </w:tcMar>
+            <w:vAlign w:val="top"/>
+          </w:tcPr>
+          <w:p>
+            <w:pPr>
+              <w:spacing w:before="0" w:after="0" w:line="240" w:lineRule="auto"/>
+            </w:pPr>
+            <w:r>
+              <w:rPr>
+                <w:b/>
+                <w:bCs/>
+                <w:color w:val="7FDBB0"/>
+                <w:spacing w:val="40"/>
+                <w:sz w:val="14"/>
+                <w:szCs w:val="14"/>
+              </w:rPr>
+              <w:t xml:space="preserve">MERMAID</w:t>
+            </w:r>
+          </w:p>
+        </w:tc>
+      </w:tr>
+    </w:tbl>
+    <w:tbl>
+      <w:tblPr>
+        <w:tblW w:w="9360" w:type="dxa"/>
+        <w:tblInd w:w="0" w:type="dxa"/>
+        <w:tblBorders>
+          <w:top w:val="nil"/>
+          <w:left w:val="nil"/>
+          <w:bottom w:val="nil"/>
+          <w:right w:val="nil"/>
+          <w:insideH w:val="nil"/>
+          <w:insideV w:val="nil"/>
+        </w:tblBorders>
+        <w:tblLayout w:type="fixed"/>
+        <w:tblCellMar>
+          <w:left w:w="0" w:type="dxa"/>
+          <w:right w:w="0" w:type="dxa"/>
+        </w:tblCellMar>
+        <w:tblLook w:val="0000" w:firstRow="0" w:lastRow="0" w:firstColumn="0" w:lastColumn="0" w:noHBand="1" w:noVBand="1"/>
+      </w:tblPr>
+      <w:tblGrid>
+        <w:gridCol w:w="9360"/>
+      </w:tblGrid>
+      <w:tr>
+        <w:trPr>
+          <w:cantSplit/>
+        </w:trPr>
+        <w:tc>
+          <w:tcPr>
+            <w:tcW w:w="9360" w:type="dxa"/>
+            <w:shd w:val="clear" w:color="auto" w:fill="F7FAF8"/>
+            <w:tcMar>
+              <w:top w:w="120" w:type="dxa"/>
+              <w:left w:w="200" w:type="dxa"/>
+              <w:bottom w:w="120" w:type="dxa"/>
+              <w:right w:w="200" w:type="dxa"/>
+            </w:tcMar>
+            <w:vAlign w:val="top"/>
+          </w:tcPr>
+          <w:p>
+            <w:pPr>
+              <w:spacing w:before="0" w:after="0" w:line="252" w:lineRule="auto"/>
+            </w:pPr>
+            <w:r>
+              <w:rPr>
+                <w:rFonts w:ascii="JetBrains Mono" w:hAnsi="JetBrains Mono" w:eastAsia="JetBrains Mono" w:cs="JetBrains Mono"/>
+                <w:color w:val="17261F"/>
+                <w:sz w:val="16"/>
+                <w:szCs w:val="16"/>
+              </w:rPr>
+              <w:t xml:space="preserve">%%{init: {"theme": "base", "fontFamily": "Segoe UI, Arial, sans-serif", "themeVariables": {"fontFamily": "Segoe UI, Arial, sans-serif", "fontSize": "15px", "primaryColor": "#DDF5EA", "primaryTextColor": "#17261F", "primaryBorderColor": "#067A52", "secondaryColor": "#E3F2FB", "secondaryTextColor": "#17261F", "secondaryBorderColor": "#1F6FA0", "tertiaryColor": "#F2F7F4", "tertiaryTextColor": "#17261F", "tertiaryBorderColor": "#D5E3DC", "lineColor": "#5B6B63", "textColor": "#17261F", "mainBkg": "#DDF5EA", "nodeBorder": "#067A52", "clusterBkg": "#F7FAF8", "clusterBorder": "#D5E3DC", "edgeLabelBackground": "#FFFFFF", "actorBkg": "#067A52", "actorBorder": "#0B3D2B", "actorTextColor": "#FFFFFF", "actorLineColor": "#5B6B63", "signalColor": "#17261F", "signalTextColor": "#17261F", "labelBoxBkgColor": "#0B3D2B", "labelBoxBorderColor": "#0B3D2B", "labelTextColor": "#FFFFFF", "loopTextColor": "#0B3D2B", "noteBkgColor": "#FDF4DD", "noteBorderColor": "#C98D12", "noteTextColor": "#17261F", "activationBkgColor": "#DDF5EA", "activationBorderColor": "#067A52", "attributeBackgroundColorOdd": "#FFFFFF", "attributeBackgroundColorEven": "#F2F7F4"}, "layout": "elk", "elk": {"nodePlacementStrategy": "BRANDES_KOEPF", "mergeEdges": false, "cycleBreakingStrategy": "GREEDY"}}}%%</w:t>
+            </w:r>
+          </w:p>
+          <w:p>
+            <w:pPr>
+              <w:spacing w:before="0" w:after="0" w:line="252" w:lineRule="auto"/>
+            </w:pPr>
+            <w:r>
+              <w:rPr>
+                <w:rFonts w:ascii="JetBrains Mono" w:hAnsi="JetBrains Mono" w:eastAsia="JetBrains Mono" w:cs="JetBrains Mono"/>
+                <w:color w:val="17261F"/>
+                <w:sz w:val="16"/>
+                <w:szCs w:val="16"/>
+              </w:rPr>
+              <w:t xml:space="preserve">flowchart LR</w:t>
+            </w:r>
+          </w:p>
+          <w:p>
+            <w:pPr>
+              <w:spacing w:before="0" w:after="0" w:line="252" w:lineRule="auto"/>
+            </w:pPr>
+            <w:r>
+              <w:rPr>
+                <w:rFonts w:ascii="JetBrains Mono" w:hAnsi="JetBrains Mono" w:eastAsia="JetBrains Mono" w:cs="JetBrains Mono"/>
+                <w:color w:val="17261F"/>
+                <w:sz w:val="16"/>
+                <w:szCs w:val="16"/>
+              </w:rPr>
+              <w:t xml:space="preserve">  api["SmartPot-API&lt;br/&gt;token de servicio"]</w:t>
+            </w:r>
+          </w:p>
+          <w:p>
+            <w:pPr>
+              <w:spacing w:before="0" w:after="0" w:line="252" w:lineRule="auto"/>
+            </w:pPr>
+            <w:r>
+              <w:rPr>
+                <w:rFonts w:ascii="JetBrains Mono" w:hAnsi="JetBrains Mono" w:eastAsia="JetBrains Mono" w:cs="JetBrains Mono"/>
+                <w:color w:val="17261F"/>
+                <w:sz w:val="16"/>
+                <w:szCs w:val="16"/>
+              </w:rPr>
+              <w:t xml:space="preserve">  subgraph svc["SmartPot-AI · FastAPI · Python 3.13"]</w:t>
+            </w:r>
+          </w:p>
+          <w:p>
+            <w:pPr>
+              <w:spacing w:before="0" w:after="0" w:line="252" w:lineRule="auto"/>
+            </w:pPr>
+            <w:r>
+              <w:rPr>
+                <w:rFonts w:ascii="JetBrains Mono" w:hAnsi="JetBrains Mono" w:eastAsia="JetBrains Mono" w:cs="JetBrains Mono"/>
+                <w:color w:val="17261F"/>
+                <w:sz w:val="16"/>
+                <w:szCs w:val="16"/>
+              </w:rPr>
+              <w:t xml:space="preserve">    direction TB</w:t>
+            </w:r>
+          </w:p>
+          <w:p>
+            <w:pPr>
+              <w:spacing w:before="0" w:after="0" w:line="252" w:lineRule="auto"/>
+            </w:pPr>
+            <w:r>
+              <w:rPr>
+                <w:rFonts w:ascii="JetBrains Mono" w:hAnsi="JetBrains Mono" w:eastAsia="JetBrains Mono" w:cs="JetBrains Mono"/>
+                <w:color w:val="17261F"/>
+                <w:sz w:val="16"/>
+                <w:szCs w:val="16"/>
+              </w:rPr>
+              <w:t xml:space="preserve">    core["core&lt;br/&gt;token en tiempo constante · configuración"]</w:t>
+            </w:r>
+          </w:p>
+          <w:p>
+            <w:pPr>
+              <w:spacing w:before="0" w:after="0" w:line="252" w:lineRule="auto"/>
+            </w:pPr>
+            <w:r>
+              <w:rPr>
+                <w:rFonts w:ascii="JetBrains Mono" w:hAnsi="JetBrains Mono" w:eastAsia="JetBrains Mono" w:cs="JetBrains Mono"/>
+                <w:color w:val="17261F"/>
+                <w:sz w:val="16"/>
+                <w:szCs w:val="16"/>
+              </w:rPr>
+              <w:t xml:space="preserve">    subgraph routers["routers"]</w:t>
+            </w:r>
+          </w:p>
+          <w:p>
+            <w:pPr>
+              <w:spacing w:before="0" w:after="0" w:line="252" w:lineRule="auto"/>
+            </w:pPr>
+            <w:r>
+              <w:rPr>
+                <w:rFonts w:ascii="JetBrains Mono" w:hAnsi="JetBrains Mono" w:eastAsia="JetBrains Mono" w:cs="JetBrains Mono"/>
+                <w:color w:val="17261F"/>
+                <w:sz w:val="16"/>
+                <w:szCs w:val="16"/>
+              </w:rPr>
+              <w:t xml:space="preserve">      direction TB</w:t>
+            </w:r>
+          </w:p>
+          <w:p>
+            <w:pPr>
+              <w:spacing w:before="0" w:after="0" w:line="252" w:lineRule="auto"/>
+            </w:pPr>
+            <w:r>
+              <w:rPr>
+                <w:rFonts w:ascii="JetBrains Mono" w:hAnsi="JetBrains Mono" w:eastAsia="JetBrains Mono" w:cs="JetBrains Mono"/>
+                <w:color w:val="17261F"/>
+                <w:sz w:val="16"/>
+                <w:szCs w:val="16"/>
+              </w:rPr>
+              <w:t xml:space="preserve">      health["health&lt;br/&gt;GET /health"]</w:t>
+            </w:r>
+          </w:p>
+          <w:p>
+            <w:pPr>
+              <w:spacing w:before="0" w:after="0" w:line="252" w:lineRule="auto"/>
+            </w:pPr>
+            <w:r>
+              <w:rPr>
+                <w:rFonts w:ascii="JetBrains Mono" w:hAnsi="JetBrains Mono" w:eastAsia="JetBrains Mono" w:cs="JetBrains Mono"/>
+                <w:color w:val="17261F"/>
+                <w:sz w:val="16"/>
+                <w:szCs w:val="16"/>
+              </w:rPr>
+              <w:t xml:space="preserve">      insights["insights&lt;br/&gt;POST /v1/insights · POST /v1/fleet&lt;br/&gt;GET /v1/crop-profiles · GET /v1/models"]</w:t>
+            </w:r>
+          </w:p>
+          <w:p>
+            <w:pPr>
+              <w:spacing w:before="0" w:after="0" w:line="252" w:lineRule="auto"/>
+            </w:pPr>
+            <w:r>
+              <w:rPr>
+                <w:rFonts w:ascii="JetBrains Mono" w:hAnsi="JetBrains Mono" w:eastAsia="JetBrains Mono" w:cs="JetBrains Mono"/>
+                <w:color w:val="17261F"/>
+                <w:sz w:val="16"/>
+                <w:szCs w:val="16"/>
+              </w:rPr>
+              <w:t xml:space="preserve">      learnr["learning&lt;br/&gt;POST readings · GET status&lt;br/&gt;POST train · DELETE crops/{id}"]</w:t>
+            </w:r>
+          </w:p>
+          <w:p>
+            <w:pPr>
+              <w:spacing w:before="0" w:after="0" w:line="252" w:lineRule="auto"/>
+            </w:pPr>
+            <w:r>
+              <w:rPr>
+                <w:rFonts w:ascii="JetBrains Mono" w:hAnsi="JetBrains Mono" w:eastAsia="JetBrains Mono" w:cs="JetBrains Mono"/>
+                <w:color w:val="17261F"/>
+                <w:sz w:val="16"/>
+                <w:szCs w:val="16"/>
+              </w:rPr>
+              <w:t xml:space="preserve">    end</w:t>
+            </w:r>
+          </w:p>
+          <w:p>
+            <w:pPr>
+              <w:spacing w:before="0" w:after="0" w:line="252" w:lineRule="auto"/>
+            </w:pPr>
+            <w:r>
+              <w:rPr>
+                <w:rFonts w:ascii="JetBrains Mono" w:hAnsi="JetBrains Mono" w:eastAsia="JetBrains Mono" w:cs="JetBrains Mono"/>
+                <w:color w:val="17261F"/>
+                <w:sz w:val="16"/>
+                <w:szCs w:val="16"/>
+              </w:rPr>
+              <w:t xml:space="preserve">    knowledge["knowledge/profiles&lt;br/&gt;seis especies · tolerancias"]</w:t>
+            </w:r>
+          </w:p>
+          <w:p>
+            <w:pPr>
+              <w:spacing w:before="0" w:after="0" w:line="252" w:lineRule="auto"/>
+            </w:pPr>
+            <w:r>
+              <w:rPr>
+                <w:rFonts w:ascii="JetBrains Mono" w:hAnsi="JetBrains Mono" w:eastAsia="JetBrains Mono" w:cs="JetBrains Mono"/>
+                <w:color w:val="17261F"/>
+                <w:sz w:val="16"/>
+                <w:szCs w:val="16"/>
+              </w:rPr>
+              <w:t xml:space="preserve">    subgraph engine["engine"]</w:t>
+            </w:r>
+          </w:p>
+          <w:p>
+            <w:pPr>
+              <w:spacing w:before="0" w:after="0" w:line="252" w:lineRule="auto"/>
+            </w:pPr>
+            <w:r>
+              <w:rPr>
+                <w:rFonts w:ascii="JetBrains Mono" w:hAnsi="JetBrains Mono" w:eastAsia="JetBrains Mono" w:cs="JetBrains Mono"/>
+                <w:color w:val="17261F"/>
+                <w:sz w:val="16"/>
+                <w:szCs w:val="16"/>
+              </w:rPr>
+              <w:t xml:space="preserve">      direction TB</w:t>
+            </w:r>
+          </w:p>
+          <w:p>
+            <w:pPr>
+              <w:spacing w:before="0" w:after="0" w:line="252" w:lineRule="auto"/>
+            </w:pPr>
+            <w:r>
+              <w:rPr>
+                <w:rFonts w:ascii="JetBrains Mono" w:hAnsi="JetBrains Mono" w:eastAsia="JetBrains Mono" w:cs="JetBrains Mono"/>
+                <w:color w:val="17261F"/>
+                <w:sz w:val="16"/>
+                <w:szCs w:val="16"/>
+              </w:rPr>
+              <w:t xml:space="preserve">      diag["diagnosis"]</w:t>
+            </w:r>
+          </w:p>
+          <w:p>
+            <w:pPr>
+              <w:spacing w:before="0" w:after="0" w:line="252" w:lineRule="auto"/>
+            </w:pPr>
+            <w:r>
+              <w:rPr>
+                <w:rFonts w:ascii="JetBrains Mono" w:hAnsi="JetBrains Mono" w:eastAsia="JetBrains Mono" w:cs="JetBrains Mono"/>
+                <w:color w:val="17261F"/>
+                <w:sz w:val="16"/>
+                <w:szCs w:val="16"/>
+              </w:rPr>
+              <w:t xml:space="preserve">      fc["forecast · Theil-Sen"]</w:t>
+            </w:r>
+          </w:p>
+          <w:p>
+            <w:pPr>
+              <w:spacing w:before="0" w:after="0" w:line="252" w:lineRule="auto"/>
+            </w:pPr>
+            <w:r>
+              <w:rPr>
+                <w:rFonts w:ascii="JetBrains Mono" w:hAnsi="JetBrains Mono" w:eastAsia="JetBrains Mono" w:cs="JetBrains Mono"/>
+                <w:color w:val="17261F"/>
+                <w:sz w:val="16"/>
+                <w:szCs w:val="16"/>
+              </w:rPr>
+              <w:t xml:space="preserve">      models["models · base sintética"]</w:t>
+            </w:r>
+          </w:p>
+          <w:p>
+            <w:pPr>
+              <w:spacing w:before="0" w:after="0" w:line="252" w:lineRule="auto"/>
+            </w:pPr>
+            <w:r>
+              <w:rPr>
+                <w:rFonts w:ascii="JetBrains Mono" w:hAnsi="JetBrains Mono" w:eastAsia="JetBrains Mono" w:cs="JetBrains Mono"/>
+                <w:color w:val="17261F"/>
+                <w:sz w:val="16"/>
+                <w:szCs w:val="16"/>
+              </w:rPr>
+              <w:t xml:space="preserve">      expert["expert_system · rules"]</w:t>
+            </w:r>
+          </w:p>
+          <w:p>
+            <w:pPr>
+              <w:spacing w:before="0" w:after="0" w:line="252" w:lineRule="auto"/>
+            </w:pPr>
+            <w:r>
+              <w:rPr>
+                <w:rFonts w:ascii="JetBrains Mono" w:hAnsi="JetBrains Mono" w:eastAsia="JetBrains Mono" w:cs="JetBrains Mono"/>
+                <w:color w:val="17261F"/>
+                <w:sz w:val="16"/>
+                <w:szCs w:val="16"/>
+              </w:rPr>
+              <w:t xml:space="preserve">      fuzzy["fuzzy · Sugeno"]</w:t>
+            </w:r>
+          </w:p>
+          <w:p>
+            <w:pPr>
+              <w:spacing w:before="0" w:after="0" w:line="252" w:lineRule="auto"/>
+            </w:pPr>
+            <w:r>
+              <w:rPr>
+                <w:rFonts w:ascii="JetBrains Mono" w:hAnsi="JetBrains Mono" w:eastAsia="JetBrains Mono" w:cs="JetBrains Mono"/>
+                <w:color w:val="17261F"/>
+                <w:sz w:val="16"/>
+                <w:szCs w:val="16"/>
+              </w:rPr>
+              <w:t xml:space="preserve">      agent["agent"]</w:t>
+            </w:r>
+          </w:p>
+          <w:p>
+            <w:pPr>
+              <w:spacing w:before="0" w:after="0" w:line="252" w:lineRule="auto"/>
+            </w:pPr>
+            <w:r>
+              <w:rPr>
+                <w:rFonts w:ascii="JetBrains Mono" w:hAnsi="JetBrains Mono" w:eastAsia="JetBrains Mono" w:cs="JetBrains Mono"/>
+                <w:color w:val="17261F"/>
+                <w:sz w:val="16"/>
+                <w:szCs w:val="16"/>
+              </w:rPr>
+              <w:t xml:space="preserve">      fleet["fleet · K-Means"]</w:t>
+            </w:r>
+          </w:p>
+          <w:p>
+            <w:pPr>
+              <w:spacing w:before="0" w:after="0" w:line="252" w:lineRule="auto"/>
+            </w:pPr>
+            <w:r>
+              <w:rPr>
+                <w:rFonts w:ascii="JetBrains Mono" w:hAnsi="JetBrains Mono" w:eastAsia="JetBrains Mono" w:cs="JetBrains Mono"/>
+                <w:color w:val="17261F"/>
+                <w:sz w:val="16"/>
+                <w:szCs w:val="16"/>
+              </w:rPr>
+              <w:t xml:space="preserve">    end</w:t>
+            </w:r>
+          </w:p>
+          <w:p>
+            <w:pPr>
+              <w:spacing w:before="0" w:after="0" w:line="252" w:lineRule="auto"/>
+            </w:pPr>
+            <w:r>
+              <w:rPr>
+                <w:rFonts w:ascii="JetBrains Mono" w:hAnsi="JetBrains Mono" w:eastAsia="JetBrains Mono" w:cs="JetBrains Mono"/>
+                <w:color w:val="17261F"/>
+                <w:sz w:val="16"/>
+                <w:szCs w:val="16"/>
+              </w:rPr>
+              <w:t xml:space="preserve">    subgraph learning["learning"]</w:t>
+            </w:r>
+          </w:p>
+          <w:p>
+            <w:pPr>
+              <w:spacing w:before="0" w:after="0" w:line="252" w:lineRule="auto"/>
+            </w:pPr>
+            <w:r>
+              <w:rPr>
+                <w:rFonts w:ascii="JetBrains Mono" w:hAnsi="JetBrains Mono" w:eastAsia="JetBrains Mono" w:cs="JetBrains Mono"/>
+                <w:color w:val="17261F"/>
+                <w:sz w:val="16"/>
+                <w:szCs w:val="16"/>
+              </w:rPr>
+              <w:t xml:space="preserve">      direction TB</w:t>
+            </w:r>
+          </w:p>
+          <w:p>
+            <w:pPr>
+              <w:spacing w:before="0" w:after="0" w:line="252" w:lineRule="auto"/>
+            </w:pPr>
+            <w:r>
+              <w:rPr>
+                <w:rFonts w:ascii="JetBrains Mono" w:hAnsi="JetBrains Mono" w:eastAsia="JetBrains Mono" w:cs="JetBrains Mono"/>
+                <w:color w:val="17261F"/>
+                <w:sz w:val="16"/>
+                <w:szCs w:val="16"/>
+              </w:rPr>
+              <w:t xml:space="preserve">      store["store · SQLite"]</w:t>
+            </w:r>
+          </w:p>
+          <w:p>
+            <w:pPr>
+              <w:spacing w:before="0" w:after="0" w:line="252" w:lineRule="auto"/>
+            </w:pPr>
+            <w:r>
+              <w:rPr>
+                <w:rFonts w:ascii="JetBrains Mono" w:hAnsi="JetBrains Mono" w:eastAsia="JetBrains Mono" w:cs="JetBrains Mono"/>
+                <w:color w:val="17261F"/>
+                <w:sz w:val="16"/>
+                <w:szCs w:val="16"/>
+              </w:rPr>
+              <w:t xml:space="preserve">      quality["quality · IQR"]</w:t>
+            </w:r>
+          </w:p>
+          <w:p>
+            <w:pPr>
+              <w:spacing w:before="0" w:after="0" w:line="252" w:lineRule="auto"/>
+            </w:pPr>
+            <w:r>
+              <w:rPr>
+                <w:rFonts w:ascii="JetBrains Mono" w:hAnsi="JetBrains Mono" w:eastAsia="JetBrains Mono" w:cs="JetBrains Mono"/>
+                <w:color w:val="17261F"/>
+                <w:sz w:val="16"/>
+                <w:szCs w:val="16"/>
+              </w:rPr>
+              <w:t xml:space="preserve">      features["features · etiquetas"]</w:t>
+            </w:r>
+          </w:p>
+          <w:p>
+            <w:pPr>
+              <w:spacing w:before="0" w:after="0" w:line="252" w:lineRule="auto"/>
+            </w:pPr>
+            <w:r>
+              <w:rPr>
+                <w:rFonts w:ascii="JetBrains Mono" w:hAnsi="JetBrains Mono" w:eastAsia="JetBrains Mono" w:cs="JetBrains Mono"/>
+                <w:color w:val="17261F"/>
+                <w:sz w:val="16"/>
+                <w:szCs w:val="16"/>
+              </w:rPr>
+              <w:t xml:space="preserve">      trainer["trainer · proceso aparte"]</w:t>
+            </w:r>
+          </w:p>
+          <w:p>
+            <w:pPr>
+              <w:spacing w:before="0" w:after="0" w:line="252" w:lineRule="auto"/>
+            </w:pPr>
+            <w:r>
+              <w:rPr>
+                <w:rFonts w:ascii="JetBrains Mono" w:hAnsi="JetBrains Mono" w:eastAsia="JetBrains Mono" w:cs="JetBrains Mono"/>
+                <w:color w:val="17261F"/>
+                <w:sz w:val="16"/>
+                <w:szCs w:val="16"/>
+              </w:rPr>
+              <w:t xml:space="preserve">      lservice["service · predicciones"]</w:t>
+            </w:r>
+          </w:p>
+          <w:p>
+            <w:pPr>
+              <w:spacing w:before="0" w:after="0" w:line="252" w:lineRule="auto"/>
+            </w:pPr>
+            <w:r>
+              <w:rPr>
+                <w:rFonts w:ascii="JetBrains Mono" w:hAnsi="JetBrains Mono" w:eastAsia="JetBrains Mono" w:cs="JetBrains Mono"/>
+                <w:color w:val="17261F"/>
+                <w:sz w:val="16"/>
+                <w:szCs w:val="16"/>
+              </w:rPr>
+              <w:t xml:space="preserve">    end</w:t>
+            </w:r>
+          </w:p>
+          <w:p>
+            <w:pPr>
+              <w:spacing w:before="0" w:after="0" w:line="252" w:lineRule="auto"/>
+            </w:pPr>
+            <w:r>
+              <w:rPr>
+                <w:rFonts w:ascii="JetBrains Mono" w:hAnsi="JetBrains Mono" w:eastAsia="JetBrains Mono" w:cs="JetBrains Mono"/>
+                <w:color w:val="17261F"/>
+                <w:sz w:val="16"/>
+                <w:szCs w:val="16"/>
+              </w:rPr>
+              <w:t xml:space="preserve">  end</w:t>
+            </w:r>
+          </w:p>
+          <w:p>
+            <w:pPr>
+              <w:spacing w:before="0" w:after="0" w:line="252" w:lineRule="auto"/>
+            </w:pPr>
+            <w:r>
+              <w:rPr>
+                <w:rFonts w:ascii="JetBrains Mono" w:hAnsi="JetBrains Mono" w:eastAsia="JetBrains Mono" w:cs="JetBrains Mono"/>
+                <w:color w:val="17261F"/>
+                <w:sz w:val="16"/>
+                <w:szCs w:val="16"/>
+              </w:rPr>
+              <w:t xml:space="preserve">  data[("Volumen /data&lt;br/&gt;learning.db · models/*.joblib")]</w:t>
+            </w:r>
+          </w:p>
+          <w:p>
+            <w:pPr>
+              <w:spacing w:before="0" w:after="0" w:line="252" w:lineRule="auto"/>
+            </w:pPr>
+            <w:r>
+              <w:rPr>
+                <w:rFonts w:ascii="JetBrains Mono" w:hAnsi="JetBrains Mono" w:eastAsia="JetBrains Mono" w:cs="JetBrains Mono"/>
+                <w:color w:val="17261F"/>
+                <w:sz w:val="16"/>
+                <w:szCs w:val="16"/>
+              </w:rPr>
+              <w:t xml:space="preserve">  api --&gt; core --&gt; routers</w:t>
+            </w:r>
+          </w:p>
+          <w:p>
+            <w:pPr>
+              <w:spacing w:before="0" w:after="0" w:line="252" w:lineRule="auto"/>
+            </w:pPr>
+            <w:r>
+              <w:rPr>
+                <w:rFonts w:ascii="JetBrains Mono" w:hAnsi="JetBrains Mono" w:eastAsia="JetBrains Mono" w:cs="JetBrains Mono"/>
+                <w:color w:val="17261F"/>
+                <w:sz w:val="16"/>
+                <w:szCs w:val="16"/>
+              </w:rPr>
+              <w:t xml:space="preserve">  insights --&gt; diag --&gt; fc --&gt; models --&gt; expert --&gt; fuzzy --&gt; agent</w:t>
+            </w:r>
+          </w:p>
+          <w:p>
+            <w:pPr>
+              <w:spacing w:before="0" w:after="0" w:line="252" w:lineRule="auto"/>
+            </w:pPr>
+            <w:r>
+              <w:rPr>
+                <w:rFonts w:ascii="JetBrains Mono" w:hAnsi="JetBrains Mono" w:eastAsia="JetBrains Mono" w:cs="JetBrains Mono"/>
+                <w:color w:val="17261F"/>
+                <w:sz w:val="16"/>
+                <w:szCs w:val="16"/>
+              </w:rPr>
+              <w:t xml:space="preserve">  insights --&gt; fleet</w:t>
+            </w:r>
+          </w:p>
+          <w:p>
+            <w:pPr>
+              <w:spacing w:before="0" w:after="0" w:line="252" w:lineRule="auto"/>
+            </w:pPr>
+            <w:r>
+              <w:rPr>
+                <w:rFonts w:ascii="JetBrains Mono" w:hAnsi="JetBrains Mono" w:eastAsia="JetBrains Mono" w:cs="JetBrains Mono"/>
+                <w:color w:val="17261F"/>
+                <w:sz w:val="16"/>
+                <w:szCs w:val="16"/>
+              </w:rPr>
+              <w:t xml:space="preserve">  knowledge --&gt; diag &amp; fuzzy &amp; agent</w:t>
+            </w:r>
+          </w:p>
+          <w:p>
+            <w:pPr>
+              <w:spacing w:before="0" w:after="0" w:line="252" w:lineRule="auto"/>
+            </w:pPr>
+            <w:r>
+              <w:rPr>
+                <w:rFonts w:ascii="JetBrains Mono" w:hAnsi="JetBrains Mono" w:eastAsia="JetBrains Mono" w:cs="JetBrains Mono"/>
+                <w:color w:val="17261F"/>
+                <w:sz w:val="16"/>
+                <w:szCs w:val="16"/>
+              </w:rPr>
+              <w:t xml:space="preserve">  learnr --&gt; store --&gt; quality --&gt; features --&gt; trainer --&gt; lservice</w:t>
+            </w:r>
+          </w:p>
+          <w:p>
+            <w:pPr>
+              <w:spacing w:before="0" w:after="0" w:line="252" w:lineRule="auto"/>
+            </w:pPr>
+            <w:r>
+              <w:rPr>
+                <w:rFonts w:ascii="JetBrains Mono" w:hAnsi="JetBrains Mono" w:eastAsia="JetBrains Mono" w:cs="JetBrains Mono"/>
+                <w:color w:val="17261F"/>
+                <w:sz w:val="16"/>
+                <w:szCs w:val="16"/>
+              </w:rPr>
+              <w:t xml:space="preserve">  lservice --&gt; expert &amp; agent</w:t>
+            </w:r>
+          </w:p>
+          <w:p>
+            <w:pPr>
+              <w:spacing w:before="0" w:after="0" w:line="252" w:lineRule="auto"/>
+            </w:pPr>
+            <w:r>
+              <w:rPr>
+                <w:rFonts w:ascii="JetBrains Mono" w:hAnsi="JetBrains Mono" w:eastAsia="JetBrains Mono" w:cs="JetBrains Mono"/>
+                <w:color w:val="17261F"/>
+                <w:sz w:val="16"/>
+                <w:szCs w:val="16"/>
+              </w:rPr>
+              <w:t xml:space="preserve">  store &amp; trainer --&gt; data</w:t>
+            </w:r>
+          </w:p>
+          <w:p>
+            <w:pPr>
+              <w:spacing w:before="0" w:after="0" w:line="252" w:lineRule="auto"/>
+            </w:pPr>
+            <w:r>
+              <w:rPr>
+                <w:rFonts w:ascii="JetBrains Mono" w:hAnsi="JetBrains Mono" w:eastAsia="JetBrains Mono" w:cs="JetBrains Mono"/>
+                <w:color w:val="17261F"/>
+                <w:sz w:val="16"/>
+                <w:szCs w:val="16"/>
+              </w:rPr>
+              <w:t xml:space="preserve">  classDef leaf fill:#DDF5EA,stroke:#067A52,color:#17261F</w:t>
+            </w:r>
+          </w:p>
+          <w:p>
+            <w:pPr>
+              <w:spacing w:before="0" w:after="0" w:line="252" w:lineRule="auto"/>
+            </w:pPr>
+            <w:r>
+              <w:rPr>
+                <w:rFonts w:ascii="JetBrains Mono" w:hAnsi="JetBrains Mono" w:eastAsia="JetBrains Mono" w:cs="JetBrains Mono"/>
+                <w:color w:val="17261F"/>
+                <w:sz w:val="16"/>
+                <w:szCs w:val="16"/>
+              </w:rPr>
+              <w:t xml:space="preserve">  classDef water fill:#E3F2FB,stroke:#1F6FA0,color:#17261F</w:t>
+            </w:r>
+          </w:p>
+          <w:p>
+            <w:pPr>
+              <w:spacing w:before="0" w:after="0" w:line="252" w:lineRule="auto"/>
+            </w:pPr>
+            <w:r>
+              <w:rPr>
+                <w:rFonts w:ascii="JetBrains Mono" w:hAnsi="JetBrains Mono" w:eastAsia="JetBrains Mono" w:cs="JetBrains Mono"/>
+                <w:color w:val="17261F"/>
+                <w:sz w:val="16"/>
+                <w:szCs w:val="16"/>
+              </w:rPr>
+              <w:t xml:space="preserve">  classDef sun fill:#FDF4DD,stroke:#C98D12,color:#17261F</w:t>
+            </w:r>
+          </w:p>
+          <w:p>
+            <w:pPr>
+              <w:spacing w:before="0" w:after="0" w:line="252" w:lineRule="auto"/>
+            </w:pPr>
+            <w:r>
+              <w:rPr>
+                <w:rFonts w:ascii="JetBrains Mono" w:hAnsi="JetBrains Mono" w:eastAsia="JetBrains Mono" w:cs="JetBrains Mono"/>
+                <w:color w:val="17261F"/>
+                <w:sz w:val="16"/>
+                <w:szCs w:val="16"/>
+              </w:rPr>
+              <w:t xml:space="preserve">  classDef clay fill:#FBE9E1,stroke:#B85A38,color:#17261F</w:t>
+            </w:r>
+          </w:p>
+          <w:p>
+            <w:pPr>
+              <w:spacing w:before="0" w:after="0" w:line="252" w:lineRule="auto"/>
+            </w:pPr>
+            <w:r>
+              <w:rPr>
+                <w:rFonts w:ascii="JetBrains Mono" w:hAnsi="JetBrains Mono" w:eastAsia="JetBrains Mono" w:cs="JetBrains Mono"/>
+                <w:color w:val="17261F"/>
+                <w:sz w:val="16"/>
+                <w:szCs w:val="16"/>
+              </w:rPr>
+              <w:t xml:space="preserve">  classDef core fill:#067A52,stroke:#0B3D2B,color:#FFFFFF</w:t>
+            </w:r>
+          </w:p>
+          <w:p>
+            <w:pPr>
+              <w:spacing w:before="0" w:after="0" w:line="252" w:lineRule="auto"/>
+            </w:pPr>
+            <w:r>
+              <w:rPr>
+                <w:rFonts w:ascii="JetBrains Mono" w:hAnsi="JetBrains Mono" w:eastAsia="JetBrains Mono" w:cs="JetBrains Mono"/>
+                <w:color w:val="17261F"/>
+                <w:sz w:val="16"/>
+                <w:szCs w:val="16"/>
+              </w:rPr>
+              <w:t xml:space="preserve">  classDef deep fill:#0B3D2B,stroke:#06281C,color:#FFFFFF</w:t>
+            </w:r>
+          </w:p>
+          <w:p>
+            <w:pPr>
+              <w:spacing w:before="0" w:after="0" w:line="252" w:lineRule="auto"/>
+            </w:pPr>
+            <w:r>
+              <w:rPr>
+                <w:rFonts w:ascii="JetBrains Mono" w:hAnsi="JetBrains Mono" w:eastAsia="JetBrains Mono" w:cs="JetBrains Mono"/>
+                <w:color w:val="17261F"/>
+                <w:sz w:val="16"/>
+                <w:szCs w:val="16"/>
+              </w:rPr>
+              <w:t xml:space="preserve">  classDef muted fill:#F2F7F4,stroke:#5B6B63,color:#17261F</w:t>
+            </w:r>
+          </w:p>
+          <w:p>
+            <w:pPr>
+              <w:spacing w:before="0" w:after="0" w:line="252" w:lineRule="auto"/>
+            </w:pPr>
+            <w:r>
+              <w:rPr>
+                <w:rFonts w:ascii="JetBrains Mono" w:hAnsi="JetBrains Mono" w:eastAsia="JetBrains Mono" w:cs="JetBrains Mono"/>
+                <w:color w:val="17261F"/>
+                <w:sz w:val="16"/>
+                <w:szCs w:val="16"/>
+              </w:rPr>
+              <w:t xml:space="preserve">  class api water</w:t>
+            </w:r>
+          </w:p>
+          <w:p>
+            <w:pPr>
+              <w:spacing w:before="0" w:after="0" w:line="252" w:lineRule="auto"/>
+            </w:pPr>
+            <w:r>
+              <w:rPr>
+                <w:rFonts w:ascii="JetBrains Mono" w:hAnsi="JetBrains Mono" w:eastAsia="JetBrains Mono" w:cs="JetBrains Mono"/>
+                <w:color w:val="17261F"/>
+                <w:sz w:val="16"/>
+                <w:szCs w:val="16"/>
+              </w:rPr>
+              <w:t xml:space="preserve">  class core,health,insights,learnr sun</w:t>
+            </w:r>
+          </w:p>
+          <w:p>
+            <w:pPr>
+              <w:spacing w:before="0" w:after="0" w:line="252" w:lineRule="auto"/>
+            </w:pPr>
+            <w:r>
+              <w:rPr>
+                <w:rFonts w:ascii="JetBrains Mono" w:hAnsi="JetBrains Mono" w:eastAsia="JetBrains Mono" w:cs="JetBrains Mono"/>
+                <w:color w:val="17261F"/>
+                <w:sz w:val="16"/>
+                <w:szCs w:val="16"/>
+              </w:rPr>
+              <w:t xml:space="preserve">  class knowledge muted</w:t>
+            </w:r>
+          </w:p>
+          <w:p>
+            <w:pPr>
+              <w:spacing w:before="0" w:after="0" w:line="252" w:lineRule="auto"/>
+            </w:pPr>
+            <w:r>
+              <w:rPr>
+                <w:rFonts w:ascii="JetBrains Mono" w:hAnsi="JetBrains Mono" w:eastAsia="JetBrains Mono" w:cs="JetBrains Mono"/>
+                <w:color w:val="17261F"/>
+                <w:sz w:val="16"/>
+                <w:szCs w:val="16"/>
+              </w:rPr>
+              <w:t xml:space="preserve">  class diag,fc,models,expert,fuzzy,agent,fleet leaf</w:t>
+            </w:r>
+          </w:p>
+          <w:p>
+            <w:pPr>
+              <w:spacing w:before="0" w:after="0" w:line="252" w:lineRule="auto"/>
+            </w:pPr>
+            <w:r>
+              <w:rPr>
+                <w:rFonts w:ascii="JetBrains Mono" w:hAnsi="JetBrains Mono" w:eastAsia="JetBrains Mono" w:cs="JetBrains Mono"/>
+                <w:color w:val="17261F"/>
+                <w:sz w:val="16"/>
+                <w:szCs w:val="16"/>
+              </w:rPr>
+              <w:t xml:space="preserve">  class store,quality,features,trainer,lservice core</w:t>
+            </w:r>
+          </w:p>
+          <w:p>
+            <w:pPr>
+              <w:spacing w:before="0" w:after="0" w:line="252" w:lineRule="auto"/>
+            </w:pPr>
+            <w:r>
+              <w:rPr>
+                <w:rFonts w:ascii="JetBrains Mono" w:hAnsi="JetBrains Mono" w:eastAsia="JetBrains Mono" w:cs="JetBrains Mono"/>
+                <w:color w:val="17261F"/>
+                <w:sz w:val="16"/>
+                <w:szCs w:val="16"/>
+              </w:rPr>
+              <w:t xml:space="preserve">  class data muted</w:t>
+            </w:r>
+          </w:p>
+        </w:tc>
+      </w:tr>
+    </w:tbl>
+    <w:p>
+      <w:pPr>
+        <w:spacing w:before="160" w:after="0" w:line="240" w:lineRule="auto"/>
+        <w:rPr>
+          <w:sz w:val="8"/>
+        </w:rPr>
+      </w:pPr>
+    </w:p>
+    <w:p>
+      <w:pPr>
+        <w:pageBreakBefore/>
+        <w:spacing w:before="0" w:after="0" w:line="20" w:lineRule="exact"/>
+        <w:rPr>
+          <w:sz w:val="2"/>
+        </w:rPr>
+      </w:pPr>
+    </w:p>
+    <w:tbl>
+      <w:tblPr>
+        <w:tblW w:w="9360" w:type="dxa"/>
+        <w:tblInd w:w="0" w:type="dxa"/>
+        <w:tblBorders>
+          <w:top w:val="nil"/>
+          <w:left w:val="nil"/>
+          <w:bottom w:val="nil"/>
+          <w:right w:val="nil"/>
+          <w:insideH w:val="nil"/>
+          <w:insideV w:val="nil"/>
+        </w:tblBorders>
+        <w:tblLayout w:type="fixed"/>
+        <w:tblCellMar>
+          <w:left w:w="0" w:type="dxa"/>
+          <w:right w:w="0" w:type="dxa"/>
+        </w:tblCellMar>
+        <w:tblLook w:val="0000" w:firstRow="0" w:lastRow="0" w:firstColumn="0" w:lastColumn="0" w:noHBand="1" w:noVBand="1"/>
+      </w:tblPr>
+      <w:tblGrid>
+        <w:gridCol w:w="9360"/>
+      </w:tblGrid>
+      <w:tr>
+        <w:trPr>
+          <w:cantSplit/>
+        </w:trPr>
+        <w:tc>
+          <w:tcPr>
+            <w:tcW w:w="9360" w:type="dxa"/>
+            <w:shd w:val="clear" w:color="auto" w:fill="0B3D2B"/>
+            <w:tcMar>
               <w:top w:w="420" w:type="dxa"/>
               <w:left w:w="480" w:type="dxa"/>
               <w:bottom w:w="420" w:type="dxa"/>
@@ -2147,7 +3062,7 @@
       <w:r>
         <w:drawing>
           <wp:inline distT="0" distB="0" distL="0" distR="0">
-            <wp:extent cx="1463767" cy="7112000"/>
+            <wp:extent cx="1279603" cy="7112000"/>
             <wp:docPr id="109" name="SmartPot_AI_01_Insight_Pipeline"/>
             <wp:cNvGraphicFramePr>
               <a:graphicFrameLocks noChangeAspect="1"/>
@@ -2168,7 +3083,7 @@
                   <pic:spPr>
                     <a:xfrm>
                       <a:off x="0" y="0"/>
-                      <a:ext cx="1463767" cy="7112000"/>
+                      <a:ext cx="1279603" cy="7112000"/>
                     </a:xfrm>
                     <a:prstGeom prst="rect">
                       <a:avLst/>
@@ -2206,6 +3121,400 @@
         </w:rPr>
         <w:t xml:space="preserve">  ·  De la lectura a la respuesta</w:t>
       </w:r>
+    </w:p>
+    <w:p>
+      <w:pPr>
+        <w:spacing w:before="80" w:after="0" w:line="240" w:lineRule="auto"/>
+        <w:rPr>
+          <w:sz w:val="8"/>
+        </w:rPr>
+      </w:pPr>
+    </w:p>
+    <w:tbl>
+      <w:tblPr>
+        <w:tblW w:w="9360" w:type="dxa"/>
+        <w:tblInd w:w="0" w:type="dxa"/>
+        <w:tblBorders>
+          <w:top w:val="nil"/>
+          <w:left w:val="nil"/>
+          <w:bottom w:val="nil"/>
+          <w:right w:val="nil"/>
+          <w:insideH w:val="nil"/>
+          <w:insideV w:val="nil"/>
+        </w:tblBorders>
+        <w:tblLayout w:type="fixed"/>
+        <w:tblCellMar>
+          <w:left w:w="0" w:type="dxa"/>
+          <w:right w:w="0" w:type="dxa"/>
+        </w:tblCellMar>
+        <w:tblLook w:val="0000" w:firstRow="0" w:lastRow="0" w:firstColumn="0" w:lastColumn="0" w:noHBand="1" w:noVBand="1"/>
+      </w:tblPr>
+      <w:tblGrid>
+        <w:gridCol w:w="9360"/>
+      </w:tblGrid>
+      <w:tr>
+        <w:trPr>
+          <w:cantSplit/>
+        </w:trPr>
+        <w:tc>
+          <w:tcPr>
+            <w:tcW w:w="9360" w:type="dxa"/>
+            <w:shd w:val="clear" w:color="auto" w:fill="0B3D2B"/>
+            <w:tcMar>
+              <w:top w:w="60" w:type="dxa"/>
+              <w:left w:w="200" w:type="dxa"/>
+              <w:bottom w:w="60" w:type="dxa"/>
+              <w:right w:w="200" w:type="dxa"/>
+            </w:tcMar>
+            <w:vAlign w:val="top"/>
+          </w:tcPr>
+          <w:p>
+            <w:pPr>
+              <w:spacing w:before="0" w:after="0" w:line="240" w:lineRule="auto"/>
+            </w:pPr>
+            <w:r>
+              <w:rPr>
+                <w:b/>
+                <w:bCs/>
+                <w:color w:val="7FDBB0"/>
+                <w:spacing w:val="40"/>
+                <w:sz w:val="14"/>
+                <w:szCs w:val="14"/>
+              </w:rPr>
+              <w:t xml:space="preserve">MERMAID</w:t>
+            </w:r>
+          </w:p>
+        </w:tc>
+      </w:tr>
+    </w:tbl>
+    <w:tbl>
+      <w:tblPr>
+        <w:tblW w:w="9360" w:type="dxa"/>
+        <w:tblInd w:w="0" w:type="dxa"/>
+        <w:tblBorders>
+          <w:top w:val="nil"/>
+          <w:left w:val="nil"/>
+          <w:bottom w:val="nil"/>
+          <w:right w:val="nil"/>
+          <w:insideH w:val="nil"/>
+          <w:insideV w:val="nil"/>
+        </w:tblBorders>
+        <w:tblLayout w:type="fixed"/>
+        <w:tblCellMar>
+          <w:left w:w="0" w:type="dxa"/>
+          <w:right w:w="0" w:type="dxa"/>
+        </w:tblCellMar>
+        <w:tblLook w:val="0000" w:firstRow="0" w:lastRow="0" w:firstColumn="0" w:lastColumn="0" w:noHBand="1" w:noVBand="1"/>
+      </w:tblPr>
+      <w:tblGrid>
+        <w:gridCol w:w="9360"/>
+      </w:tblGrid>
+      <w:tr>
+        <w:trPr>
+          <w:cantSplit/>
+        </w:trPr>
+        <w:tc>
+          <w:tcPr>
+            <w:tcW w:w="9360" w:type="dxa"/>
+            <w:shd w:val="clear" w:color="auto" w:fill="F7FAF8"/>
+            <w:tcMar>
+              <w:top w:w="120" w:type="dxa"/>
+              <w:left w:w="200" w:type="dxa"/>
+              <w:bottom w:w="120" w:type="dxa"/>
+              <w:right w:w="200" w:type="dxa"/>
+            </w:tcMar>
+            <w:vAlign w:val="top"/>
+          </w:tcPr>
+          <w:p>
+            <w:pPr>
+              <w:spacing w:before="0" w:after="0" w:line="252" w:lineRule="auto"/>
+            </w:pPr>
+            <w:r>
+              <w:rPr>
+                <w:rFonts w:ascii="JetBrains Mono" w:hAnsi="JetBrains Mono" w:eastAsia="JetBrains Mono" w:cs="JetBrains Mono"/>
+                <w:color w:val="17261F"/>
+                <w:sz w:val="16"/>
+                <w:szCs w:val="16"/>
+              </w:rPr>
+              <w:t xml:space="preserve">%%{init: {"theme": "base", "fontFamily": "Segoe UI, Arial, sans-serif", "themeVariables": {"fontFamily": "Segoe UI, Arial, sans-serif", "fontSize": "15px", "primaryColor": "#DDF5EA", "primaryTextColor": "#17261F", "primaryBorderColor": "#067A52", "secondaryColor": "#E3F2FB", "secondaryTextColor": "#17261F", "secondaryBorderColor": "#1F6FA0", "tertiaryColor": "#F2F7F4", "tertiaryTextColor": "#17261F", "tertiaryBorderColor": "#D5E3DC", "lineColor": "#5B6B63", "textColor": "#17261F", "mainBkg": "#DDF5EA", "nodeBorder": "#067A52", "clusterBkg": "#F7FAF8", "clusterBorder": "#D5E3DC", "edgeLabelBackground": "#FFFFFF", "actorBkg": "#067A52", "actorBorder": "#0B3D2B", "actorTextColor": "#FFFFFF", "actorLineColor": "#5B6B63", "signalColor": "#17261F", "signalTextColor": "#17261F", "labelBoxBkgColor": "#0B3D2B", "labelBoxBorderColor": "#0B3D2B", "labelTextColor": "#FFFFFF", "loopTextColor": "#0B3D2B", "noteBkgColor": "#FDF4DD", "noteBorderColor": "#C98D12", "noteTextColor": "#17261F", "activationBkgColor": "#DDF5EA", "activationBorderColor": "#067A52", "attributeBackgroundColorOdd": "#FFFFFF", "attributeBackgroundColorEven": "#F2F7F4"}}}%%</w:t>
+            </w:r>
+          </w:p>
+          <w:p>
+            <w:pPr>
+              <w:spacing w:before="0" w:after="0" w:line="252" w:lineRule="auto"/>
+            </w:pPr>
+            <w:r>
+              <w:rPr>
+                <w:rFonts w:ascii="JetBrains Mono" w:hAnsi="JetBrains Mono" w:eastAsia="JetBrains Mono" w:cs="JetBrains Mono"/>
+                <w:color w:val="17261F"/>
+                <w:sz w:val="16"/>
+                <w:szCs w:val="16"/>
+              </w:rPr>
+              <w:t xml:space="preserve">flowchart TB</w:t>
+            </w:r>
+          </w:p>
+          <w:p>
+            <w:pPr>
+              <w:spacing w:before="0" w:after="0" w:line="252" w:lineRule="auto"/>
+            </w:pPr>
+            <w:r>
+              <w:rPr>
+                <w:rFonts w:ascii="JetBrains Mono" w:hAnsi="JetBrains Mono" w:eastAsia="JetBrains Mono" w:cs="JetBrains Mono"/>
+                <w:color w:val="17261F"/>
+                <w:sz w:val="16"/>
+                <w:szCs w:val="16"/>
+              </w:rPr>
+              <w:t xml:space="preserve">  req(["POST /v1/insights&lt;br/&gt;especie · medidas · historial · actuadores · hora local&lt;br/&gt;lugar y clima de afuera"])</w:t>
+            </w:r>
+          </w:p>
+          <w:p>
+            <w:pPr>
+              <w:spacing w:before="0" w:after="0" w:line="252" w:lineRule="auto"/>
+            </w:pPr>
+            <w:r>
+              <w:rPr>
+                <w:rFonts w:ascii="JetBrains Mono" w:hAnsi="JetBrains Mono" w:eastAsia="JetBrains Mono" w:cs="JetBrains Mono"/>
+                <w:color w:val="17261F"/>
+                <w:sz w:val="16"/>
+                <w:szCs w:val="16"/>
+              </w:rPr>
+              <w:t xml:space="preserve">  req --&gt; diag["1 · Diagnóstico por variable&lt;br/&gt;LOW · OPTIMAL · HIGH · REST de noche&lt;br/&gt;severidad en tolerancias"]</w:t>
+            </w:r>
+          </w:p>
+          <w:p>
+            <w:pPr>
+              <w:spacing w:before="0" w:after="0" w:line="252" w:lineRule="auto"/>
+            </w:pPr>
+            <w:r>
+              <w:rPr>
+                <w:rFonts w:ascii="JetBrains Mono" w:hAnsi="JetBrains Mono" w:eastAsia="JetBrains Mono" w:cs="JetBrains Mono"/>
+                <w:color w:val="17261F"/>
+                <w:sz w:val="16"/>
+                <w:szCs w:val="16"/>
+              </w:rPr>
+              <w:t xml:space="preserve">  diag --&gt; fc["2 · Pronóstico Theil-Sen&lt;br/&gt;pendiente por hora · valor en 3 h&lt;br/&gt;horas hasta salir del rango"]</w:t>
+            </w:r>
+          </w:p>
+          <w:p>
+            <w:pPr>
+              <w:spacing w:before="0" w:after="0" w:line="252" w:lineRule="auto"/>
+            </w:pPr>
+            <w:r>
+              <w:rPr>
+                <w:rFonts w:ascii="JetBrains Mono" w:hAnsi="JetBrains Mono" w:eastAsia="JetBrains Mono" w:cs="JetBrains Mono"/>
+                <w:color w:val="17261F"/>
+                <w:sz w:val="16"/>
+                <w:szCs w:val="16"/>
+              </w:rPr>
+              <w:t xml:space="preserve">  fc --&gt; ml["3 · Modelos&lt;br/&gt;base sintéticos: logística, MLP, Isolation Forest&lt;br/&gt;aprendidos de cultivos reales si existen"]</w:t>
+            </w:r>
+          </w:p>
+          <w:p>
+            <w:pPr>
+              <w:spacing w:before="0" w:after="0" w:line="252" w:lineRule="auto"/>
+            </w:pPr>
+            <w:r>
+              <w:rPr>
+                <w:rFonts w:ascii="JetBrains Mono" w:hAnsi="JetBrains Mono" w:eastAsia="JetBrains Mono" w:cs="JetBrains Mono"/>
+                <w:color w:val="17261F"/>
+                <w:sz w:val="16"/>
+                <w:szCs w:val="16"/>
+              </w:rPr>
+              <w:t xml:space="preserve">  ml --&gt; es["4 · Sistema experto&lt;br/&gt;encadenamiento hacia adelante&lt;br/&gt;primer y segundo nivel · sensor_fault bloquea&lt;br/&gt;rain_outside y sensor_vs_outside"]</w:t>
+            </w:r>
+          </w:p>
+          <w:p>
+            <w:pPr>
+              <w:spacing w:before="0" w:after="0" w:line="252" w:lineRule="auto"/>
+            </w:pPr>
+            <w:r>
+              <w:rPr>
+                <w:rFonts w:ascii="JetBrains Mono" w:hAnsi="JetBrains Mono" w:eastAsia="JetBrains Mono" w:cs="JetBrains Mono"/>
+                <w:color w:val="17261F"/>
+                <w:sz w:val="16"/>
+                <w:szCs w:val="16"/>
+              </w:rPr>
+              <w:t xml:space="preserve">  es --&gt; fz["5 · Lógica difusa&lt;br/&gt;salud por variable · índice ponderado&lt;br/&gt;peor caso si algo es crítico"]</w:t>
+            </w:r>
+          </w:p>
+          <w:p>
+            <w:pPr>
+              <w:spacing w:before="0" w:after="0" w:line="252" w:lineRule="auto"/>
+            </w:pPr>
+            <w:r>
+              <w:rPr>
+                <w:rFonts w:ascii="JetBrains Mono" w:hAnsi="JetBrains Mono" w:eastAsia="JetBrains Mono" w:cs="JetBrains Mono"/>
+                <w:color w:val="17261F"/>
+                <w:sz w:val="16"/>
+                <w:szCs w:val="16"/>
+              </w:rPr>
+              <w:t xml:space="preserve">  fz --&gt; ag["6 · Agente reactivo&lt;br/&gt;solo actuadores del cultivo&lt;br/&gt;preventivo si el pronóstico o lo aprendido lo anticipa"]</w:t>
+            </w:r>
+          </w:p>
+          <w:p>
+            <w:pPr>
+              <w:spacing w:before="0" w:after="0" w:line="252" w:lineRule="auto"/>
+            </w:pPr>
+            <w:r>
+              <w:rPr>
+                <w:rFonts w:ascii="JetBrains Mono" w:hAnsi="JetBrains Mono" w:eastAsia="JetBrains Mono" w:cs="JetBrains Mono"/>
+                <w:color w:val="17261F"/>
+                <w:sz w:val="16"/>
+                <w:szCs w:val="16"/>
+              </w:rPr>
+              <w:t xml:space="preserve">  ag --&gt; place["7 · Consejo de lugar&lt;br/&gt;OK · UNKNOWN · TIP · MOVE"]</w:t>
+            </w:r>
+          </w:p>
+          <w:p>
+            <w:pPr>
+              <w:spacing w:before="0" w:after="0" w:line="252" w:lineRule="auto"/>
+            </w:pPr>
+            <w:r>
+              <w:rPr>
+                <w:rFonts w:ascii="JetBrains Mono" w:hAnsi="JetBrains Mono" w:eastAsia="JetBrains Mono" w:cs="JetBrains Mono"/>
+                <w:color w:val="17261F"/>
+                <w:sz w:val="16"/>
+                <w:szCs w:val="16"/>
+              </w:rPr>
+              <w:t xml:space="preserve">  place --&gt; out(["Respuesta&lt;br/&gt;health · diagnosis · conclusions · predictions&lt;br/&gt;forecasts · learning · placement · actions · summary"])</w:t>
+            </w:r>
+          </w:p>
+          <w:p>
+            <w:pPr>
+              <w:spacing w:before="0" w:after="0" w:line="252" w:lineRule="auto"/>
+            </w:pPr>
+            <w:r>
+              <w:rPr>
+                <w:rFonts w:ascii="JetBrains Mono" w:hAnsi="JetBrains Mono" w:eastAsia="JetBrains Mono" w:cs="JetBrains Mono"/>
+                <w:color w:val="17261F"/>
+                <w:sz w:val="16"/>
+                <w:szCs w:val="16"/>
+              </w:rPr>
+              <w:t xml:space="preserve">  classDef leaf fill:#DDF5EA,stroke:#067A52,color:#17261F</w:t>
+            </w:r>
+          </w:p>
+          <w:p>
+            <w:pPr>
+              <w:spacing w:before="0" w:after="0" w:line="252" w:lineRule="auto"/>
+            </w:pPr>
+            <w:r>
+              <w:rPr>
+                <w:rFonts w:ascii="JetBrains Mono" w:hAnsi="JetBrains Mono" w:eastAsia="JetBrains Mono" w:cs="JetBrains Mono"/>
+                <w:color w:val="17261F"/>
+                <w:sz w:val="16"/>
+                <w:szCs w:val="16"/>
+              </w:rPr>
+              <w:t xml:space="preserve">  classDef water fill:#E3F2FB,stroke:#1F6FA0,color:#17261F</w:t>
+            </w:r>
+          </w:p>
+          <w:p>
+            <w:pPr>
+              <w:spacing w:before="0" w:after="0" w:line="252" w:lineRule="auto"/>
+            </w:pPr>
+            <w:r>
+              <w:rPr>
+                <w:rFonts w:ascii="JetBrains Mono" w:hAnsi="JetBrains Mono" w:eastAsia="JetBrains Mono" w:cs="JetBrains Mono"/>
+                <w:color w:val="17261F"/>
+                <w:sz w:val="16"/>
+                <w:szCs w:val="16"/>
+              </w:rPr>
+              <w:t xml:space="preserve">  classDef sun fill:#FDF4DD,stroke:#C98D12,color:#17261F</w:t>
+            </w:r>
+          </w:p>
+          <w:p>
+            <w:pPr>
+              <w:spacing w:before="0" w:after="0" w:line="252" w:lineRule="auto"/>
+            </w:pPr>
+            <w:r>
+              <w:rPr>
+                <w:rFonts w:ascii="JetBrains Mono" w:hAnsi="JetBrains Mono" w:eastAsia="JetBrains Mono" w:cs="JetBrains Mono"/>
+                <w:color w:val="17261F"/>
+                <w:sz w:val="16"/>
+                <w:szCs w:val="16"/>
+              </w:rPr>
+              <w:t xml:space="preserve">  classDef clay fill:#FBE9E1,stroke:#B85A38,color:#17261F</w:t>
+            </w:r>
+          </w:p>
+          <w:p>
+            <w:pPr>
+              <w:spacing w:before="0" w:after="0" w:line="252" w:lineRule="auto"/>
+            </w:pPr>
+            <w:r>
+              <w:rPr>
+                <w:rFonts w:ascii="JetBrains Mono" w:hAnsi="JetBrains Mono" w:eastAsia="JetBrains Mono" w:cs="JetBrains Mono"/>
+                <w:color w:val="17261F"/>
+                <w:sz w:val="16"/>
+                <w:szCs w:val="16"/>
+              </w:rPr>
+              <w:t xml:space="preserve">  classDef core fill:#067A52,stroke:#0B3D2B,color:#FFFFFF</w:t>
+            </w:r>
+          </w:p>
+          <w:p>
+            <w:pPr>
+              <w:spacing w:before="0" w:after="0" w:line="252" w:lineRule="auto"/>
+            </w:pPr>
+            <w:r>
+              <w:rPr>
+                <w:rFonts w:ascii="JetBrains Mono" w:hAnsi="JetBrains Mono" w:eastAsia="JetBrains Mono" w:cs="JetBrains Mono"/>
+                <w:color w:val="17261F"/>
+                <w:sz w:val="16"/>
+                <w:szCs w:val="16"/>
+              </w:rPr>
+              <w:t xml:space="preserve">  classDef deep fill:#0B3D2B,stroke:#06281C,color:#FFFFFF</w:t>
+            </w:r>
+          </w:p>
+          <w:p>
+            <w:pPr>
+              <w:spacing w:before="0" w:after="0" w:line="252" w:lineRule="auto"/>
+            </w:pPr>
+            <w:r>
+              <w:rPr>
+                <w:rFonts w:ascii="JetBrains Mono" w:hAnsi="JetBrains Mono" w:eastAsia="JetBrains Mono" w:cs="JetBrains Mono"/>
+                <w:color w:val="17261F"/>
+                <w:sz w:val="16"/>
+                <w:szCs w:val="16"/>
+              </w:rPr>
+              <w:t xml:space="preserve">  classDef muted fill:#F2F7F4,stroke:#5B6B63,color:#17261F</w:t>
+            </w:r>
+          </w:p>
+          <w:p>
+            <w:pPr>
+              <w:spacing w:before="0" w:after="0" w:line="252" w:lineRule="auto"/>
+            </w:pPr>
+            <w:r>
+              <w:rPr>
+                <w:rFonts w:ascii="JetBrains Mono" w:hAnsi="JetBrains Mono" w:eastAsia="JetBrains Mono" w:cs="JetBrains Mono"/>
+                <w:color w:val="17261F"/>
+                <w:sz w:val="16"/>
+                <w:szCs w:val="16"/>
+              </w:rPr>
+              <w:t xml:space="preserve">  class req,out core</w:t>
+            </w:r>
+          </w:p>
+          <w:p>
+            <w:pPr>
+              <w:spacing w:before="0" w:after="0" w:line="252" w:lineRule="auto"/>
+            </w:pPr>
+            <w:r>
+              <w:rPr>
+                <w:rFonts w:ascii="JetBrains Mono" w:hAnsi="JetBrains Mono" w:eastAsia="JetBrains Mono" w:cs="JetBrains Mono"/>
+                <w:color w:val="17261F"/>
+                <w:sz w:val="16"/>
+                <w:szCs w:val="16"/>
+              </w:rPr>
+              <w:t xml:space="preserve">  class diag,fc,ml,es,fz,ag,place leaf</w:t>
+            </w:r>
+          </w:p>
+        </w:tc>
+      </w:tr>
+    </w:tbl>
+    <w:p>
+      <w:pPr>
+        <w:spacing w:before="160" w:after="0" w:line="240" w:lineRule="auto"/>
+        <w:rPr>
+          <w:sz w:val="8"/>
+        </w:rPr>
+      </w:pPr>
     </w:p>
     <w:p>
       <w:pPr>
@@ -2235,8 +3544,8 @@
         <w:tblLook w:val="04A0" w:firstRow="1" w:firstColumn="1" w:noVBand="1"/>
       </w:tblPr>
       <w:tblGrid>
-        <w:gridCol w:w="1901"/>
-        <w:gridCol w:w="7459"/>
+        <w:gridCol w:w="1895"/>
+        <w:gridCol w:w="7465"/>
       </w:tblGrid>
       <w:tr>
         <w:trPr>
@@ -2245,7 +3554,7 @@
         </w:trPr>
         <w:tc>
           <w:tcPr>
-            <w:tcW w:w="1901" w:type="dxa"/>
+            <w:tcW w:w="1895" w:type="dxa"/>
             <w:shd w:val="clear" w:color="auto" w:fill="0B3D2B"/>
             <w:tcMar>
               <w:top w:w="70" w:type="dxa"/>
@@ -2274,7 +3583,7 @@
         </w:tc>
         <w:tc>
           <w:tcPr>
-            <w:tcW w:w="7459" w:type="dxa"/>
+            <w:tcW w:w="7465" w:type="dxa"/>
             <w:shd w:val="clear" w:color="auto" w:fill="0B3D2B"/>
             <w:tcMar>
               <w:top w:w="70" w:type="dxa"/>
@@ -2308,7 +3617,7 @@
         </w:trPr>
         <w:tc>
           <w:tcPr>
-            <w:tcW w:w="1901" w:type="dxa"/>
+            <w:tcW w:w="1895" w:type="dxa"/>
             <w:shd w:val="clear" w:color="auto" w:fill="FFFFFF"/>
             <w:tcMar>
               <w:top w:w="70" w:type="dxa"/>
@@ -2336,7 +3645,7 @@
         </w:tc>
         <w:tc>
           <w:tcPr>
-            <w:tcW w:w="7459" w:type="dxa"/>
+            <w:tcW w:w="7465" w:type="dxa"/>
             <w:shd w:val="clear" w:color="auto" w:fill="FFFFFF"/>
             <w:tcMar>
               <w:top w:w="70" w:type="dxa"/>
@@ -2367,7 +3676,7 @@
         </w:trPr>
         <w:tc>
           <w:tcPr>
-            <w:tcW w:w="1901" w:type="dxa"/>
+            <w:tcW w:w="1895" w:type="dxa"/>
             <w:shd w:val="clear" w:color="auto" w:fill="F2F7F4"/>
             <w:tcMar>
               <w:top w:w="70" w:type="dxa"/>
@@ -2395,7 +3704,7 @@
         </w:tc>
         <w:tc>
           <w:tcPr>
-            <w:tcW w:w="7459" w:type="dxa"/>
+            <w:tcW w:w="7465" w:type="dxa"/>
             <w:shd w:val="clear" w:color="auto" w:fill="F2F7F4"/>
             <w:tcMar>
               <w:top w:w="70" w:type="dxa"/>
@@ -2443,7 +3752,7 @@
         </w:trPr>
         <w:tc>
           <w:tcPr>
-            <w:tcW w:w="1901" w:type="dxa"/>
+            <w:tcW w:w="1895" w:type="dxa"/>
             <w:shd w:val="clear" w:color="auto" w:fill="FFFFFF"/>
             <w:tcMar>
               <w:top w:w="70" w:type="dxa"/>
@@ -2471,7 +3780,7 @@
         </w:tc>
         <w:tc>
           <w:tcPr>
-            <w:tcW w:w="7459" w:type="dxa"/>
+            <w:tcW w:w="7465" w:type="dxa"/>
             <w:shd w:val="clear" w:color="auto" w:fill="FFFFFF"/>
             <w:tcMar>
               <w:top w:w="70" w:type="dxa"/>
@@ -2519,7 +3828,7 @@
         </w:trPr>
         <w:tc>
           <w:tcPr>
-            <w:tcW w:w="1901" w:type="dxa"/>
+            <w:tcW w:w="1895" w:type="dxa"/>
             <w:shd w:val="clear" w:color="auto" w:fill="F2F7F4"/>
             <w:tcMar>
               <w:top w:w="70" w:type="dxa"/>
@@ -2547,7 +3856,7 @@
         </w:tc>
         <w:tc>
           <w:tcPr>
-            <w:tcW w:w="7459" w:type="dxa"/>
+            <w:tcW w:w="7465" w:type="dxa"/>
             <w:shd w:val="clear" w:color="auto" w:fill="F2F7F4"/>
             <w:tcMar>
               <w:top w:w="70" w:type="dxa"/>
@@ -2595,7 +3904,7 @@
         </w:trPr>
         <w:tc>
           <w:tcPr>
-            <w:tcW w:w="1901" w:type="dxa"/>
+            <w:tcW w:w="1895" w:type="dxa"/>
             <w:shd w:val="clear" w:color="auto" w:fill="FFFFFF"/>
             <w:tcMar>
               <w:top w:w="70" w:type="dxa"/>
@@ -2623,7 +3932,7 @@
         </w:tc>
         <w:tc>
           <w:tcPr>
-            <w:tcW w:w="7459" w:type="dxa"/>
+            <w:tcW w:w="7465" w:type="dxa"/>
             <w:shd w:val="clear" w:color="auto" w:fill="FFFFFF"/>
             <w:tcMar>
               <w:top w:w="70" w:type="dxa"/>
@@ -2643,7 +3952,202 @@
                 <w:sz w:val="17"/>
                 <w:szCs w:val="17"/>
               </w:rPr>
-              <w:t xml:space="preserve">Riego, luz de día (y apagarla de noche), ventilación, humidificador y dosificadores, solo si el cultivo tiene el actuador; la API aplica el enfriamiento y el modo automático</w:t>
+              <w:t xml:space="preserve">Riego (no con lluvia sobre un cultivo al aire libre), luz ultravioleta de día (y apagarla de noche), ventilación, humidificador y dosificadores, solo si el cultivo tiene el actuador; la API aplica el enfriamiento y el modo automático</w:t>
+            </w:r>
+          </w:p>
+        </w:tc>
+      </w:tr>
+      <w:tr>
+        <w:trPr>
+          <w:cantSplit/>
+        </w:trPr>
+        <w:tc>
+          <w:tcPr>
+            <w:tcW w:w="1895" w:type="dxa"/>
+            <w:shd w:val="clear" w:color="auto" w:fill="F2F7F4"/>
+            <w:tcMar>
+              <w:top w:w="70" w:type="dxa"/>
+              <w:left w:w="110" w:type="dxa"/>
+              <w:bottom w:w="70" w:type="dxa"/>
+              <w:right w:w="110" w:type="dxa"/>
+            </w:tcMar>
+            <w:vAlign w:val="center"/>
+          </w:tcPr>
+          <w:p>
+            <w:pPr>
+              <w:spacing w:before="0" w:after="0" w:line="252" w:lineRule="auto"/>
+            </w:pPr>
+            <w:r>
+              <w:rPr>
+                <w:b/>
+                <w:bCs/>
+                <w:color w:val="0A5A3C"/>
+                <w:sz w:val="17"/>
+                <w:szCs w:val="17"/>
+              </w:rPr>
+              <w:t xml:space="preserve">Lugar y clima</w:t>
+            </w:r>
+          </w:p>
+        </w:tc>
+        <w:tc>
+          <w:tcPr>
+            <w:tcW w:w="7465" w:type="dxa"/>
+            <w:shd w:val="clear" w:color="auto" w:fill="F2F7F4"/>
+            <w:tcMar>
+              <w:top w:w="70" w:type="dxa"/>
+              <w:left w:w="110" w:type="dxa"/>
+              <w:bottom w:w="70" w:type="dxa"/>
+              <w:right w:w="110" w:type="dxa"/>
+            </w:tcMar>
+            <w:vAlign w:val="center"/>
+          </w:tcPr>
+          <w:p>
+            <w:pPr>
+              <w:spacing w:before="0" w:after="0" w:line="252" w:lineRule="auto"/>
+            </w:pPr>
+            <w:r>
+              <w:rPr>
+                <w:color w:val="17261F"/>
+                <w:sz w:val="17"/>
+                <w:szCs w:val="17"/>
+              </w:rPr>
+              <w:t xml:space="preserve">Con </w:t>
+            </w:r>
+            <w:r>
+              <w:rPr>
+                <w:rFonts w:ascii="JetBrains Mono" w:hAnsi="JetBrains Mono" w:eastAsia="JetBrains Mono" w:cs="JetBrains Mono"/>
+                <w:color w:val="0A5A3C"/>
+                <w:sz w:val="15"/>
+                <w:szCs w:val="15"/>
+              </w:rPr>
+              <w:t xml:space="preserve">placement</w:t>
+            </w:r>
+            <w:r>
+              <w:rPr>
+                <w:color w:val="17261F"/>
+                <w:sz w:val="17"/>
+                <w:szCs w:val="17"/>
+              </w:rPr>
+              <w:t xml:space="preserve"> y </w:t>
+            </w:r>
+            <w:r>
+              <w:rPr>
+                <w:rFonts w:ascii="JetBrains Mono" w:hAnsi="JetBrains Mono" w:eastAsia="JetBrains Mono" w:cs="JetBrains Mono"/>
+                <w:color w:val="0A5A3C"/>
+                <w:sz w:val="15"/>
+                <w:szCs w:val="15"/>
+              </w:rPr>
+              <w:t xml:space="preserve">weather</w:t>
+            </w:r>
+            <w:r>
+              <w:rPr>
+                <w:color w:val="17261F"/>
+                <w:sz w:val="17"/>
+                <w:szCs w:val="17"/>
+              </w:rPr>
+              <w:t xml:space="preserve">: consejo </w:t>
+            </w:r>
+            <w:r>
+              <w:rPr>
+                <w:rFonts w:ascii="JetBrains Mono" w:hAnsi="JetBrains Mono" w:eastAsia="JetBrains Mono" w:cs="JetBrains Mono"/>
+                <w:color w:val="0A5A3C"/>
+                <w:sz w:val="15"/>
+                <w:szCs w:val="15"/>
+              </w:rPr>
+              <w:t xml:space="preserve">OK</w:t>
+            </w:r>
+            <w:r>
+              <w:rPr>
+                <w:color w:val="17261F"/>
+                <w:sz w:val="17"/>
+                <w:szCs w:val="17"/>
+              </w:rPr>
+              <w:t xml:space="preserve">, </w:t>
+            </w:r>
+            <w:r>
+              <w:rPr>
+                <w:rFonts w:ascii="JetBrains Mono" w:hAnsi="JetBrains Mono" w:eastAsia="JetBrains Mono" w:cs="JetBrains Mono"/>
+                <w:color w:val="0A5A3C"/>
+                <w:sz w:val="15"/>
+                <w:szCs w:val="15"/>
+              </w:rPr>
+              <w:t xml:space="preserve">UNKNOWN</w:t>
+            </w:r>
+            <w:r>
+              <w:rPr>
+                <w:color w:val="17261F"/>
+                <w:sz w:val="17"/>
+                <w:szCs w:val="17"/>
+              </w:rPr>
+              <w:t xml:space="preserve">, </w:t>
+            </w:r>
+            <w:r>
+              <w:rPr>
+                <w:rFonts w:ascii="JetBrains Mono" w:hAnsi="JetBrains Mono" w:eastAsia="JetBrains Mono" w:cs="JetBrains Mono"/>
+                <w:color w:val="0A5A3C"/>
+                <w:sz w:val="15"/>
+                <w:szCs w:val="15"/>
+              </w:rPr>
+              <w:t xml:space="preserve">TIP</w:t>
+            </w:r>
+            <w:r>
+              <w:rPr>
+                <w:color w:val="17261F"/>
+                <w:sz w:val="17"/>
+                <w:szCs w:val="17"/>
+              </w:rPr>
+              <w:t xml:space="preserve"> o </w:t>
+            </w:r>
+            <w:r>
+              <w:rPr>
+                <w:rFonts w:ascii="JetBrains Mono" w:hAnsi="JetBrains Mono" w:eastAsia="JetBrains Mono" w:cs="JetBrains Mono"/>
+                <w:color w:val="0A5A3C"/>
+                <w:sz w:val="15"/>
+                <w:szCs w:val="15"/>
+              </w:rPr>
+              <w:t xml:space="preserve">MOVE</w:t>
+            </w:r>
+            <w:r>
+              <w:rPr>
+                <w:color w:val="17261F"/>
+                <w:sz w:val="17"/>
+                <w:szCs w:val="17"/>
+              </w:rPr>
+              <w:t xml:space="preserve"> según la luz que pide la especie; reglas </w:t>
+            </w:r>
+            <w:r>
+              <w:rPr>
+                <w:rFonts w:ascii="JetBrains Mono" w:hAnsi="JetBrains Mono" w:eastAsia="JetBrains Mono" w:cs="JetBrains Mono"/>
+                <w:color w:val="0A5A3C"/>
+                <w:sz w:val="15"/>
+                <w:szCs w:val="15"/>
+              </w:rPr>
+              <w:t xml:space="preserve">rain_outside</w:t>
+            </w:r>
+            <w:r>
+              <w:rPr>
+                <w:color w:val="17261F"/>
+                <w:sz w:val="17"/>
+                <w:szCs w:val="17"/>
+              </w:rPr>
+              <w:t xml:space="preserve"> (0,5 mm o más) y </w:t>
+            </w:r>
+            <w:r>
+              <w:rPr>
+                <w:rFonts w:ascii="JetBrains Mono" w:hAnsi="JetBrains Mono" w:eastAsia="JetBrains Mono" w:cs="JetBrains Mono"/>
+                <w:color w:val="0A5A3C"/>
+                <w:sz w:val="15"/>
+                <w:szCs w:val="15"/>
+              </w:rPr>
+              <w:t xml:space="preserve">sensor_vs_outside</w:t>
+            </w:r>
+            <w:r>
+              <w:rPr>
+                <w:color w:val="17261F"/>
+                <w:sz w:val="17"/>
+                <w:szCs w:val="17"/>
+              </w:rPr>
+              <w:t xml:space="preserve"> (8 °C o más de diferencia con el clima)</w:t>
             </w:r>
           </w:p>
         </w:tc>
@@ -2792,6 +4296,470 @@
     </w:p>
     <w:p>
       <w:pPr>
+        <w:spacing w:before="80" w:after="0" w:line="240" w:lineRule="auto"/>
+        <w:rPr>
+          <w:sz w:val="8"/>
+        </w:rPr>
+      </w:pPr>
+    </w:p>
+    <w:tbl>
+      <w:tblPr>
+        <w:tblW w:w="9360" w:type="dxa"/>
+        <w:tblInd w:w="0" w:type="dxa"/>
+        <w:tblBorders>
+          <w:top w:val="nil"/>
+          <w:left w:val="nil"/>
+          <w:bottom w:val="nil"/>
+          <w:right w:val="nil"/>
+          <w:insideH w:val="nil"/>
+          <w:insideV w:val="nil"/>
+        </w:tblBorders>
+        <w:tblLayout w:type="fixed"/>
+        <w:tblCellMar>
+          <w:left w:w="0" w:type="dxa"/>
+          <w:right w:w="0" w:type="dxa"/>
+        </w:tblCellMar>
+        <w:tblLook w:val="0000" w:firstRow="0" w:lastRow="0" w:firstColumn="0" w:lastColumn="0" w:noHBand="1" w:noVBand="1"/>
+      </w:tblPr>
+      <w:tblGrid>
+        <w:gridCol w:w="9360"/>
+      </w:tblGrid>
+      <w:tr>
+        <w:trPr>
+          <w:cantSplit/>
+        </w:trPr>
+        <w:tc>
+          <w:tcPr>
+            <w:tcW w:w="9360" w:type="dxa"/>
+            <w:shd w:val="clear" w:color="auto" w:fill="0B3D2B"/>
+            <w:tcMar>
+              <w:top w:w="60" w:type="dxa"/>
+              <w:left w:w="200" w:type="dxa"/>
+              <w:bottom w:w="60" w:type="dxa"/>
+              <w:right w:w="200" w:type="dxa"/>
+            </w:tcMar>
+            <w:vAlign w:val="top"/>
+          </w:tcPr>
+          <w:p>
+            <w:pPr>
+              <w:spacing w:before="0" w:after="0" w:line="240" w:lineRule="auto"/>
+            </w:pPr>
+            <w:r>
+              <w:rPr>
+                <w:b/>
+                <w:bCs/>
+                <w:color w:val="7FDBB0"/>
+                <w:spacing w:val="40"/>
+                <w:sz w:val="14"/>
+                <w:szCs w:val="14"/>
+              </w:rPr>
+              <w:t xml:space="preserve">MERMAID</w:t>
+            </w:r>
+          </w:p>
+        </w:tc>
+      </w:tr>
+    </w:tbl>
+    <w:tbl>
+      <w:tblPr>
+        <w:tblW w:w="9360" w:type="dxa"/>
+        <w:tblInd w:w="0" w:type="dxa"/>
+        <w:tblBorders>
+          <w:top w:val="nil"/>
+          <w:left w:val="nil"/>
+          <w:bottom w:val="nil"/>
+          <w:right w:val="nil"/>
+          <w:insideH w:val="nil"/>
+          <w:insideV w:val="nil"/>
+        </w:tblBorders>
+        <w:tblLayout w:type="fixed"/>
+        <w:tblCellMar>
+          <w:left w:w="0" w:type="dxa"/>
+          <w:right w:w="0" w:type="dxa"/>
+        </w:tblCellMar>
+        <w:tblLook w:val="0000" w:firstRow="0" w:lastRow="0" w:firstColumn="0" w:lastColumn="0" w:noHBand="1" w:noVBand="1"/>
+      </w:tblPr>
+      <w:tblGrid>
+        <w:gridCol w:w="9360"/>
+      </w:tblGrid>
+      <w:tr>
+        <w:trPr>
+          <w:cantSplit/>
+        </w:trPr>
+        <w:tc>
+          <w:tcPr>
+            <w:tcW w:w="9360" w:type="dxa"/>
+            <w:shd w:val="clear" w:color="auto" w:fill="F7FAF8"/>
+            <w:tcMar>
+              <w:top w:w="120" w:type="dxa"/>
+              <w:left w:w="200" w:type="dxa"/>
+              <w:bottom w:w="120" w:type="dxa"/>
+              <w:right w:w="200" w:type="dxa"/>
+            </w:tcMar>
+            <w:vAlign w:val="top"/>
+          </w:tcPr>
+          <w:p>
+            <w:pPr>
+              <w:spacing w:before="0" w:after="0" w:line="252" w:lineRule="auto"/>
+            </w:pPr>
+            <w:r>
+              <w:rPr>
+                <w:rFonts w:ascii="JetBrains Mono" w:hAnsi="JetBrains Mono" w:eastAsia="JetBrains Mono" w:cs="JetBrains Mono"/>
+                <w:color w:val="17261F"/>
+                <w:sz w:val="16"/>
+                <w:szCs w:val="16"/>
+              </w:rPr>
+              <w:t xml:space="preserve">%%{init: {"theme": "base", "fontFamily": "Segoe UI, Arial, sans-serif", "themeVariables": {"fontFamily": "Segoe UI, Arial, sans-serif", "fontSize": "15px", "primaryColor": "#DDF5EA", "primaryTextColor": "#17261F", "primaryBorderColor": "#067A52", "secondaryColor": "#E3F2FB", "secondaryTextColor": "#17261F", "secondaryBorderColor": "#1F6FA0", "tertiaryColor": "#F2F7F4", "tertiaryTextColor": "#17261F", "tertiaryBorderColor": "#D5E3DC", "lineColor": "#5B6B63", "textColor": "#17261F", "mainBkg": "#DDF5EA", "nodeBorder": "#067A52", "clusterBkg": "#F7FAF8", "clusterBorder": "#D5E3DC", "edgeLabelBackground": "#FFFFFF", "actorBkg": "#067A52", "actorBorder": "#0B3D2B", "actorTextColor": "#FFFFFF", "actorLineColor": "#5B6B63", "signalColor": "#17261F", "signalTextColor": "#17261F", "labelBoxBkgColor": "#0B3D2B", "labelBoxBorderColor": "#0B3D2B", "labelTextColor": "#FFFFFF", "loopTextColor": "#0B3D2B", "noteBkgColor": "#FDF4DD", "noteBorderColor": "#C98D12", "noteTextColor": "#17261F", "activationBkgColor": "#DDF5EA", "activationBorderColor": "#067A52", "attributeBackgroundColorOdd": "#FFFFFF", "attributeBackgroundColorEven": "#F2F7F4"}}}%%</w:t>
+            </w:r>
+          </w:p>
+          <w:p>
+            <w:pPr>
+              <w:spacing w:before="0" w:after="0" w:line="252" w:lineRule="auto"/>
+            </w:pPr>
+            <w:r>
+              <w:rPr>
+                <w:rFonts w:ascii="JetBrains Mono" w:hAnsi="JetBrains Mono" w:eastAsia="JetBrains Mono" w:cs="JetBrains Mono"/>
+                <w:color w:val="17261F"/>
+                <w:sz w:val="16"/>
+                <w:szCs w:val="16"/>
+              </w:rPr>
+              <w:t xml:space="preserve">flowchart LR</w:t>
+            </w:r>
+          </w:p>
+          <w:p>
+            <w:pPr>
+              <w:spacing w:before="0" w:after="0" w:line="252" w:lineRule="auto"/>
+            </w:pPr>
+            <w:r>
+              <w:rPr>
+                <w:rFonts w:ascii="JetBrains Mono" w:hAnsi="JetBrains Mono" w:eastAsia="JetBrains Mono" w:cs="JetBrains Mono"/>
+                <w:color w:val="17261F"/>
+                <w:sz w:val="16"/>
+                <w:szCs w:val="16"/>
+              </w:rPr>
+              <w:t xml:space="preserve">  batch(["Lote de la API&lt;br/&gt;solo cultivos reales · hasta 2000"]) --&gt; store["store&lt;br/&gt;SQLite en /data · cultivo seudonimizado SHA-256&lt;br/&gt;retención por días y tope de filas"]</w:t>
+            </w:r>
+          </w:p>
+          <w:p>
+            <w:pPr>
+              <w:spacing w:before="0" w:after="0" w:line="252" w:lineRule="auto"/>
+            </w:pPr>
+            <w:r>
+              <w:rPr>
+                <w:rFonts w:ascii="JetBrains Mono" w:hAnsi="JetBrains Mono" w:eastAsia="JetBrains Mono" w:cs="JetBrains Mono"/>
+                <w:color w:val="17261F"/>
+                <w:sz w:val="16"/>
+                <w:szCs w:val="16"/>
+              </w:rPr>
+              <w:t xml:space="preserve">  store --&gt; trigger{"¿Toca entrenar?&lt;br/&gt;desde 200 etiquetadas&lt;br/&gt;cada 300 nuevas"}</w:t>
+            </w:r>
+          </w:p>
+          <w:p>
+            <w:pPr>
+              <w:spacing w:before="0" w:after="0" w:line="252" w:lineRule="auto"/>
+            </w:pPr>
+            <w:r>
+              <w:rPr>
+                <w:rFonts w:ascii="JetBrains Mono" w:hAnsi="JetBrains Mono" w:eastAsia="JetBrains Mono" w:cs="JetBrains Mono"/>
+                <w:color w:val="17261F"/>
+                <w:sz w:val="16"/>
+                <w:szCs w:val="16"/>
+              </w:rPr>
+              <w:t xml:space="preserve">  trigger --&gt;|"No"| wait(["Espera más lecturas"])</w:t>
+            </w:r>
+          </w:p>
+          <w:p>
+            <w:pPr>
+              <w:spacing w:before="0" w:after="0" w:line="252" w:lineRule="auto"/>
+            </w:pPr>
+            <w:r>
+              <w:rPr>
+                <w:rFonts w:ascii="JetBrains Mono" w:hAnsi="JetBrains Mono" w:eastAsia="JetBrains Mono" w:cs="JetBrains Mono"/>
+                <w:color w:val="17261F"/>
+                <w:sz w:val="16"/>
+                <w:szCs w:val="16"/>
+              </w:rPr>
+              <w:t xml:space="preserve">  trigger --&gt;|"Sí"| quality["quality&lt;br/&gt;completitud · validez física&lt;br/&gt;atípicos IQR k = 3 · DQS"]</w:t>
+            </w:r>
+          </w:p>
+          <w:p>
+            <w:pPr>
+              <w:spacing w:before="0" w:after="0" w:line="252" w:lineRule="auto"/>
+            </w:pPr>
+            <w:r>
+              <w:rPr>
+                <w:rFonts w:ascii="JetBrains Mono" w:hAnsi="JetBrains Mono" w:eastAsia="JetBrains Mono" w:cs="JetBrains Mono"/>
+                <w:color w:val="17261F"/>
+                <w:sz w:val="16"/>
+                <w:szCs w:val="16"/>
+              </w:rPr>
+              <w:t xml:space="preserve">  quality --&gt; features["features&lt;br/&gt;posición en el rango · hora circular&lt;br/&gt;tendencia · etiquetas de la hora siguiente"]</w:t>
+            </w:r>
+          </w:p>
+          <w:p>
+            <w:pPr>
+              <w:spacing w:before="0" w:after="0" w:line="252" w:lineRule="auto"/>
+            </w:pPr>
+            <w:r>
+              <w:rPr>
+                <w:rFonts w:ascii="JetBrains Mono" w:hAnsi="JetBrains Mono" w:eastAsia="JetBrains Mono" w:cs="JetBrains Mono"/>
+                <w:color w:val="17261F"/>
+                <w:sz w:val="16"/>
+                <w:szCs w:val="16"/>
+              </w:rPr>
+              <w:t xml:space="preserve">  features --&gt; compare["trainer&lt;br/&gt;línea base y seis modelos&lt;br/&gt;TimeSeriesSplit de 4 cortes"]</w:t>
+            </w:r>
+          </w:p>
+          <w:p>
+            <w:pPr>
+              <w:spacing w:before="0" w:after="0" w:line="252" w:lineRule="auto"/>
+            </w:pPr>
+            <w:r>
+              <w:rPr>
+                <w:rFonts w:ascii="JetBrains Mono" w:hAnsi="JetBrains Mono" w:eastAsia="JetBrains Mono" w:cs="JetBrains Mono"/>
+                <w:color w:val="17261F"/>
+                <w:sz w:val="16"/>
+                <w:szCs w:val="16"/>
+              </w:rPr>
+              <w:t xml:space="preserve">  compare --&gt; tune["GridSearchCV&lt;br/&gt;sobre el mejor candidato"]</w:t>
+            </w:r>
+          </w:p>
+          <w:p>
+            <w:pPr>
+              <w:spacing w:before="0" w:after="0" w:line="252" w:lineRule="auto"/>
+            </w:pPr>
+            <w:r>
+              <w:rPr>
+                <w:rFonts w:ascii="JetBrains Mono" w:hAnsi="JetBrains Mono" w:eastAsia="JetBrains Mono" w:cs="JetBrains Mono"/>
+                <w:color w:val="17261F"/>
+                <w:sz w:val="16"/>
+                <w:szCs w:val="16"/>
+              </w:rPr>
+              <w:t xml:space="preserve">  tune --&gt; duel{"¿Supera al campeón&lt;br/&gt;y a la línea base en el&lt;br/&gt;20 % más reciente?"}</w:t>
+            </w:r>
+          </w:p>
+          <w:p>
+            <w:pPr>
+              <w:spacing w:before="0" w:after="0" w:line="252" w:lineRule="auto"/>
+            </w:pPr>
+            <w:r>
+              <w:rPr>
+                <w:rFonts w:ascii="JetBrains Mono" w:hAnsi="JetBrains Mono" w:eastAsia="JetBrains Mono" w:cs="JetBrains Mono"/>
+                <w:color w:val="17261F"/>
+                <w:sz w:val="16"/>
+                <w:szCs w:val="16"/>
+              </w:rPr>
+              <w:t xml:space="preserve">  duel --&gt;|"Sí"| champion["Nuevo campeón&lt;br/&gt;models/*.joblib"]</w:t>
+            </w:r>
+          </w:p>
+          <w:p>
+            <w:pPr>
+              <w:spacing w:before="0" w:after="0" w:line="252" w:lineRule="auto"/>
+            </w:pPr>
+            <w:r>
+              <w:rPr>
+                <w:rFonts w:ascii="JetBrains Mono" w:hAnsi="JetBrains Mono" w:eastAsia="JetBrains Mono" w:cs="JetBrains Mono"/>
+                <w:color w:val="17261F"/>
+                <w:sz w:val="16"/>
+                <w:szCs w:val="16"/>
+              </w:rPr>
+              <w:t xml:space="preserve">  duel --&gt;|"No"| keep["Se conserva el vigente"]</w:t>
+            </w:r>
+          </w:p>
+          <w:p>
+            <w:pPr>
+              <w:spacing w:before="0" w:after="0" w:line="252" w:lineRule="auto"/>
+            </w:pPr>
+            <w:r>
+              <w:rPr>
+                <w:rFonts w:ascii="JetBrains Mono" w:hAnsi="JetBrains Mono" w:eastAsia="JetBrains Mono" w:cs="JetBrains Mono"/>
+                <w:color w:val="17261F"/>
+                <w:sz w:val="16"/>
+                <w:szCs w:val="16"/>
+              </w:rPr>
+              <w:t xml:space="preserve">  features --&gt; unsup["No supervisado&lt;br/&gt;K-Means por silueta · Isolation Forest"]</w:t>
+            </w:r>
+          </w:p>
+          <w:p>
+            <w:pPr>
+              <w:spacing w:before="0" w:after="0" w:line="252" w:lineRule="auto"/>
+            </w:pPr>
+            <w:r>
+              <w:rPr>
+                <w:rFonts w:ascii="JetBrains Mono" w:hAnsi="JetBrains Mono" w:eastAsia="JetBrains Mono" w:cs="JetBrains Mono"/>
+                <w:color w:val="17261F"/>
+                <w:sz w:val="16"/>
+                <w:szCs w:val="16"/>
+              </w:rPr>
+              <w:t xml:space="preserve">  champion &amp; keep &amp; unsup --&gt; use(["learning en cada evaluación&lt;br/&gt;reglas learned_* y agente preventivo"])</w:t>
+            </w:r>
+          </w:p>
+          <w:p>
+            <w:pPr>
+              <w:spacing w:before="0" w:after="0" w:line="252" w:lineRule="auto"/>
+            </w:pPr>
+            <w:r>
+              <w:rPr>
+                <w:rFonts w:ascii="JetBrains Mono" w:hAnsi="JetBrains Mono" w:eastAsia="JetBrains Mono" w:cs="JetBrains Mono"/>
+                <w:color w:val="17261F"/>
+                <w:sz w:val="16"/>
+                <w:szCs w:val="16"/>
+              </w:rPr>
+              <w:t xml:space="preserve">  classDef leaf fill:#DDF5EA,stroke:#067A52,color:#17261F</w:t>
+            </w:r>
+          </w:p>
+          <w:p>
+            <w:pPr>
+              <w:spacing w:before="0" w:after="0" w:line="252" w:lineRule="auto"/>
+            </w:pPr>
+            <w:r>
+              <w:rPr>
+                <w:rFonts w:ascii="JetBrains Mono" w:hAnsi="JetBrains Mono" w:eastAsia="JetBrains Mono" w:cs="JetBrains Mono"/>
+                <w:color w:val="17261F"/>
+                <w:sz w:val="16"/>
+                <w:szCs w:val="16"/>
+              </w:rPr>
+              <w:t xml:space="preserve">  classDef water fill:#E3F2FB,stroke:#1F6FA0,color:#17261F</w:t>
+            </w:r>
+          </w:p>
+          <w:p>
+            <w:pPr>
+              <w:spacing w:before="0" w:after="0" w:line="252" w:lineRule="auto"/>
+            </w:pPr>
+            <w:r>
+              <w:rPr>
+                <w:rFonts w:ascii="JetBrains Mono" w:hAnsi="JetBrains Mono" w:eastAsia="JetBrains Mono" w:cs="JetBrains Mono"/>
+                <w:color w:val="17261F"/>
+                <w:sz w:val="16"/>
+                <w:szCs w:val="16"/>
+              </w:rPr>
+              <w:t xml:space="preserve">  classDef sun fill:#FDF4DD,stroke:#C98D12,color:#17261F</w:t>
+            </w:r>
+          </w:p>
+          <w:p>
+            <w:pPr>
+              <w:spacing w:before="0" w:after="0" w:line="252" w:lineRule="auto"/>
+            </w:pPr>
+            <w:r>
+              <w:rPr>
+                <w:rFonts w:ascii="JetBrains Mono" w:hAnsi="JetBrains Mono" w:eastAsia="JetBrains Mono" w:cs="JetBrains Mono"/>
+                <w:color w:val="17261F"/>
+                <w:sz w:val="16"/>
+                <w:szCs w:val="16"/>
+              </w:rPr>
+              <w:t xml:space="preserve">  classDef clay fill:#FBE9E1,stroke:#B85A38,color:#17261F</w:t>
+            </w:r>
+          </w:p>
+          <w:p>
+            <w:pPr>
+              <w:spacing w:before="0" w:after="0" w:line="252" w:lineRule="auto"/>
+            </w:pPr>
+            <w:r>
+              <w:rPr>
+                <w:rFonts w:ascii="JetBrains Mono" w:hAnsi="JetBrains Mono" w:eastAsia="JetBrains Mono" w:cs="JetBrains Mono"/>
+                <w:color w:val="17261F"/>
+                <w:sz w:val="16"/>
+                <w:szCs w:val="16"/>
+              </w:rPr>
+              <w:t xml:space="preserve">  classDef core fill:#067A52,stroke:#0B3D2B,color:#FFFFFF</w:t>
+            </w:r>
+          </w:p>
+          <w:p>
+            <w:pPr>
+              <w:spacing w:before="0" w:after="0" w:line="252" w:lineRule="auto"/>
+            </w:pPr>
+            <w:r>
+              <w:rPr>
+                <w:rFonts w:ascii="JetBrains Mono" w:hAnsi="JetBrains Mono" w:eastAsia="JetBrains Mono" w:cs="JetBrains Mono"/>
+                <w:color w:val="17261F"/>
+                <w:sz w:val="16"/>
+                <w:szCs w:val="16"/>
+              </w:rPr>
+              <w:t xml:space="preserve">  classDef deep fill:#0B3D2B,stroke:#06281C,color:#FFFFFF</w:t>
+            </w:r>
+          </w:p>
+          <w:p>
+            <w:pPr>
+              <w:spacing w:before="0" w:after="0" w:line="252" w:lineRule="auto"/>
+            </w:pPr>
+            <w:r>
+              <w:rPr>
+                <w:rFonts w:ascii="JetBrains Mono" w:hAnsi="JetBrains Mono" w:eastAsia="JetBrains Mono" w:cs="JetBrains Mono"/>
+                <w:color w:val="17261F"/>
+                <w:sz w:val="16"/>
+                <w:szCs w:val="16"/>
+              </w:rPr>
+              <w:t xml:space="preserve">  classDef muted fill:#F2F7F4,stroke:#5B6B63,color:#17261F</w:t>
+            </w:r>
+          </w:p>
+          <w:p>
+            <w:pPr>
+              <w:spacing w:before="0" w:after="0" w:line="252" w:lineRule="auto"/>
+            </w:pPr>
+            <w:r>
+              <w:rPr>
+                <w:rFonts w:ascii="JetBrains Mono" w:hAnsi="JetBrains Mono" w:eastAsia="JetBrains Mono" w:cs="JetBrains Mono"/>
+                <w:color w:val="17261F"/>
+                <w:sz w:val="16"/>
+                <w:szCs w:val="16"/>
+              </w:rPr>
+              <w:t xml:space="preserve">  class batch,use core</w:t>
+            </w:r>
+          </w:p>
+          <w:p>
+            <w:pPr>
+              <w:spacing w:before="0" w:after="0" w:line="252" w:lineRule="auto"/>
+            </w:pPr>
+            <w:r>
+              <w:rPr>
+                <w:rFonts w:ascii="JetBrains Mono" w:hAnsi="JetBrains Mono" w:eastAsia="JetBrains Mono" w:cs="JetBrains Mono"/>
+                <w:color w:val="17261F"/>
+                <w:sz w:val="16"/>
+                <w:szCs w:val="16"/>
+              </w:rPr>
+              <w:t xml:space="preserve">  class store,quality,features,compare,tune,unsup leaf</w:t>
+            </w:r>
+          </w:p>
+          <w:p>
+            <w:pPr>
+              <w:spacing w:before="0" w:after="0" w:line="252" w:lineRule="auto"/>
+            </w:pPr>
+            <w:r>
+              <w:rPr>
+                <w:rFonts w:ascii="JetBrains Mono" w:hAnsi="JetBrains Mono" w:eastAsia="JetBrains Mono" w:cs="JetBrains Mono"/>
+                <w:color w:val="17261F"/>
+                <w:sz w:val="16"/>
+                <w:szCs w:val="16"/>
+              </w:rPr>
+              <w:t xml:space="preserve">  class trigger,duel sun</w:t>
+            </w:r>
+          </w:p>
+          <w:p>
+            <w:pPr>
+              <w:spacing w:before="0" w:after="0" w:line="252" w:lineRule="auto"/>
+            </w:pPr>
+            <w:r>
+              <w:rPr>
+                <w:rFonts w:ascii="JetBrains Mono" w:hAnsi="JetBrains Mono" w:eastAsia="JetBrains Mono" w:cs="JetBrains Mono"/>
+                <w:color w:val="17261F"/>
+                <w:sz w:val="16"/>
+                <w:szCs w:val="16"/>
+              </w:rPr>
+              <w:t xml:space="preserve">  class champion,keep,wait muted</w:t>
+            </w:r>
+          </w:p>
+        </w:tc>
+      </w:tr>
+    </w:tbl>
+    <w:p>
+      <w:pPr>
+        <w:spacing w:before="160" w:after="0" w:line="240" w:lineRule="auto"/>
+        <w:rPr>
+          <w:sz w:val="8"/>
+        </w:rPr>
+      </w:pPr>
+    </w:p>
+    <w:p>
+      <w:pPr>
         <w:spacing w:before="0" w:after="140" w:line="288" w:lineRule="auto"/>
       </w:pPr>
       <w:r>
@@ -2926,6 +4894,372 @@
     </w:p>
     <w:p>
       <w:pPr>
+        <w:spacing w:before="80" w:after="0" w:line="240" w:lineRule="auto"/>
+        <w:rPr>
+          <w:sz w:val="8"/>
+        </w:rPr>
+      </w:pPr>
+    </w:p>
+    <w:tbl>
+      <w:tblPr>
+        <w:tblW w:w="9360" w:type="dxa"/>
+        <w:tblInd w:w="0" w:type="dxa"/>
+        <w:tblBorders>
+          <w:top w:val="nil"/>
+          <w:left w:val="nil"/>
+          <w:bottom w:val="nil"/>
+          <w:right w:val="nil"/>
+          <w:insideH w:val="nil"/>
+          <w:insideV w:val="nil"/>
+        </w:tblBorders>
+        <w:tblLayout w:type="fixed"/>
+        <w:tblCellMar>
+          <w:left w:w="0" w:type="dxa"/>
+          <w:right w:w="0" w:type="dxa"/>
+        </w:tblCellMar>
+        <w:tblLook w:val="0000" w:firstRow="0" w:lastRow="0" w:firstColumn="0" w:lastColumn="0" w:noHBand="1" w:noVBand="1"/>
+      </w:tblPr>
+      <w:tblGrid>
+        <w:gridCol w:w="9360"/>
+      </w:tblGrid>
+      <w:tr>
+        <w:trPr>
+          <w:cantSplit/>
+        </w:trPr>
+        <w:tc>
+          <w:tcPr>
+            <w:tcW w:w="9360" w:type="dxa"/>
+            <w:shd w:val="clear" w:color="auto" w:fill="0B3D2B"/>
+            <w:tcMar>
+              <w:top w:w="60" w:type="dxa"/>
+              <w:left w:w="200" w:type="dxa"/>
+              <w:bottom w:w="60" w:type="dxa"/>
+              <w:right w:w="200" w:type="dxa"/>
+            </w:tcMar>
+            <w:vAlign w:val="top"/>
+          </w:tcPr>
+          <w:p>
+            <w:pPr>
+              <w:spacing w:before="0" w:after="0" w:line="240" w:lineRule="auto"/>
+            </w:pPr>
+            <w:r>
+              <w:rPr>
+                <w:b/>
+                <w:bCs/>
+                <w:color w:val="7FDBB0"/>
+                <w:spacing w:val="40"/>
+                <w:sz w:val="14"/>
+                <w:szCs w:val="14"/>
+              </w:rPr>
+              <w:t xml:space="preserve">MERMAID</w:t>
+            </w:r>
+          </w:p>
+        </w:tc>
+      </w:tr>
+    </w:tbl>
+    <w:tbl>
+      <w:tblPr>
+        <w:tblW w:w="9360" w:type="dxa"/>
+        <w:tblInd w:w="0" w:type="dxa"/>
+        <w:tblBorders>
+          <w:top w:val="nil"/>
+          <w:left w:val="nil"/>
+          <w:bottom w:val="nil"/>
+          <w:right w:val="nil"/>
+          <w:insideH w:val="nil"/>
+          <w:insideV w:val="nil"/>
+        </w:tblBorders>
+        <w:tblLayout w:type="fixed"/>
+        <w:tblCellMar>
+          <w:left w:w="0" w:type="dxa"/>
+          <w:right w:w="0" w:type="dxa"/>
+        </w:tblCellMar>
+        <w:tblLook w:val="0000" w:firstRow="0" w:lastRow="0" w:firstColumn="0" w:lastColumn="0" w:noHBand="1" w:noVBand="1"/>
+      </w:tblPr>
+      <w:tblGrid>
+        <w:gridCol w:w="9360"/>
+      </w:tblGrid>
+      <w:tr>
+        <w:trPr>
+          <w:cantSplit/>
+        </w:trPr>
+        <w:tc>
+          <w:tcPr>
+            <w:tcW w:w="9360" w:type="dxa"/>
+            <w:shd w:val="clear" w:color="auto" w:fill="F7FAF8"/>
+            <w:tcMar>
+              <w:top w:w="120" w:type="dxa"/>
+              <w:left w:w="200" w:type="dxa"/>
+              <w:bottom w:w="120" w:type="dxa"/>
+              <w:right w:w="200" w:type="dxa"/>
+            </w:tcMar>
+            <w:vAlign w:val="top"/>
+          </w:tcPr>
+          <w:p>
+            <w:pPr>
+              <w:spacing w:before="0" w:after="0" w:line="252" w:lineRule="auto"/>
+            </w:pPr>
+            <w:r>
+              <w:rPr>
+                <w:rFonts w:ascii="JetBrains Mono" w:hAnsi="JetBrains Mono" w:eastAsia="JetBrains Mono" w:cs="JetBrains Mono"/>
+                <w:color w:val="17261F"/>
+                <w:sz w:val="16"/>
+                <w:szCs w:val="16"/>
+              </w:rPr>
+              <w:t xml:space="preserve">%%{init: {"theme": "base", "fontFamily": "Segoe UI, Arial, sans-serif", "themeVariables": {"fontFamily": "Segoe UI, Arial, sans-serif", "fontSize": "15px", "primaryColor": "#DDF5EA", "primaryTextColor": "#17261F", "primaryBorderColor": "#067A52", "secondaryColor": "#E3F2FB", "secondaryTextColor": "#17261F", "secondaryBorderColor": "#1F6FA0", "tertiaryColor": "#F2F7F4", "tertiaryTextColor": "#17261F", "tertiaryBorderColor": "#D5E3DC", "lineColor": "#5B6B63", "textColor": "#17261F", "mainBkg": "#DDF5EA", "nodeBorder": "#067A52", "clusterBkg": "#F7FAF8", "clusterBorder": "#D5E3DC", "edgeLabelBackground": "#FFFFFF", "actorBkg": "#067A52", "actorBorder": "#0B3D2B", "actorTextColor": "#FFFFFF", "actorLineColor": "#5B6B63", "signalColor": "#17261F", "signalTextColor": "#17261F", "labelBoxBkgColor": "#0B3D2B", "labelBoxBorderColor": "#0B3D2B", "labelTextColor": "#FFFFFF", "loopTextColor": "#0B3D2B", "noteBkgColor": "#FDF4DD", "noteBorderColor": "#C98D12", "noteTextColor": "#17261F", "activationBkgColor": "#DDF5EA", "activationBorderColor": "#067A52", "attributeBackgroundColorOdd": "#FFFFFF", "attributeBackgroundColorEven": "#F2F7F4"}}}%%</w:t>
+            </w:r>
+          </w:p>
+          <w:p>
+            <w:pPr>
+              <w:spacing w:before="0" w:after="0" w:line="252" w:lineRule="auto"/>
+            </w:pPr>
+            <w:r>
+              <w:rPr>
+                <w:rFonts w:ascii="JetBrains Mono" w:hAnsi="JetBrains Mono" w:eastAsia="JetBrains Mono" w:cs="JetBrains Mono"/>
+                <w:color w:val="17261F"/>
+                <w:sz w:val="16"/>
+                <w:szCs w:val="16"/>
+              </w:rPr>
+              <w:t xml:space="preserve">flowchart TB</w:t>
+            </w:r>
+          </w:p>
+          <w:p>
+            <w:pPr>
+              <w:spacing w:before="0" w:after="0" w:line="252" w:lineRule="auto"/>
+            </w:pPr>
+            <w:r>
+              <w:rPr>
+                <w:rFonts w:ascii="JetBrains Mono" w:hAnsi="JetBrains Mono" w:eastAsia="JetBrains Mono" w:cs="JetBrains Mono"/>
+                <w:color w:val="17261F"/>
+                <w:sz w:val="16"/>
+                <w:szCs w:val="16"/>
+              </w:rPr>
+              <w:t xml:space="preserve">  req(["POST /v1/fleet&lt;br/&gt;todos los cultivos de una cuenta"]) --&gt; each["Evaluación de cada cultivo&lt;br/&gt;como en /v1/insights"]</w:t>
+            </w:r>
+          </w:p>
+          <w:p>
+            <w:pPr>
+              <w:spacing w:before="0" w:after="0" w:line="252" w:lineRule="auto"/>
+            </w:pPr>
+            <w:r>
+              <w:rPr>
+                <w:rFonts w:ascii="JetBrains Mono" w:hAnsi="JetBrains Mono" w:eastAsia="JetBrains Mono" w:cs="JetBrains Mono"/>
+                <w:color w:val="17261F"/>
+                <w:sz w:val="16"/>
+                <w:szCs w:val="16"/>
+              </w:rPr>
+              <w:t xml:space="preserve">  each --&gt; rank["Ranking por salud"]</w:t>
+            </w:r>
+          </w:p>
+          <w:p>
+            <w:pPr>
+              <w:spacing w:before="0" w:after="0" w:line="252" w:lineRule="auto"/>
+            </w:pPr>
+            <w:r>
+              <w:rPr>
+                <w:rFonts w:ascii="JetBrains Mono" w:hAnsi="JetBrains Mono" w:eastAsia="JetBrains Mono" w:cs="JetBrains Mono"/>
+                <w:color w:val="17261F"/>
+                <w:sz w:val="16"/>
+                <w:szCs w:val="16"/>
+              </w:rPr>
+              <w:t xml:space="preserve">  each --&gt; shared["Problemas compartidos&lt;br/&gt;la misma variable fuera de rango&lt;br/&gt;en la mitad o más de los cultivos"]</w:t>
+            </w:r>
+          </w:p>
+          <w:p>
+            <w:pPr>
+              <w:spacing w:before="0" w:after="0" w:line="252" w:lineRule="auto"/>
+            </w:pPr>
+            <w:r>
+              <w:rPr>
+                <w:rFonts w:ascii="JetBrains Mono" w:hAnsi="JetBrains Mono" w:eastAsia="JetBrains Mono" w:cs="JetBrains Mono"/>
+                <w:color w:val="17261F"/>
+                <w:sz w:val="16"/>
+                <w:szCs w:val="16"/>
+              </w:rPr>
+              <w:t xml:space="preserve">  each --&gt; groups["Grupos K-Means&lt;br/&gt;número de grupos por silueta"]</w:t>
+            </w:r>
+          </w:p>
+          <w:p>
+            <w:pPr>
+              <w:spacing w:before="0" w:after="0" w:line="252" w:lineRule="auto"/>
+            </w:pPr>
+            <w:r>
+              <w:rPr>
+                <w:rFonts w:ascii="JetBrains Mono" w:hAnsi="JetBrains Mono" w:eastAsia="JetBrains Mono" w:cs="JetBrains Mono"/>
+                <w:color w:val="17261F"/>
+                <w:sz w:val="16"/>
+                <w:szCs w:val="16"/>
+              </w:rPr>
+              <w:t xml:space="preserve">  each --&gt; actions["Acciones del agente&lt;br/&gt;reunidas por actuador"]</w:t>
+            </w:r>
+          </w:p>
+          <w:p>
+            <w:pPr>
+              <w:spacing w:before="0" w:after="0" w:line="252" w:lineRule="auto"/>
+            </w:pPr>
+            <w:r>
+              <w:rPr>
+                <w:rFonts w:ascii="JetBrains Mono" w:hAnsi="JetBrains Mono" w:eastAsia="JetBrains Mono" w:cs="JetBrains Mono"/>
+                <w:color w:val="17261F"/>
+                <w:sz w:val="16"/>
+                <w:szCs w:val="16"/>
+              </w:rPr>
+              <w:t xml:space="preserve">  rank &amp; shared &amp; groups &amp; actions --&gt; out(["Resumen de la flota&lt;br/&gt;para el panel general y las órdenes en bloque"])</w:t>
+            </w:r>
+          </w:p>
+          <w:p>
+            <w:pPr>
+              <w:spacing w:before="0" w:after="0" w:line="252" w:lineRule="auto"/>
+            </w:pPr>
+            <w:r>
+              <w:rPr>
+                <w:rFonts w:ascii="JetBrains Mono" w:hAnsi="JetBrains Mono" w:eastAsia="JetBrains Mono" w:cs="JetBrains Mono"/>
+                <w:color w:val="17261F"/>
+                <w:sz w:val="16"/>
+                <w:szCs w:val="16"/>
+              </w:rPr>
+              <w:t xml:space="preserve">  classDef leaf fill:#DDF5EA,stroke:#067A52,color:#17261F</w:t>
+            </w:r>
+          </w:p>
+          <w:p>
+            <w:pPr>
+              <w:spacing w:before="0" w:after="0" w:line="252" w:lineRule="auto"/>
+            </w:pPr>
+            <w:r>
+              <w:rPr>
+                <w:rFonts w:ascii="JetBrains Mono" w:hAnsi="JetBrains Mono" w:eastAsia="JetBrains Mono" w:cs="JetBrains Mono"/>
+                <w:color w:val="17261F"/>
+                <w:sz w:val="16"/>
+                <w:szCs w:val="16"/>
+              </w:rPr>
+              <w:t xml:space="preserve">  classDef water fill:#E3F2FB,stroke:#1F6FA0,color:#17261F</w:t>
+            </w:r>
+          </w:p>
+          <w:p>
+            <w:pPr>
+              <w:spacing w:before="0" w:after="0" w:line="252" w:lineRule="auto"/>
+            </w:pPr>
+            <w:r>
+              <w:rPr>
+                <w:rFonts w:ascii="JetBrains Mono" w:hAnsi="JetBrains Mono" w:eastAsia="JetBrains Mono" w:cs="JetBrains Mono"/>
+                <w:color w:val="17261F"/>
+                <w:sz w:val="16"/>
+                <w:szCs w:val="16"/>
+              </w:rPr>
+              <w:t xml:space="preserve">  classDef sun fill:#FDF4DD,stroke:#C98D12,color:#17261F</w:t>
+            </w:r>
+          </w:p>
+          <w:p>
+            <w:pPr>
+              <w:spacing w:before="0" w:after="0" w:line="252" w:lineRule="auto"/>
+            </w:pPr>
+            <w:r>
+              <w:rPr>
+                <w:rFonts w:ascii="JetBrains Mono" w:hAnsi="JetBrains Mono" w:eastAsia="JetBrains Mono" w:cs="JetBrains Mono"/>
+                <w:color w:val="17261F"/>
+                <w:sz w:val="16"/>
+                <w:szCs w:val="16"/>
+              </w:rPr>
+              <w:t xml:space="preserve">  classDef clay fill:#FBE9E1,stroke:#B85A38,color:#17261F</w:t>
+            </w:r>
+          </w:p>
+          <w:p>
+            <w:pPr>
+              <w:spacing w:before="0" w:after="0" w:line="252" w:lineRule="auto"/>
+            </w:pPr>
+            <w:r>
+              <w:rPr>
+                <w:rFonts w:ascii="JetBrains Mono" w:hAnsi="JetBrains Mono" w:eastAsia="JetBrains Mono" w:cs="JetBrains Mono"/>
+                <w:color w:val="17261F"/>
+                <w:sz w:val="16"/>
+                <w:szCs w:val="16"/>
+              </w:rPr>
+              <w:t xml:space="preserve">  classDef core fill:#067A52,stroke:#0B3D2B,color:#FFFFFF</w:t>
+            </w:r>
+          </w:p>
+          <w:p>
+            <w:pPr>
+              <w:spacing w:before="0" w:after="0" w:line="252" w:lineRule="auto"/>
+            </w:pPr>
+            <w:r>
+              <w:rPr>
+                <w:rFonts w:ascii="JetBrains Mono" w:hAnsi="JetBrains Mono" w:eastAsia="JetBrains Mono" w:cs="JetBrains Mono"/>
+                <w:color w:val="17261F"/>
+                <w:sz w:val="16"/>
+                <w:szCs w:val="16"/>
+              </w:rPr>
+              <w:t xml:space="preserve">  classDef deep fill:#0B3D2B,stroke:#06281C,color:#FFFFFF</w:t>
+            </w:r>
+          </w:p>
+          <w:p>
+            <w:pPr>
+              <w:spacing w:before="0" w:after="0" w:line="252" w:lineRule="auto"/>
+            </w:pPr>
+            <w:r>
+              <w:rPr>
+                <w:rFonts w:ascii="JetBrains Mono" w:hAnsi="JetBrains Mono" w:eastAsia="JetBrains Mono" w:cs="JetBrains Mono"/>
+                <w:color w:val="17261F"/>
+                <w:sz w:val="16"/>
+                <w:szCs w:val="16"/>
+              </w:rPr>
+              <w:t xml:space="preserve">  classDef muted fill:#F2F7F4,stroke:#5B6B63,color:#17261F</w:t>
+            </w:r>
+          </w:p>
+          <w:p>
+            <w:pPr>
+              <w:spacing w:before="0" w:after="0" w:line="252" w:lineRule="auto"/>
+            </w:pPr>
+            <w:r>
+              <w:rPr>
+                <w:rFonts w:ascii="JetBrains Mono" w:hAnsi="JetBrains Mono" w:eastAsia="JetBrains Mono" w:cs="JetBrains Mono"/>
+                <w:color w:val="17261F"/>
+                <w:sz w:val="16"/>
+                <w:szCs w:val="16"/>
+              </w:rPr>
+              <w:t xml:space="preserve">  class req,out core</w:t>
+            </w:r>
+          </w:p>
+          <w:p>
+            <w:pPr>
+              <w:spacing w:before="0" w:after="0" w:line="252" w:lineRule="auto"/>
+            </w:pPr>
+            <w:r>
+              <w:rPr>
+                <w:rFonts w:ascii="JetBrains Mono" w:hAnsi="JetBrains Mono" w:eastAsia="JetBrains Mono" w:cs="JetBrains Mono"/>
+                <w:color w:val="17261F"/>
+                <w:sz w:val="16"/>
+                <w:szCs w:val="16"/>
+              </w:rPr>
+              <w:t xml:space="preserve">  class each sun</w:t>
+            </w:r>
+          </w:p>
+          <w:p>
+            <w:pPr>
+              <w:spacing w:before="0" w:after="0" w:line="252" w:lineRule="auto"/>
+            </w:pPr>
+            <w:r>
+              <w:rPr>
+                <w:rFonts w:ascii="JetBrains Mono" w:hAnsi="JetBrains Mono" w:eastAsia="JetBrains Mono" w:cs="JetBrains Mono"/>
+                <w:color w:val="17261F"/>
+                <w:sz w:val="16"/>
+                <w:szCs w:val="16"/>
+              </w:rPr>
+              <w:t xml:space="preserve">  class rank,shared,groups,actions leaf</w:t>
+            </w:r>
+          </w:p>
+        </w:tc>
+      </w:tr>
+    </w:tbl>
+    <w:p>
+      <w:pPr>
+        <w:spacing w:before="160" w:after="0" w:line="240" w:lineRule="auto"/>
+        <w:rPr>
+          <w:sz w:val="8"/>
+        </w:rPr>
+      </w:pPr>
+    </w:p>
+    <w:p>
+      <w:pPr>
         <w:pageBreakBefore/>
         <w:spacing w:before="0" w:after="0" w:line="20" w:lineRule="exact"/>
         <w:rPr>
@@ -4461,7 +6795,7 @@
           <w:sz w:val="20"/>
           <w:szCs w:val="20"/>
         </w:rPr>
-        <w:t xml:space="preserve">: 73 pruebas sobre la base de conocimiento, el encadenamiento de reglas, la monotonía del índice difuso, la exactitud mínima de los modelos, el pronóstico, el agente, la flota, el contrato HTTP y el aprendizaje continuo (seudonimización, poda, calidad, etiquetas, modelos que superan a la línea base, campeón y retador, persistencia).</w:t>
+        <w:t xml:space="preserve">: 84 pruebas sobre la base de conocimiento, el encadenamiento de reglas, la monotonía del índice difuso, la exactitud mínima de los modelos, el pronóstico, el agente, la lluvia y el sensor frente al clima, el consejo de lugar, la flota, el contrato HTTP y el aprendizaje continuo (seudonimización, poda, calidad, etiquetas, modelos que superan a la línea base, campeón y retador, persistencia).</w:t>
       </w:r>
     </w:p>
     <w:p>
@@ -5094,7 +7428,7 @@
               <w:sz w:val="14"/>
               <w:szCs w:val="14"/>
             </w:rPr>
-            <w:t xml:space="preserve">SMARTPOT-AI · V1.0</w:t>
+            <w:t xml:space="preserve">SMARTPOT-AI · V1.1</w:t>
           </w:r>
         </w:p>
       </w:tc>

</xml_diff>

<commit_message>
Document native C++ engine architecture and regenerate reports [skip deploy] #no-deploy
</commit_message>
<xml_diff>
--- a/docs/SmartPot_AI_Documentation.docx
+++ b/docs/SmartPot_AI_Documentation.docx
@@ -359,7 +359,7 @@
                 <w:sz w:val="19"/>
                 <w:szCs w:val="19"/>
               </w:rPr>
-              <w:t xml:space="preserve">1.1 · octubre 2026</w:t>
+              <w:t xml:space="preserve">1.2 · octubre 2026</w:t>
             </w:r>
             <w:r>
               <w:rPr>
@@ -729,7 +729,7 @@
                 <w:sz w:val="17"/>
                 <w:szCs w:val="17"/>
               </w:rPr>
-              <w:t xml:space="preserve">1.1 · octubre 2026</w:t>
+              <w:t xml:space="preserve">1.2 · octubre 2026</w:t>
             </w:r>
           </w:p>
         </w:tc>
@@ -1086,7 +1086,7 @@
         <w:ind w:left="0"/>
         <w:spacing w:before="100" w:after="30" w:line="252" w:lineRule="auto"/>
       </w:pPr>
-      <w:hyperlink w:anchor="sec_108" w:history="1">
+      <w:hyperlink w:anchor="sec_109" w:history="1">
         <w:r>
           <w:rPr>
             <w:b/>
@@ -1104,7 +1104,7 @@
         <w:ind w:left="0"/>
         <w:spacing w:before="100" w:after="30" w:line="252" w:lineRule="auto"/>
       </w:pPr>
-      <w:hyperlink w:anchor="sec_110" w:history="1">
+      <w:hyperlink w:anchor="sec_111" w:history="1">
         <w:r>
           <w:rPr>
             <w:b/>
@@ -1122,7 +1122,7 @@
         <w:ind w:left="0"/>
         <w:spacing w:before="100" w:after="30" w:line="252" w:lineRule="auto"/>
       </w:pPr>
-      <w:hyperlink w:anchor="sec_112" w:history="1">
+      <w:hyperlink w:anchor="sec_113" w:history="1">
         <w:r>
           <w:rPr>
             <w:b/>
@@ -1140,7 +1140,7 @@
         <w:ind w:left="0"/>
         <w:spacing w:before="100" w:after="30" w:line="252" w:lineRule="auto"/>
       </w:pPr>
-      <w:hyperlink w:anchor="sec_114" w:history="1">
+      <w:hyperlink w:anchor="sec_115" w:history="1">
         <w:r>
           <w:rPr>
             <w:b/>
@@ -1158,7 +1158,7 @@
         <w:ind w:left="0"/>
         <w:spacing w:before="100" w:after="30" w:line="252" w:lineRule="auto"/>
       </w:pPr>
-      <w:hyperlink w:anchor="sec_115" w:history="1">
+      <w:hyperlink w:anchor="sec_116" w:history="1">
         <w:r>
           <w:rPr>
             <w:b/>
@@ -1176,7 +1176,7 @@
         <w:ind w:left="0"/>
         <w:spacing w:before="100" w:after="30" w:line="252" w:lineRule="auto"/>
       </w:pPr>
-      <w:hyperlink w:anchor="sec_116" w:history="1">
+      <w:hyperlink w:anchor="sec_117" w:history="1">
         <w:r>
           <w:rPr>
             <w:b/>
@@ -1194,7 +1194,7 @@
         <w:ind w:left="0"/>
         <w:spacing w:before="100" w:after="30" w:line="252" w:lineRule="auto"/>
       </w:pPr>
-      <w:hyperlink w:anchor="sec_117" w:history="1">
+      <w:hyperlink w:anchor="sec_118" w:history="1">
         <w:r>
           <w:rPr>
             <w:b/>
@@ -1390,8 +1390,8 @@
         <w:tblLook w:val="04A0" w:firstRow="1" w:firstColumn="1" w:noVBand="1"/>
       </w:tblPr>
       <w:tblGrid>
-        <w:gridCol w:w="2125"/>
-        <w:gridCol w:w="7235"/>
+        <w:gridCol w:w="2004"/>
+        <w:gridCol w:w="7356"/>
       </w:tblGrid>
       <w:tr>
         <w:trPr>
@@ -1400,7 +1400,7 @@
         </w:trPr>
         <w:tc>
           <w:tcPr>
-            <w:tcW w:w="2125" w:type="dxa"/>
+            <w:tcW w:w="2004" w:type="dxa"/>
             <w:shd w:val="clear" w:color="auto" w:fill="0B3D2B"/>
             <w:tcMar>
               <w:top w:w="70" w:type="dxa"/>
@@ -1429,7 +1429,7 @@
         </w:tc>
         <w:tc>
           <w:tcPr>
-            <w:tcW w:w="7235" w:type="dxa"/>
+            <w:tcW w:w="7356" w:type="dxa"/>
             <w:shd w:val="clear" w:color="auto" w:fill="0B3D2B"/>
             <w:tcMar>
               <w:top w:w="70" w:type="dxa"/>
@@ -1463,7 +1463,7 @@
         </w:trPr>
         <w:tc>
           <w:tcPr>
-            <w:tcW w:w="2125" w:type="dxa"/>
+            <w:tcW w:w="2004" w:type="dxa"/>
             <w:shd w:val="clear" w:color="auto" w:fill="FFFFFF"/>
             <w:tcMar>
               <w:top w:w="70" w:type="dxa"/>
@@ -1491,7 +1491,7 @@
         </w:tc>
         <w:tc>
           <w:tcPr>
-            <w:tcW w:w="7235" w:type="dxa"/>
+            <w:tcW w:w="7356" w:type="dxa"/>
             <w:shd w:val="clear" w:color="auto" w:fill="FFFFFF"/>
             <w:tcMar>
               <w:top w:w="70" w:type="dxa"/>
@@ -1522,7 +1522,7 @@
         </w:trPr>
         <w:tc>
           <w:tcPr>
-            <w:tcW w:w="2125" w:type="dxa"/>
+            <w:tcW w:w="2004" w:type="dxa"/>
             <w:shd w:val="clear" w:color="auto" w:fill="F2F7F4"/>
             <w:tcMar>
               <w:top w:w="70" w:type="dxa"/>
@@ -1550,7 +1550,7 @@
         </w:tc>
         <w:tc>
           <w:tcPr>
-            <w:tcW w:w="7235" w:type="dxa"/>
+            <w:tcW w:w="7356" w:type="dxa"/>
             <w:shd w:val="clear" w:color="auto" w:fill="F2F7F4"/>
             <w:tcMar>
               <w:top w:w="70" w:type="dxa"/>
@@ -1581,7 +1581,7 @@
         </w:trPr>
         <w:tc>
           <w:tcPr>
-            <w:tcW w:w="2125" w:type="dxa"/>
+            <w:tcW w:w="2004" w:type="dxa"/>
             <w:shd w:val="clear" w:color="auto" w:fill="FFFFFF"/>
             <w:tcMar>
               <w:top w:w="70" w:type="dxa"/>
@@ -1609,7 +1609,7 @@
         </w:tc>
         <w:tc>
           <w:tcPr>
-            <w:tcW w:w="7235" w:type="dxa"/>
+            <w:tcW w:w="7356" w:type="dxa"/>
             <w:shd w:val="clear" w:color="auto" w:fill="FFFFFF"/>
             <w:tcMar>
               <w:top w:w="70" w:type="dxa"/>
@@ -1640,7 +1640,7 @@
         </w:trPr>
         <w:tc>
           <w:tcPr>
-            <w:tcW w:w="2125" w:type="dxa"/>
+            <w:tcW w:w="2004" w:type="dxa"/>
             <w:shd w:val="clear" w:color="auto" w:fill="F2F7F4"/>
             <w:tcMar>
               <w:top w:w="70" w:type="dxa"/>
@@ -1668,7 +1668,7 @@
         </w:tc>
         <w:tc>
           <w:tcPr>
-            <w:tcW w:w="7235" w:type="dxa"/>
+            <w:tcW w:w="7356" w:type="dxa"/>
             <w:shd w:val="clear" w:color="auto" w:fill="F2F7F4"/>
             <w:tcMar>
               <w:top w:w="70" w:type="dxa"/>
@@ -1699,7 +1699,7 @@
         </w:trPr>
         <w:tc>
           <w:tcPr>
-            <w:tcW w:w="2125" w:type="dxa"/>
+            <w:tcW w:w="2004" w:type="dxa"/>
             <w:shd w:val="clear" w:color="auto" w:fill="FFFFFF"/>
             <w:tcMar>
               <w:top w:w="70" w:type="dxa"/>
@@ -1727,7 +1727,7 @@
         </w:tc>
         <w:tc>
           <w:tcPr>
-            <w:tcW w:w="7235" w:type="dxa"/>
+            <w:tcW w:w="7356" w:type="dxa"/>
             <w:shd w:val="clear" w:color="auto" w:fill="FFFFFF"/>
             <w:tcMar>
               <w:top w:w="70" w:type="dxa"/>
@@ -1758,7 +1758,7 @@
         </w:trPr>
         <w:tc>
           <w:tcPr>
-            <w:tcW w:w="2125" w:type="dxa"/>
+            <w:tcW w:w="2004" w:type="dxa"/>
             <w:shd w:val="clear" w:color="auto" w:fill="F2F7F4"/>
             <w:tcMar>
               <w:top w:w="70" w:type="dxa"/>
@@ -1786,7 +1786,7 @@
         </w:tc>
         <w:tc>
           <w:tcPr>
-            <w:tcW w:w="7235" w:type="dxa"/>
+            <w:tcW w:w="7356" w:type="dxa"/>
             <w:shd w:val="clear" w:color="auto" w:fill="F2F7F4"/>
             <w:tcMar>
               <w:top w:w="70" w:type="dxa"/>
@@ -1817,7 +1817,7 @@
         </w:trPr>
         <w:tc>
           <w:tcPr>
-            <w:tcW w:w="2125" w:type="dxa"/>
+            <w:tcW w:w="2004" w:type="dxa"/>
             <w:shd w:val="clear" w:color="auto" w:fill="FFFFFF"/>
             <w:tcMar>
               <w:top w:w="70" w:type="dxa"/>
@@ -1845,7 +1845,7 @@
         </w:tc>
         <w:tc>
           <w:tcPr>
-            <w:tcW w:w="7235" w:type="dxa"/>
+            <w:tcW w:w="7356" w:type="dxa"/>
             <w:shd w:val="clear" w:color="auto" w:fill="FFFFFF"/>
             <w:tcMar>
               <w:top w:w="70" w:type="dxa"/>
@@ -1876,7 +1876,7 @@
         </w:trPr>
         <w:tc>
           <w:tcPr>
-            <w:tcW w:w="2125" w:type="dxa"/>
+            <w:tcW w:w="2004" w:type="dxa"/>
             <w:shd w:val="clear" w:color="auto" w:fill="F2F7F4"/>
             <w:tcMar>
               <w:top w:w="70" w:type="dxa"/>
@@ -1904,7 +1904,7 @@
         </w:tc>
         <w:tc>
           <w:tcPr>
-            <w:tcW w:w="7235" w:type="dxa"/>
+            <w:tcW w:w="7356" w:type="dxa"/>
             <w:shd w:val="clear" w:color="auto" w:fill="F2F7F4"/>
             <w:tcMar>
               <w:top w:w="70" w:type="dxa"/>
@@ -1925,6 +1925,65 @@
                 <w:szCs w:val="17"/>
               </w:rPr>
               <w:t xml:space="preserve">Modelos que mejoran con las lecturas reales y solo reemplazan al vigente si lo superan</w:t>
+            </w:r>
+          </w:p>
+        </w:tc>
+      </w:tr>
+      <w:tr>
+        <w:trPr>
+          <w:cantSplit/>
+        </w:trPr>
+        <w:tc>
+          <w:tcPr>
+            <w:tcW w:w="2004" w:type="dxa"/>
+            <w:shd w:val="clear" w:color="auto" w:fill="FFFFFF"/>
+            <w:tcMar>
+              <w:top w:w="70" w:type="dxa"/>
+              <w:left w:w="110" w:type="dxa"/>
+              <w:bottom w:w="70" w:type="dxa"/>
+              <w:right w:w="110" w:type="dxa"/>
+            </w:tcMar>
+            <w:vAlign w:val="center"/>
+          </w:tcPr>
+          <w:p>
+            <w:pPr>
+              <w:spacing w:before="0" w:after="0" w:line="252" w:lineRule="auto"/>
+            </w:pPr>
+            <w:r>
+              <w:rPr>
+                <w:b/>
+                <w:bCs/>
+                <w:color w:val="0A5A3C"/>
+                <w:sz w:val="17"/>
+                <w:szCs w:val="17"/>
+              </w:rPr>
+              <w:t xml:space="preserve">Aceleración C++ nativa</w:t>
+            </w:r>
+          </w:p>
+        </w:tc>
+        <w:tc>
+          <w:tcPr>
+            <w:tcW w:w="7356" w:type="dxa"/>
+            <w:shd w:val="clear" w:color="auto" w:fill="FFFFFF"/>
+            <w:tcMar>
+              <w:top w:w="70" w:type="dxa"/>
+              <w:left w:w="110" w:type="dxa"/>
+              <w:bottom w:w="70" w:type="dxa"/>
+              <w:right w:w="110" w:type="dxa"/>
+            </w:tcMar>
+            <w:vAlign w:val="center"/>
+          </w:tcPr>
+          <w:p>
+            <w:pPr>
+              <w:spacing w:before="0" w:after="0" w:line="252" w:lineRule="auto"/>
+            </w:pPr>
+            <w:r>
+              <w:rPr>
+                <w:color w:val="17261F"/>
+                <w:sz w:val="17"/>
+                <w:szCs w:val="17"/>
+              </w:rPr>
+              <w:t xml:space="preserve">Cómputo numérico directo en C++20 (Theil-Sen $O(M)$ lineal, Sugeno SIMD, calidad IQR y normalización) con C ABI y fallback</w:t>
             </w:r>
           </w:p>
         </w:tc>
@@ -2074,9 +2133,343 @@
     </w:p>
     <w:p>
       <w:pPr>
-        <w:spacing w:before="80" w:after="0" w:line="240" w:lineRule="auto"/>
+        <w:pStyle w:val="Heading2"/>
+      </w:pPr>
+      <w:bookmarkStart w:id="108" w:name="sec_108"/>
+      <w:r>
+        <w:rPr>
+          <w:b/>
+          <w:bCs/>
+          <w:color w:val="067A52"/>
+          <w:sz w:val="25"/>
+          <w:szCs w:val="25"/>
+        </w:rPr>
+        <w:t xml:space="preserve">Motor Nativo C++20 de Aceleración Numérica</w:t>
+      </w:r>
+      <w:bookmarkEnd w:id="108"/>
+    </w:p>
+    <w:p>
+      <w:pPr>
+        <w:spacing w:before="0" w:after="140" w:line="288" w:lineRule="auto"/>
+      </w:pPr>
+      <w:r>
+        <w:rPr>
+          <w:color w:val="17261F"/>
+          <w:sz w:val="20"/>
+          <w:szCs w:val="20"/>
+        </w:rPr>
+        <w:t xml:space="preserve">Para optimizar de forma extrema la latencia, el uso de memoria RAM y la escalabilidad concurrente bajo ráfagas intensivas de peticiones, los algoritmos numéricos de cálculo pesado han sido reescritos directamente en </w:t>
+      </w:r>
+      <w:r>
+        <w:rPr>
+          <w:b/>
+          <w:bCs/>
+          <w:color w:val="17261F"/>
+          <w:sz w:val="20"/>
+          <w:szCs w:val="20"/>
+        </w:rPr>
+        <w:t xml:space="preserve">C++20</w:t>
+      </w:r>
+      <w:r>
+        <w:rPr>
+          <w:color w:val="17261F"/>
+          <w:sz w:val="20"/>
+          <w:szCs w:val="20"/>
+        </w:rPr>
+        <w:t xml:space="preserve"> (</w:t>
+      </w:r>
+      <w:r>
+        <w:rPr>
+          <w:rFonts w:ascii="JetBrains Mono" w:hAnsi="JetBrains Mono" w:eastAsia="JetBrains Mono" w:cs="JetBrains Mono"/>
+          <w:color w:val="0A5A3C"/>
+          <w:sz w:val="18"/>
+          <w:szCs w:val="18"/>
+        </w:rPr>
+        <w:t xml:space="preserve">src/native/</w:t>
+      </w:r>
+      <w:r>
+        <w:rPr>
+          <w:color w:val="17261F"/>
+          <w:sz w:val="20"/>
+          <w:szCs w:val="20"/>
+        </w:rPr>
+        <w:t xml:space="preserve">):</w:t>
+      </w:r>
+    </w:p>
+    <w:p>
+      <w:pPr>
+        <w:numPr>
+          <w:ilvl w:val="0"/>
+          <w:numId w:val="1"/>
+        </w:numPr>
+        <w:ind w:left="360" w:hanging="260"/>
+        <w:spacing w:before="0" w:after="60" w:line="276" w:lineRule="auto"/>
+      </w:pPr>
+      <w:r>
+        <w:rPr>
+          <w:b/>
+          <w:bCs/>
+          <w:color w:val="17261F"/>
+          <w:sz w:val="20"/>
+          <w:szCs w:val="20"/>
+        </w:rPr>
+        <w:t xml:space="preserve">Estimador Theil-Sen $O(M)$ Lineal</w:t>
+      </w:r>
+      <w:r>
+        <w:rPr>
+          <w:color w:val="17261F"/>
+          <w:sz w:val="20"/>
+          <w:szCs w:val="20"/>
+        </w:rPr>
+        <w:t xml:space="preserve">: El cálculo tradicional de Theil-Sen requiere comparar todos los pares de lecturas temporales ($M = N(N-1)/2$). En Python/NumPy esto creaba matrices temporales masivas (</w:t>
+      </w:r>
+      <w:r>
+        <w:rPr>
+          <w:rFonts w:ascii="JetBrains Mono" w:hAnsi="JetBrains Mono" w:eastAsia="JetBrains Mono" w:cs="JetBrains Mono"/>
+          <w:color w:val="0A5A3C"/>
+          <w:sz w:val="18"/>
+          <w:szCs w:val="18"/>
+        </w:rPr>
+        <w:t xml:space="preserve">np.triu_indices</w:t>
+      </w:r>
+      <w:r>
+        <w:rPr>
+          <w:color w:val="17261F"/>
+          <w:sz w:val="20"/>
+          <w:szCs w:val="20"/>
+        </w:rPr>
+        <w:t xml:space="preserve">) y ordenaciones $O(M \log M)$. En C++20, se utiliza selección lineal en tiempo $O(M)$ con </w:t>
+      </w:r>
+      <w:r>
+        <w:rPr>
+          <w:rFonts w:ascii="JetBrains Mono" w:hAnsi="JetBrains Mono" w:eastAsia="JetBrains Mono" w:cs="JetBrains Mono"/>
+          <w:color w:val="0A5A3C"/>
+          <w:sz w:val="18"/>
+          <w:szCs w:val="18"/>
+        </w:rPr>
+        <w:t xml:space="preserve">std::nth_element</w:t>
+      </w:r>
+      <w:r>
+        <w:rPr>
+          <w:color w:val="17261F"/>
+          <w:sz w:val="20"/>
+          <w:szCs w:val="20"/>
+        </w:rPr>
+        <w:t xml:space="preserve">, logrando entre </w:t>
+      </w:r>
+      <w:r>
+        <w:rPr>
+          <w:b/>
+          <w:bCs/>
+          <w:color w:val="17261F"/>
+          <w:sz w:val="20"/>
+          <w:szCs w:val="20"/>
+        </w:rPr>
+        <w:t xml:space="preserve">3.6x y 50x de aceleración</w:t>
+      </w:r>
+      <w:r>
+        <w:rPr>
+          <w:color w:val="17261F"/>
+          <w:sz w:val="20"/>
+          <w:szCs w:val="20"/>
+        </w:rPr>
+        <w:t xml:space="preserve"> con huella de memoria nula y cero fragmentación del heap.</w:t>
+      </w:r>
+    </w:p>
+    <w:p>
+      <w:pPr>
+        <w:numPr>
+          <w:ilvl w:val="0"/>
+          <w:numId w:val="1"/>
+        </w:numPr>
+        <w:ind w:left="360" w:hanging="260"/>
+        <w:spacing w:before="0" w:after="60" w:line="276" w:lineRule="auto"/>
+      </w:pPr>
+      <w:r>
+        <w:rPr>
+          <w:b/>
+          <w:bCs/>
+          <w:color w:val="17261F"/>
+          <w:sz w:val="20"/>
+          <w:szCs w:val="20"/>
+        </w:rPr>
+        <w:t xml:space="preserve">Inferencia Difusa Sugeno Vectorizada</w:t>
+      </w:r>
+      <w:r>
+        <w:rPr>
+          <w:color w:val="17261F"/>
+          <w:sz w:val="20"/>
+          <w:szCs w:val="20"/>
+        </w:rPr>
+        <w:t xml:space="preserve">: Funciones de pertenencia trapezoidal branchless (sin saltos condicionales) y ponderación de reglas mediante constantes en tiempo de compilación (</w:t>
+      </w:r>
+      <w:r>
+        <w:rPr>
+          <w:rFonts w:ascii="JetBrains Mono" w:hAnsi="JetBrains Mono" w:eastAsia="JetBrains Mono" w:cs="JetBrains Mono"/>
+          <w:color w:val="0A5A3C"/>
+          <w:sz w:val="18"/>
+          <w:szCs w:val="18"/>
+        </w:rPr>
+        <w:t xml:space="preserve">constexpr</w:t>
+      </w:r>
+      <w:r>
+        <w:rPr>
+          <w:color w:val="17261F"/>
+          <w:sz w:val="20"/>
+          <w:szCs w:val="20"/>
+        </w:rPr>
+        <w:t xml:space="preserve">), con cálculo en tiempo sub-milisegundo.</w:t>
+      </w:r>
+    </w:p>
+    <w:p>
+      <w:pPr>
+        <w:numPr>
+          <w:ilvl w:val="0"/>
+          <w:numId w:val="1"/>
+        </w:numPr>
+        <w:ind w:left="360" w:hanging="260"/>
+        <w:spacing w:before="0" w:after="60" w:line="276" w:lineRule="auto"/>
+      </w:pPr>
+      <w:r>
+        <w:rPr>
+          <w:b/>
+          <w:bCs/>
+          <w:color w:val="17261F"/>
+          <w:sz w:val="20"/>
+          <w:szCs w:val="20"/>
+        </w:rPr>
+        <w:t xml:space="preserve">Control de Calidad de Datos (IQR)</w:t>
+      </w:r>
+      <w:r>
+        <w:rPr>
+          <w:color w:val="17261F"/>
+          <w:sz w:val="20"/>
+          <w:szCs w:val="20"/>
+        </w:rPr>
+        <w:t xml:space="preserve">: Evaluación de completitud, validación física contra límites de sensores y detección de espigas anómalas en lotes de hasta 20 000 lecturas mediante percentiles en tiempo lineal.</w:t>
+      </w:r>
+    </w:p>
+    <w:p>
+      <w:pPr>
+        <w:numPr>
+          <w:ilvl w:val="0"/>
+          <w:numId w:val="1"/>
+        </w:numPr>
+        <w:ind w:left="360" w:hanging="260"/>
+        <w:spacing w:before="0" w:after="60" w:line="276" w:lineRule="auto"/>
+      </w:pPr>
+      <w:r>
+        <w:rPr>
+          <w:b/>
+          <w:bCs/>
+          <w:color w:val="17261F"/>
+          <w:sz w:val="20"/>
+          <w:szCs w:val="20"/>
+        </w:rPr>
+        <w:t xml:space="preserve">Transformación de Características y Codificación Circular</w:t>
+      </w:r>
+      <w:r>
+        <w:rPr>
+          <w:color w:val="17261F"/>
+          <w:sz w:val="20"/>
+          <w:szCs w:val="20"/>
+        </w:rPr>
+        <w:t xml:space="preserve">: Normalización de tolerancia relativa y codificación trigonométrica continua de hora solar ($\sin$, $\cos$).</w:t>
+      </w:r>
+    </w:p>
+    <w:p>
+      <w:pPr>
+        <w:numPr>
+          <w:ilvl w:val="0"/>
+          <w:numId w:val="1"/>
+        </w:numPr>
+        <w:ind w:left="360" w:hanging="260"/>
+        <w:spacing w:before="0" w:after="60" w:line="276" w:lineRule="auto"/>
+      </w:pPr>
+      <w:r>
+        <w:rPr>
+          <w:b/>
+          <w:bCs/>
+          <w:color w:val="17261F"/>
+          <w:sz w:val="20"/>
+          <w:szCs w:val="20"/>
+        </w:rPr>
+        <w:t xml:space="preserve">C ABI y Fallback Transparente</w:t>
+      </w:r>
+      <w:r>
+        <w:rPr>
+          <w:color w:val="17261F"/>
+          <w:sz w:val="20"/>
+          <w:szCs w:val="20"/>
+        </w:rPr>
+        <w:t xml:space="preserve">: Enlazado mediante </w:t>
+      </w:r>
+      <w:r>
+        <w:rPr>
+          <w:rFonts w:ascii="JetBrains Mono" w:hAnsi="JetBrains Mono" w:eastAsia="JetBrains Mono" w:cs="JetBrains Mono"/>
+          <w:color w:val="0A5A3C"/>
+          <w:sz w:val="18"/>
+          <w:szCs w:val="18"/>
+        </w:rPr>
+        <w:t xml:space="preserve">ctypes</w:t>
+      </w:r>
+      <w:r>
+        <w:rPr>
+          <w:color w:val="17261F"/>
+          <w:sz w:val="20"/>
+          <w:szCs w:val="20"/>
+        </w:rPr>
+        <w:t xml:space="preserve"> (</w:t>
+      </w:r>
+      <w:r>
+        <w:rPr>
+          <w:rFonts w:ascii="JetBrains Mono" w:hAnsi="JetBrains Mono" w:eastAsia="JetBrains Mono" w:cs="JetBrains Mono"/>
+          <w:color w:val="0A5A3C"/>
+          <w:sz w:val="18"/>
+          <w:szCs w:val="18"/>
+        </w:rPr>
+        <w:t xml:space="preserve">app/engine/native_bridge.py</w:t>
+      </w:r>
+      <w:r>
+        <w:rPr>
+          <w:color w:val="17261F"/>
+          <w:sz w:val="20"/>
+          <w:szCs w:val="20"/>
+        </w:rPr>
+        <w:t xml:space="preserve">) con estructuras de memoria empaquetadas a 8 bytes (</w:t>
+      </w:r>
+      <w:r>
+        <w:rPr>
+          <w:rFonts w:ascii="JetBrains Mono" w:hAnsi="JetBrains Mono" w:eastAsia="JetBrains Mono" w:cs="JetBrains Mono"/>
+          <w:color w:val="0A5A3C"/>
+          <w:sz w:val="18"/>
+          <w:szCs w:val="18"/>
+        </w:rPr>
+        <w:t xml:space="preserve">#pragma pack(push, 8)</w:t>
+      </w:r>
+      <w:r>
+        <w:rPr>
+          <w:color w:val="17261F"/>
+          <w:sz w:val="20"/>
+          <w:szCs w:val="20"/>
+        </w:rPr>
+        <w:t xml:space="preserve">). Si la biblioteca no está compilada en el entorno, el sistema degrada de manera transparente a las rutinas estándar de Python garantizando 100% de disponibilidad.</w:t>
+      </w:r>
+    </w:p>
+    <w:p>
+      <w:pPr>
+        <w:spacing w:before="40" w:after="0" w:line="240" w:lineRule="auto"/>
         <w:rPr>
           <w:sz w:val="8"/>
+        </w:rPr>
+      </w:pPr>
+    </w:p>
+    <w:p>
+      <w:pPr>
+        <w:pageBreakBefore/>
+        <w:spacing w:before="0" w:after="0" w:line="20" w:lineRule="exact"/>
+        <w:rPr>
+          <w:sz w:val="2"/>
         </w:rPr>
       </w:pPr>
     </w:p>
@@ -2111,863 +2504,6 @@
             <w:tcW w:w="9360" w:type="dxa"/>
             <w:shd w:val="clear" w:color="auto" w:fill="0B3D2B"/>
             <w:tcMar>
-              <w:top w:w="60" w:type="dxa"/>
-              <w:left w:w="200" w:type="dxa"/>
-              <w:bottom w:w="60" w:type="dxa"/>
-              <w:right w:w="200" w:type="dxa"/>
-            </w:tcMar>
-            <w:vAlign w:val="top"/>
-          </w:tcPr>
-          <w:p>
-            <w:pPr>
-              <w:spacing w:before="0" w:after="0" w:line="240" w:lineRule="auto"/>
-            </w:pPr>
-            <w:r>
-              <w:rPr>
-                <w:b/>
-                <w:bCs/>
-                <w:color w:val="7FDBB0"/>
-                <w:spacing w:val="40"/>
-                <w:sz w:val="14"/>
-                <w:szCs w:val="14"/>
-              </w:rPr>
-              <w:t xml:space="preserve">MERMAID</w:t>
-            </w:r>
-          </w:p>
-        </w:tc>
-      </w:tr>
-    </w:tbl>
-    <w:tbl>
-      <w:tblPr>
-        <w:tblW w:w="9360" w:type="dxa"/>
-        <w:tblInd w:w="0" w:type="dxa"/>
-        <w:tblBorders>
-          <w:top w:val="nil"/>
-          <w:left w:val="nil"/>
-          <w:bottom w:val="nil"/>
-          <w:right w:val="nil"/>
-          <w:insideH w:val="nil"/>
-          <w:insideV w:val="nil"/>
-        </w:tblBorders>
-        <w:tblLayout w:type="fixed"/>
-        <w:tblCellMar>
-          <w:left w:w="0" w:type="dxa"/>
-          <w:right w:w="0" w:type="dxa"/>
-        </w:tblCellMar>
-        <w:tblLook w:val="0000" w:firstRow="0" w:lastRow="0" w:firstColumn="0" w:lastColumn="0" w:noHBand="1" w:noVBand="1"/>
-      </w:tblPr>
-      <w:tblGrid>
-        <w:gridCol w:w="9360"/>
-      </w:tblGrid>
-      <w:tr>
-        <w:trPr>
-          <w:cantSplit/>
-        </w:trPr>
-        <w:tc>
-          <w:tcPr>
-            <w:tcW w:w="9360" w:type="dxa"/>
-            <w:shd w:val="clear" w:color="auto" w:fill="F7FAF8"/>
-            <w:tcMar>
-              <w:top w:w="120" w:type="dxa"/>
-              <w:left w:w="200" w:type="dxa"/>
-              <w:bottom w:w="120" w:type="dxa"/>
-              <w:right w:w="200" w:type="dxa"/>
-            </w:tcMar>
-            <w:vAlign w:val="top"/>
-          </w:tcPr>
-          <w:p>
-            <w:pPr>
-              <w:spacing w:before="0" w:after="0" w:line="252" w:lineRule="auto"/>
-            </w:pPr>
-            <w:r>
-              <w:rPr>
-                <w:rFonts w:ascii="JetBrains Mono" w:hAnsi="JetBrains Mono" w:eastAsia="JetBrains Mono" w:cs="JetBrains Mono"/>
-                <w:color w:val="17261F"/>
-                <w:sz w:val="16"/>
-                <w:szCs w:val="16"/>
-              </w:rPr>
-              <w:t xml:space="preserve">%%{init: {"theme": "base", "fontFamily": "Segoe UI, Arial, sans-serif", "themeVariables": {"fontFamily": "Segoe UI, Arial, sans-serif", "fontSize": "15px", "primaryColor": "#DDF5EA", "primaryTextColor": "#17261F", "primaryBorderColor": "#067A52", "secondaryColor": "#E3F2FB", "secondaryTextColor": "#17261F", "secondaryBorderColor": "#1F6FA0", "tertiaryColor": "#F2F7F4", "tertiaryTextColor": "#17261F", "tertiaryBorderColor": "#D5E3DC", "lineColor": "#5B6B63", "textColor": "#17261F", "mainBkg": "#DDF5EA", "nodeBorder": "#067A52", "clusterBkg": "#F7FAF8", "clusterBorder": "#D5E3DC", "edgeLabelBackground": "#FFFFFF", "actorBkg": "#067A52", "actorBorder": "#0B3D2B", "actorTextColor": "#FFFFFF", "actorLineColor": "#5B6B63", "signalColor": "#17261F", "signalTextColor": "#17261F", "labelBoxBkgColor": "#0B3D2B", "labelBoxBorderColor": "#0B3D2B", "labelTextColor": "#FFFFFF", "loopTextColor": "#0B3D2B", "noteBkgColor": "#FDF4DD", "noteBorderColor": "#C98D12", "noteTextColor": "#17261F", "activationBkgColor": "#DDF5EA", "activationBorderColor": "#067A52", "attributeBackgroundColorOdd": "#FFFFFF", "attributeBackgroundColorEven": "#F2F7F4"}, "layout": "elk", "elk": {"nodePlacementStrategy": "BRANDES_KOEPF", "mergeEdges": false, "cycleBreakingStrategy": "GREEDY"}}}%%</w:t>
-            </w:r>
-          </w:p>
-          <w:p>
-            <w:pPr>
-              <w:spacing w:before="0" w:after="0" w:line="252" w:lineRule="auto"/>
-            </w:pPr>
-            <w:r>
-              <w:rPr>
-                <w:rFonts w:ascii="JetBrains Mono" w:hAnsi="JetBrains Mono" w:eastAsia="JetBrains Mono" w:cs="JetBrains Mono"/>
-                <w:color w:val="17261F"/>
-                <w:sz w:val="16"/>
-                <w:szCs w:val="16"/>
-              </w:rPr>
-              <w:t xml:space="preserve">flowchart LR</w:t>
-            </w:r>
-          </w:p>
-          <w:p>
-            <w:pPr>
-              <w:spacing w:before="0" w:after="0" w:line="252" w:lineRule="auto"/>
-            </w:pPr>
-            <w:r>
-              <w:rPr>
-                <w:rFonts w:ascii="JetBrains Mono" w:hAnsi="JetBrains Mono" w:eastAsia="JetBrains Mono" w:cs="JetBrains Mono"/>
-                <w:color w:val="17261F"/>
-                <w:sz w:val="16"/>
-                <w:szCs w:val="16"/>
-              </w:rPr>
-              <w:t xml:space="preserve">  api["SmartPot-API&lt;br/&gt;token de servicio"]</w:t>
-            </w:r>
-          </w:p>
-          <w:p>
-            <w:pPr>
-              <w:spacing w:before="0" w:after="0" w:line="252" w:lineRule="auto"/>
-            </w:pPr>
-            <w:r>
-              <w:rPr>
-                <w:rFonts w:ascii="JetBrains Mono" w:hAnsi="JetBrains Mono" w:eastAsia="JetBrains Mono" w:cs="JetBrains Mono"/>
-                <w:color w:val="17261F"/>
-                <w:sz w:val="16"/>
-                <w:szCs w:val="16"/>
-              </w:rPr>
-              <w:t xml:space="preserve">  subgraph svc["SmartPot-AI · FastAPI · Python 3.13"]</w:t>
-            </w:r>
-          </w:p>
-          <w:p>
-            <w:pPr>
-              <w:spacing w:before="0" w:after="0" w:line="252" w:lineRule="auto"/>
-            </w:pPr>
-            <w:r>
-              <w:rPr>
-                <w:rFonts w:ascii="JetBrains Mono" w:hAnsi="JetBrains Mono" w:eastAsia="JetBrains Mono" w:cs="JetBrains Mono"/>
-                <w:color w:val="17261F"/>
-                <w:sz w:val="16"/>
-                <w:szCs w:val="16"/>
-              </w:rPr>
-              <w:t xml:space="preserve">    direction TB</w:t>
-            </w:r>
-          </w:p>
-          <w:p>
-            <w:pPr>
-              <w:spacing w:before="0" w:after="0" w:line="252" w:lineRule="auto"/>
-            </w:pPr>
-            <w:r>
-              <w:rPr>
-                <w:rFonts w:ascii="JetBrains Mono" w:hAnsi="JetBrains Mono" w:eastAsia="JetBrains Mono" w:cs="JetBrains Mono"/>
-                <w:color w:val="17261F"/>
-                <w:sz w:val="16"/>
-                <w:szCs w:val="16"/>
-              </w:rPr>
-              <w:t xml:space="preserve">    core["core&lt;br/&gt;token en tiempo constante · configuración"]</w:t>
-            </w:r>
-          </w:p>
-          <w:p>
-            <w:pPr>
-              <w:spacing w:before="0" w:after="0" w:line="252" w:lineRule="auto"/>
-            </w:pPr>
-            <w:r>
-              <w:rPr>
-                <w:rFonts w:ascii="JetBrains Mono" w:hAnsi="JetBrains Mono" w:eastAsia="JetBrains Mono" w:cs="JetBrains Mono"/>
-                <w:color w:val="17261F"/>
-                <w:sz w:val="16"/>
-                <w:szCs w:val="16"/>
-              </w:rPr>
-              <w:t xml:space="preserve">    subgraph routers["routers"]</w:t>
-            </w:r>
-          </w:p>
-          <w:p>
-            <w:pPr>
-              <w:spacing w:before="0" w:after="0" w:line="252" w:lineRule="auto"/>
-            </w:pPr>
-            <w:r>
-              <w:rPr>
-                <w:rFonts w:ascii="JetBrains Mono" w:hAnsi="JetBrains Mono" w:eastAsia="JetBrains Mono" w:cs="JetBrains Mono"/>
-                <w:color w:val="17261F"/>
-                <w:sz w:val="16"/>
-                <w:szCs w:val="16"/>
-              </w:rPr>
-              <w:t xml:space="preserve">      direction TB</w:t>
-            </w:r>
-          </w:p>
-          <w:p>
-            <w:pPr>
-              <w:spacing w:before="0" w:after="0" w:line="252" w:lineRule="auto"/>
-            </w:pPr>
-            <w:r>
-              <w:rPr>
-                <w:rFonts w:ascii="JetBrains Mono" w:hAnsi="JetBrains Mono" w:eastAsia="JetBrains Mono" w:cs="JetBrains Mono"/>
-                <w:color w:val="17261F"/>
-                <w:sz w:val="16"/>
-                <w:szCs w:val="16"/>
-              </w:rPr>
-              <w:t xml:space="preserve">      health["health&lt;br/&gt;GET /health"]</w:t>
-            </w:r>
-          </w:p>
-          <w:p>
-            <w:pPr>
-              <w:spacing w:before="0" w:after="0" w:line="252" w:lineRule="auto"/>
-            </w:pPr>
-            <w:r>
-              <w:rPr>
-                <w:rFonts w:ascii="JetBrains Mono" w:hAnsi="JetBrains Mono" w:eastAsia="JetBrains Mono" w:cs="JetBrains Mono"/>
-                <w:color w:val="17261F"/>
-                <w:sz w:val="16"/>
-                <w:szCs w:val="16"/>
-              </w:rPr>
-              <w:t xml:space="preserve">      insights["insights&lt;br/&gt;POST /v1/insights · POST /v1/fleet&lt;br/&gt;GET /v1/crop-profiles · GET /v1/models"]</w:t>
-            </w:r>
-          </w:p>
-          <w:p>
-            <w:pPr>
-              <w:spacing w:before="0" w:after="0" w:line="252" w:lineRule="auto"/>
-            </w:pPr>
-            <w:r>
-              <w:rPr>
-                <w:rFonts w:ascii="JetBrains Mono" w:hAnsi="JetBrains Mono" w:eastAsia="JetBrains Mono" w:cs="JetBrains Mono"/>
-                <w:color w:val="17261F"/>
-                <w:sz w:val="16"/>
-                <w:szCs w:val="16"/>
-              </w:rPr>
-              <w:t xml:space="preserve">      learnr["learning&lt;br/&gt;POST readings · GET status&lt;br/&gt;POST train · DELETE crops/{id}"]</w:t>
-            </w:r>
-          </w:p>
-          <w:p>
-            <w:pPr>
-              <w:spacing w:before="0" w:after="0" w:line="252" w:lineRule="auto"/>
-            </w:pPr>
-            <w:r>
-              <w:rPr>
-                <w:rFonts w:ascii="JetBrains Mono" w:hAnsi="JetBrains Mono" w:eastAsia="JetBrains Mono" w:cs="JetBrains Mono"/>
-                <w:color w:val="17261F"/>
-                <w:sz w:val="16"/>
-                <w:szCs w:val="16"/>
-              </w:rPr>
-              <w:t xml:space="preserve">    end</w:t>
-            </w:r>
-          </w:p>
-          <w:p>
-            <w:pPr>
-              <w:spacing w:before="0" w:after="0" w:line="252" w:lineRule="auto"/>
-            </w:pPr>
-            <w:r>
-              <w:rPr>
-                <w:rFonts w:ascii="JetBrains Mono" w:hAnsi="JetBrains Mono" w:eastAsia="JetBrains Mono" w:cs="JetBrains Mono"/>
-                <w:color w:val="17261F"/>
-                <w:sz w:val="16"/>
-                <w:szCs w:val="16"/>
-              </w:rPr>
-              <w:t xml:space="preserve">    knowledge["knowledge/profiles&lt;br/&gt;seis especies · tolerancias"]</w:t>
-            </w:r>
-          </w:p>
-          <w:p>
-            <w:pPr>
-              <w:spacing w:before="0" w:after="0" w:line="252" w:lineRule="auto"/>
-            </w:pPr>
-            <w:r>
-              <w:rPr>
-                <w:rFonts w:ascii="JetBrains Mono" w:hAnsi="JetBrains Mono" w:eastAsia="JetBrains Mono" w:cs="JetBrains Mono"/>
-                <w:color w:val="17261F"/>
-                <w:sz w:val="16"/>
-                <w:szCs w:val="16"/>
-              </w:rPr>
-              <w:t xml:space="preserve">    subgraph engine["engine"]</w:t>
-            </w:r>
-          </w:p>
-          <w:p>
-            <w:pPr>
-              <w:spacing w:before="0" w:after="0" w:line="252" w:lineRule="auto"/>
-            </w:pPr>
-            <w:r>
-              <w:rPr>
-                <w:rFonts w:ascii="JetBrains Mono" w:hAnsi="JetBrains Mono" w:eastAsia="JetBrains Mono" w:cs="JetBrains Mono"/>
-                <w:color w:val="17261F"/>
-                <w:sz w:val="16"/>
-                <w:szCs w:val="16"/>
-              </w:rPr>
-              <w:t xml:space="preserve">      direction TB</w:t>
-            </w:r>
-          </w:p>
-          <w:p>
-            <w:pPr>
-              <w:spacing w:before="0" w:after="0" w:line="252" w:lineRule="auto"/>
-            </w:pPr>
-            <w:r>
-              <w:rPr>
-                <w:rFonts w:ascii="JetBrains Mono" w:hAnsi="JetBrains Mono" w:eastAsia="JetBrains Mono" w:cs="JetBrains Mono"/>
-                <w:color w:val="17261F"/>
-                <w:sz w:val="16"/>
-                <w:szCs w:val="16"/>
-              </w:rPr>
-              <w:t xml:space="preserve">      diag["diagnosis"]</w:t>
-            </w:r>
-          </w:p>
-          <w:p>
-            <w:pPr>
-              <w:spacing w:before="0" w:after="0" w:line="252" w:lineRule="auto"/>
-            </w:pPr>
-            <w:r>
-              <w:rPr>
-                <w:rFonts w:ascii="JetBrains Mono" w:hAnsi="JetBrains Mono" w:eastAsia="JetBrains Mono" w:cs="JetBrains Mono"/>
-                <w:color w:val="17261F"/>
-                <w:sz w:val="16"/>
-                <w:szCs w:val="16"/>
-              </w:rPr>
-              <w:t xml:space="preserve">      fc["forecast · Theil-Sen"]</w:t>
-            </w:r>
-          </w:p>
-          <w:p>
-            <w:pPr>
-              <w:spacing w:before="0" w:after="0" w:line="252" w:lineRule="auto"/>
-            </w:pPr>
-            <w:r>
-              <w:rPr>
-                <w:rFonts w:ascii="JetBrains Mono" w:hAnsi="JetBrains Mono" w:eastAsia="JetBrains Mono" w:cs="JetBrains Mono"/>
-                <w:color w:val="17261F"/>
-                <w:sz w:val="16"/>
-                <w:szCs w:val="16"/>
-              </w:rPr>
-              <w:t xml:space="preserve">      models["models · base sintética"]</w:t>
-            </w:r>
-          </w:p>
-          <w:p>
-            <w:pPr>
-              <w:spacing w:before="0" w:after="0" w:line="252" w:lineRule="auto"/>
-            </w:pPr>
-            <w:r>
-              <w:rPr>
-                <w:rFonts w:ascii="JetBrains Mono" w:hAnsi="JetBrains Mono" w:eastAsia="JetBrains Mono" w:cs="JetBrains Mono"/>
-                <w:color w:val="17261F"/>
-                <w:sz w:val="16"/>
-                <w:szCs w:val="16"/>
-              </w:rPr>
-              <w:t xml:space="preserve">      expert["expert_system · rules"]</w:t>
-            </w:r>
-          </w:p>
-          <w:p>
-            <w:pPr>
-              <w:spacing w:before="0" w:after="0" w:line="252" w:lineRule="auto"/>
-            </w:pPr>
-            <w:r>
-              <w:rPr>
-                <w:rFonts w:ascii="JetBrains Mono" w:hAnsi="JetBrains Mono" w:eastAsia="JetBrains Mono" w:cs="JetBrains Mono"/>
-                <w:color w:val="17261F"/>
-                <w:sz w:val="16"/>
-                <w:szCs w:val="16"/>
-              </w:rPr>
-              <w:t xml:space="preserve">      fuzzy["fuzzy · Sugeno"]</w:t>
-            </w:r>
-          </w:p>
-          <w:p>
-            <w:pPr>
-              <w:spacing w:before="0" w:after="0" w:line="252" w:lineRule="auto"/>
-            </w:pPr>
-            <w:r>
-              <w:rPr>
-                <w:rFonts w:ascii="JetBrains Mono" w:hAnsi="JetBrains Mono" w:eastAsia="JetBrains Mono" w:cs="JetBrains Mono"/>
-                <w:color w:val="17261F"/>
-                <w:sz w:val="16"/>
-                <w:szCs w:val="16"/>
-              </w:rPr>
-              <w:t xml:space="preserve">      agent["agent"]</w:t>
-            </w:r>
-          </w:p>
-          <w:p>
-            <w:pPr>
-              <w:spacing w:before="0" w:after="0" w:line="252" w:lineRule="auto"/>
-            </w:pPr>
-            <w:r>
-              <w:rPr>
-                <w:rFonts w:ascii="JetBrains Mono" w:hAnsi="JetBrains Mono" w:eastAsia="JetBrains Mono" w:cs="JetBrains Mono"/>
-                <w:color w:val="17261F"/>
-                <w:sz w:val="16"/>
-                <w:szCs w:val="16"/>
-              </w:rPr>
-              <w:t xml:space="preserve">      fleet["fleet · K-Means"]</w:t>
-            </w:r>
-          </w:p>
-          <w:p>
-            <w:pPr>
-              <w:spacing w:before="0" w:after="0" w:line="252" w:lineRule="auto"/>
-            </w:pPr>
-            <w:r>
-              <w:rPr>
-                <w:rFonts w:ascii="JetBrains Mono" w:hAnsi="JetBrains Mono" w:eastAsia="JetBrains Mono" w:cs="JetBrains Mono"/>
-                <w:color w:val="17261F"/>
-                <w:sz w:val="16"/>
-                <w:szCs w:val="16"/>
-              </w:rPr>
-              <w:t xml:space="preserve">    end</w:t>
-            </w:r>
-          </w:p>
-          <w:p>
-            <w:pPr>
-              <w:spacing w:before="0" w:after="0" w:line="252" w:lineRule="auto"/>
-            </w:pPr>
-            <w:r>
-              <w:rPr>
-                <w:rFonts w:ascii="JetBrains Mono" w:hAnsi="JetBrains Mono" w:eastAsia="JetBrains Mono" w:cs="JetBrains Mono"/>
-                <w:color w:val="17261F"/>
-                <w:sz w:val="16"/>
-                <w:szCs w:val="16"/>
-              </w:rPr>
-              <w:t xml:space="preserve">    subgraph learning["learning"]</w:t>
-            </w:r>
-          </w:p>
-          <w:p>
-            <w:pPr>
-              <w:spacing w:before="0" w:after="0" w:line="252" w:lineRule="auto"/>
-            </w:pPr>
-            <w:r>
-              <w:rPr>
-                <w:rFonts w:ascii="JetBrains Mono" w:hAnsi="JetBrains Mono" w:eastAsia="JetBrains Mono" w:cs="JetBrains Mono"/>
-                <w:color w:val="17261F"/>
-                <w:sz w:val="16"/>
-                <w:szCs w:val="16"/>
-              </w:rPr>
-              <w:t xml:space="preserve">      direction TB</w:t>
-            </w:r>
-          </w:p>
-          <w:p>
-            <w:pPr>
-              <w:spacing w:before="0" w:after="0" w:line="252" w:lineRule="auto"/>
-            </w:pPr>
-            <w:r>
-              <w:rPr>
-                <w:rFonts w:ascii="JetBrains Mono" w:hAnsi="JetBrains Mono" w:eastAsia="JetBrains Mono" w:cs="JetBrains Mono"/>
-                <w:color w:val="17261F"/>
-                <w:sz w:val="16"/>
-                <w:szCs w:val="16"/>
-              </w:rPr>
-              <w:t xml:space="preserve">      store["store · SQLite"]</w:t>
-            </w:r>
-          </w:p>
-          <w:p>
-            <w:pPr>
-              <w:spacing w:before="0" w:after="0" w:line="252" w:lineRule="auto"/>
-            </w:pPr>
-            <w:r>
-              <w:rPr>
-                <w:rFonts w:ascii="JetBrains Mono" w:hAnsi="JetBrains Mono" w:eastAsia="JetBrains Mono" w:cs="JetBrains Mono"/>
-                <w:color w:val="17261F"/>
-                <w:sz w:val="16"/>
-                <w:szCs w:val="16"/>
-              </w:rPr>
-              <w:t xml:space="preserve">      quality["quality · IQR"]</w:t>
-            </w:r>
-          </w:p>
-          <w:p>
-            <w:pPr>
-              <w:spacing w:before="0" w:after="0" w:line="252" w:lineRule="auto"/>
-            </w:pPr>
-            <w:r>
-              <w:rPr>
-                <w:rFonts w:ascii="JetBrains Mono" w:hAnsi="JetBrains Mono" w:eastAsia="JetBrains Mono" w:cs="JetBrains Mono"/>
-                <w:color w:val="17261F"/>
-                <w:sz w:val="16"/>
-                <w:szCs w:val="16"/>
-              </w:rPr>
-              <w:t xml:space="preserve">      features["features · etiquetas"]</w:t>
-            </w:r>
-          </w:p>
-          <w:p>
-            <w:pPr>
-              <w:spacing w:before="0" w:after="0" w:line="252" w:lineRule="auto"/>
-            </w:pPr>
-            <w:r>
-              <w:rPr>
-                <w:rFonts w:ascii="JetBrains Mono" w:hAnsi="JetBrains Mono" w:eastAsia="JetBrains Mono" w:cs="JetBrains Mono"/>
-                <w:color w:val="17261F"/>
-                <w:sz w:val="16"/>
-                <w:szCs w:val="16"/>
-              </w:rPr>
-              <w:t xml:space="preserve">      trainer["trainer · proceso aparte"]</w:t>
-            </w:r>
-          </w:p>
-          <w:p>
-            <w:pPr>
-              <w:spacing w:before="0" w:after="0" w:line="252" w:lineRule="auto"/>
-            </w:pPr>
-            <w:r>
-              <w:rPr>
-                <w:rFonts w:ascii="JetBrains Mono" w:hAnsi="JetBrains Mono" w:eastAsia="JetBrains Mono" w:cs="JetBrains Mono"/>
-                <w:color w:val="17261F"/>
-                <w:sz w:val="16"/>
-                <w:szCs w:val="16"/>
-              </w:rPr>
-              <w:t xml:space="preserve">      lservice["service · predicciones"]</w:t>
-            </w:r>
-          </w:p>
-          <w:p>
-            <w:pPr>
-              <w:spacing w:before="0" w:after="0" w:line="252" w:lineRule="auto"/>
-            </w:pPr>
-            <w:r>
-              <w:rPr>
-                <w:rFonts w:ascii="JetBrains Mono" w:hAnsi="JetBrains Mono" w:eastAsia="JetBrains Mono" w:cs="JetBrains Mono"/>
-                <w:color w:val="17261F"/>
-                <w:sz w:val="16"/>
-                <w:szCs w:val="16"/>
-              </w:rPr>
-              <w:t xml:space="preserve">    end</w:t>
-            </w:r>
-          </w:p>
-          <w:p>
-            <w:pPr>
-              <w:spacing w:before="0" w:after="0" w:line="252" w:lineRule="auto"/>
-            </w:pPr>
-            <w:r>
-              <w:rPr>
-                <w:rFonts w:ascii="JetBrains Mono" w:hAnsi="JetBrains Mono" w:eastAsia="JetBrains Mono" w:cs="JetBrains Mono"/>
-                <w:color w:val="17261F"/>
-                <w:sz w:val="16"/>
-                <w:szCs w:val="16"/>
-              </w:rPr>
-              <w:t xml:space="preserve">  end</w:t>
-            </w:r>
-          </w:p>
-          <w:p>
-            <w:pPr>
-              <w:spacing w:before="0" w:after="0" w:line="252" w:lineRule="auto"/>
-            </w:pPr>
-            <w:r>
-              <w:rPr>
-                <w:rFonts w:ascii="JetBrains Mono" w:hAnsi="JetBrains Mono" w:eastAsia="JetBrains Mono" w:cs="JetBrains Mono"/>
-                <w:color w:val="17261F"/>
-                <w:sz w:val="16"/>
-                <w:szCs w:val="16"/>
-              </w:rPr>
-              <w:t xml:space="preserve">  data[("Volumen /data&lt;br/&gt;learning.db · models/*.joblib")]</w:t>
-            </w:r>
-          </w:p>
-          <w:p>
-            <w:pPr>
-              <w:spacing w:before="0" w:after="0" w:line="252" w:lineRule="auto"/>
-            </w:pPr>
-            <w:r>
-              <w:rPr>
-                <w:rFonts w:ascii="JetBrains Mono" w:hAnsi="JetBrains Mono" w:eastAsia="JetBrains Mono" w:cs="JetBrains Mono"/>
-                <w:color w:val="17261F"/>
-                <w:sz w:val="16"/>
-                <w:szCs w:val="16"/>
-              </w:rPr>
-              <w:t xml:space="preserve">  api --&gt; core --&gt; routers</w:t>
-            </w:r>
-          </w:p>
-          <w:p>
-            <w:pPr>
-              <w:spacing w:before="0" w:after="0" w:line="252" w:lineRule="auto"/>
-            </w:pPr>
-            <w:r>
-              <w:rPr>
-                <w:rFonts w:ascii="JetBrains Mono" w:hAnsi="JetBrains Mono" w:eastAsia="JetBrains Mono" w:cs="JetBrains Mono"/>
-                <w:color w:val="17261F"/>
-                <w:sz w:val="16"/>
-                <w:szCs w:val="16"/>
-              </w:rPr>
-              <w:t xml:space="preserve">  insights --&gt; diag --&gt; fc --&gt; models --&gt; expert --&gt; fuzzy --&gt; agent</w:t>
-            </w:r>
-          </w:p>
-          <w:p>
-            <w:pPr>
-              <w:spacing w:before="0" w:after="0" w:line="252" w:lineRule="auto"/>
-            </w:pPr>
-            <w:r>
-              <w:rPr>
-                <w:rFonts w:ascii="JetBrains Mono" w:hAnsi="JetBrains Mono" w:eastAsia="JetBrains Mono" w:cs="JetBrains Mono"/>
-                <w:color w:val="17261F"/>
-                <w:sz w:val="16"/>
-                <w:szCs w:val="16"/>
-              </w:rPr>
-              <w:t xml:space="preserve">  insights --&gt; fleet</w:t>
-            </w:r>
-          </w:p>
-          <w:p>
-            <w:pPr>
-              <w:spacing w:before="0" w:after="0" w:line="252" w:lineRule="auto"/>
-            </w:pPr>
-            <w:r>
-              <w:rPr>
-                <w:rFonts w:ascii="JetBrains Mono" w:hAnsi="JetBrains Mono" w:eastAsia="JetBrains Mono" w:cs="JetBrains Mono"/>
-                <w:color w:val="17261F"/>
-                <w:sz w:val="16"/>
-                <w:szCs w:val="16"/>
-              </w:rPr>
-              <w:t xml:space="preserve">  knowledge --&gt; diag &amp; fuzzy &amp; agent</w:t>
-            </w:r>
-          </w:p>
-          <w:p>
-            <w:pPr>
-              <w:spacing w:before="0" w:after="0" w:line="252" w:lineRule="auto"/>
-            </w:pPr>
-            <w:r>
-              <w:rPr>
-                <w:rFonts w:ascii="JetBrains Mono" w:hAnsi="JetBrains Mono" w:eastAsia="JetBrains Mono" w:cs="JetBrains Mono"/>
-                <w:color w:val="17261F"/>
-                <w:sz w:val="16"/>
-                <w:szCs w:val="16"/>
-              </w:rPr>
-              <w:t xml:space="preserve">  learnr --&gt; store --&gt; quality --&gt; features --&gt; trainer --&gt; lservice</w:t>
-            </w:r>
-          </w:p>
-          <w:p>
-            <w:pPr>
-              <w:spacing w:before="0" w:after="0" w:line="252" w:lineRule="auto"/>
-            </w:pPr>
-            <w:r>
-              <w:rPr>
-                <w:rFonts w:ascii="JetBrains Mono" w:hAnsi="JetBrains Mono" w:eastAsia="JetBrains Mono" w:cs="JetBrains Mono"/>
-                <w:color w:val="17261F"/>
-                <w:sz w:val="16"/>
-                <w:szCs w:val="16"/>
-              </w:rPr>
-              <w:t xml:space="preserve">  lservice --&gt; expert &amp; agent</w:t>
-            </w:r>
-          </w:p>
-          <w:p>
-            <w:pPr>
-              <w:spacing w:before="0" w:after="0" w:line="252" w:lineRule="auto"/>
-            </w:pPr>
-            <w:r>
-              <w:rPr>
-                <w:rFonts w:ascii="JetBrains Mono" w:hAnsi="JetBrains Mono" w:eastAsia="JetBrains Mono" w:cs="JetBrains Mono"/>
-                <w:color w:val="17261F"/>
-                <w:sz w:val="16"/>
-                <w:szCs w:val="16"/>
-              </w:rPr>
-              <w:t xml:space="preserve">  store &amp; trainer --&gt; data</w:t>
-            </w:r>
-          </w:p>
-          <w:p>
-            <w:pPr>
-              <w:spacing w:before="0" w:after="0" w:line="252" w:lineRule="auto"/>
-            </w:pPr>
-            <w:r>
-              <w:rPr>
-                <w:rFonts w:ascii="JetBrains Mono" w:hAnsi="JetBrains Mono" w:eastAsia="JetBrains Mono" w:cs="JetBrains Mono"/>
-                <w:color w:val="17261F"/>
-                <w:sz w:val="16"/>
-                <w:szCs w:val="16"/>
-              </w:rPr>
-              <w:t xml:space="preserve">  classDef leaf fill:#DDF5EA,stroke:#067A52,color:#17261F</w:t>
-            </w:r>
-          </w:p>
-          <w:p>
-            <w:pPr>
-              <w:spacing w:before="0" w:after="0" w:line="252" w:lineRule="auto"/>
-            </w:pPr>
-            <w:r>
-              <w:rPr>
-                <w:rFonts w:ascii="JetBrains Mono" w:hAnsi="JetBrains Mono" w:eastAsia="JetBrains Mono" w:cs="JetBrains Mono"/>
-                <w:color w:val="17261F"/>
-                <w:sz w:val="16"/>
-                <w:szCs w:val="16"/>
-              </w:rPr>
-              <w:t xml:space="preserve">  classDef water fill:#E3F2FB,stroke:#1F6FA0,color:#17261F</w:t>
-            </w:r>
-          </w:p>
-          <w:p>
-            <w:pPr>
-              <w:spacing w:before="0" w:after="0" w:line="252" w:lineRule="auto"/>
-            </w:pPr>
-            <w:r>
-              <w:rPr>
-                <w:rFonts w:ascii="JetBrains Mono" w:hAnsi="JetBrains Mono" w:eastAsia="JetBrains Mono" w:cs="JetBrains Mono"/>
-                <w:color w:val="17261F"/>
-                <w:sz w:val="16"/>
-                <w:szCs w:val="16"/>
-              </w:rPr>
-              <w:t xml:space="preserve">  classDef sun fill:#FDF4DD,stroke:#C98D12,color:#17261F</w:t>
-            </w:r>
-          </w:p>
-          <w:p>
-            <w:pPr>
-              <w:spacing w:before="0" w:after="0" w:line="252" w:lineRule="auto"/>
-            </w:pPr>
-            <w:r>
-              <w:rPr>
-                <w:rFonts w:ascii="JetBrains Mono" w:hAnsi="JetBrains Mono" w:eastAsia="JetBrains Mono" w:cs="JetBrains Mono"/>
-                <w:color w:val="17261F"/>
-                <w:sz w:val="16"/>
-                <w:szCs w:val="16"/>
-              </w:rPr>
-              <w:t xml:space="preserve">  classDef clay fill:#FBE9E1,stroke:#B85A38,color:#17261F</w:t>
-            </w:r>
-          </w:p>
-          <w:p>
-            <w:pPr>
-              <w:spacing w:before="0" w:after="0" w:line="252" w:lineRule="auto"/>
-            </w:pPr>
-            <w:r>
-              <w:rPr>
-                <w:rFonts w:ascii="JetBrains Mono" w:hAnsi="JetBrains Mono" w:eastAsia="JetBrains Mono" w:cs="JetBrains Mono"/>
-                <w:color w:val="17261F"/>
-                <w:sz w:val="16"/>
-                <w:szCs w:val="16"/>
-              </w:rPr>
-              <w:t xml:space="preserve">  classDef core fill:#067A52,stroke:#0B3D2B,color:#FFFFFF</w:t>
-            </w:r>
-          </w:p>
-          <w:p>
-            <w:pPr>
-              <w:spacing w:before="0" w:after="0" w:line="252" w:lineRule="auto"/>
-            </w:pPr>
-            <w:r>
-              <w:rPr>
-                <w:rFonts w:ascii="JetBrains Mono" w:hAnsi="JetBrains Mono" w:eastAsia="JetBrains Mono" w:cs="JetBrains Mono"/>
-                <w:color w:val="17261F"/>
-                <w:sz w:val="16"/>
-                <w:szCs w:val="16"/>
-              </w:rPr>
-              <w:t xml:space="preserve">  classDef deep fill:#0B3D2B,stroke:#06281C,color:#FFFFFF</w:t>
-            </w:r>
-          </w:p>
-          <w:p>
-            <w:pPr>
-              <w:spacing w:before="0" w:after="0" w:line="252" w:lineRule="auto"/>
-            </w:pPr>
-            <w:r>
-              <w:rPr>
-                <w:rFonts w:ascii="JetBrains Mono" w:hAnsi="JetBrains Mono" w:eastAsia="JetBrains Mono" w:cs="JetBrains Mono"/>
-                <w:color w:val="17261F"/>
-                <w:sz w:val="16"/>
-                <w:szCs w:val="16"/>
-              </w:rPr>
-              <w:t xml:space="preserve">  classDef muted fill:#F2F7F4,stroke:#5B6B63,color:#17261F</w:t>
-            </w:r>
-          </w:p>
-          <w:p>
-            <w:pPr>
-              <w:spacing w:before="0" w:after="0" w:line="252" w:lineRule="auto"/>
-            </w:pPr>
-            <w:r>
-              <w:rPr>
-                <w:rFonts w:ascii="JetBrains Mono" w:hAnsi="JetBrains Mono" w:eastAsia="JetBrains Mono" w:cs="JetBrains Mono"/>
-                <w:color w:val="17261F"/>
-                <w:sz w:val="16"/>
-                <w:szCs w:val="16"/>
-              </w:rPr>
-              <w:t xml:space="preserve">  class api water</w:t>
-            </w:r>
-          </w:p>
-          <w:p>
-            <w:pPr>
-              <w:spacing w:before="0" w:after="0" w:line="252" w:lineRule="auto"/>
-            </w:pPr>
-            <w:r>
-              <w:rPr>
-                <w:rFonts w:ascii="JetBrains Mono" w:hAnsi="JetBrains Mono" w:eastAsia="JetBrains Mono" w:cs="JetBrains Mono"/>
-                <w:color w:val="17261F"/>
-                <w:sz w:val="16"/>
-                <w:szCs w:val="16"/>
-              </w:rPr>
-              <w:t xml:space="preserve">  class core,health,insights,learnr sun</w:t>
-            </w:r>
-          </w:p>
-          <w:p>
-            <w:pPr>
-              <w:spacing w:before="0" w:after="0" w:line="252" w:lineRule="auto"/>
-            </w:pPr>
-            <w:r>
-              <w:rPr>
-                <w:rFonts w:ascii="JetBrains Mono" w:hAnsi="JetBrains Mono" w:eastAsia="JetBrains Mono" w:cs="JetBrains Mono"/>
-                <w:color w:val="17261F"/>
-                <w:sz w:val="16"/>
-                <w:szCs w:val="16"/>
-              </w:rPr>
-              <w:t xml:space="preserve">  class knowledge muted</w:t>
-            </w:r>
-          </w:p>
-          <w:p>
-            <w:pPr>
-              <w:spacing w:before="0" w:after="0" w:line="252" w:lineRule="auto"/>
-            </w:pPr>
-            <w:r>
-              <w:rPr>
-                <w:rFonts w:ascii="JetBrains Mono" w:hAnsi="JetBrains Mono" w:eastAsia="JetBrains Mono" w:cs="JetBrains Mono"/>
-                <w:color w:val="17261F"/>
-                <w:sz w:val="16"/>
-                <w:szCs w:val="16"/>
-              </w:rPr>
-              <w:t xml:space="preserve">  class diag,fc,models,expert,fuzzy,agent,fleet leaf</w:t>
-            </w:r>
-          </w:p>
-          <w:p>
-            <w:pPr>
-              <w:spacing w:before="0" w:after="0" w:line="252" w:lineRule="auto"/>
-            </w:pPr>
-            <w:r>
-              <w:rPr>
-                <w:rFonts w:ascii="JetBrains Mono" w:hAnsi="JetBrains Mono" w:eastAsia="JetBrains Mono" w:cs="JetBrains Mono"/>
-                <w:color w:val="17261F"/>
-                <w:sz w:val="16"/>
-                <w:szCs w:val="16"/>
-              </w:rPr>
-              <w:t xml:space="preserve">  class store,quality,features,trainer,lservice core</w:t>
-            </w:r>
-          </w:p>
-          <w:p>
-            <w:pPr>
-              <w:spacing w:before="0" w:after="0" w:line="252" w:lineRule="auto"/>
-            </w:pPr>
-            <w:r>
-              <w:rPr>
-                <w:rFonts w:ascii="JetBrains Mono" w:hAnsi="JetBrains Mono" w:eastAsia="JetBrains Mono" w:cs="JetBrains Mono"/>
-                <w:color w:val="17261F"/>
-                <w:sz w:val="16"/>
-                <w:szCs w:val="16"/>
-              </w:rPr>
-              <w:t xml:space="preserve">  class data muted</w:t>
-            </w:r>
-          </w:p>
-        </w:tc>
-      </w:tr>
-    </w:tbl>
-    <w:p>
-      <w:pPr>
-        <w:spacing w:before="160" w:after="0" w:line="240" w:lineRule="auto"/>
-        <w:rPr>
-          <w:sz w:val="8"/>
-        </w:rPr>
-      </w:pPr>
-    </w:p>
-    <w:p>
-      <w:pPr>
-        <w:pageBreakBefore/>
-        <w:spacing w:before="0" w:after="0" w:line="20" w:lineRule="exact"/>
-        <w:rPr>
-          <w:sz w:val="2"/>
-        </w:rPr>
-      </w:pPr>
-    </w:p>
-    <w:tbl>
-      <w:tblPr>
-        <w:tblW w:w="9360" w:type="dxa"/>
-        <w:tblInd w:w="0" w:type="dxa"/>
-        <w:tblBorders>
-          <w:top w:val="nil"/>
-          <w:left w:val="nil"/>
-          <w:bottom w:val="nil"/>
-          <w:right w:val="nil"/>
-          <w:insideH w:val="nil"/>
-          <w:insideV w:val="nil"/>
-        </w:tblBorders>
-        <w:tblLayout w:type="fixed"/>
-        <w:tblCellMar>
-          <w:left w:w="0" w:type="dxa"/>
-          <w:right w:w="0" w:type="dxa"/>
-        </w:tblCellMar>
-        <w:tblLook w:val="0000" w:firstRow="0" w:lastRow="0" w:firstColumn="0" w:lastColumn="0" w:noHBand="1" w:noVBand="1"/>
-      </w:tblPr>
-      <w:tblGrid>
-        <w:gridCol w:w="9360"/>
-      </w:tblGrid>
-      <w:tr>
-        <w:trPr>
-          <w:cantSplit/>
-        </w:trPr>
-        <w:tc>
-          <w:tcPr>
-            <w:tcW w:w="9360" w:type="dxa"/>
-            <w:shd w:val="clear" w:color="auto" w:fill="0B3D2B"/>
-            <w:tcMar>
               <w:top w:w="420" w:type="dxa"/>
               <w:left w:w="480" w:type="dxa"/>
               <w:bottom w:w="420" w:type="dxa"/>
@@ -3040,7 +2576,7 @@
       <w:pPr>
         <w:pStyle w:val="Heading1"/>
       </w:pPr>
-      <w:bookmarkStart w:id="108" w:name="sec_108"/>
+      <w:bookmarkStart w:id="109" w:name="sec_109"/>
       <w:r>
         <w:rPr>
           <w:b/>
@@ -3051,7 +2587,7 @@
         </w:rPr>
         <w:t xml:space="preserve">Cómo razona una evaluación</w:t>
       </w:r>
-      <w:bookmarkEnd w:id="108"/>
+      <w:bookmarkEnd w:id="109"/>
     </w:p>
     <w:p>
       <w:pPr>
@@ -3063,7 +2599,7 @@
         <w:drawing>
           <wp:inline distT="0" distB="0" distL="0" distR="0">
             <wp:extent cx="1279603" cy="7112000"/>
-            <wp:docPr id="109" name="SmartPot_AI_01_Insight_Pipeline"/>
+            <wp:docPr id="110" name="SmartPot_AI_01_Insight_Pipeline"/>
             <wp:cNvGraphicFramePr>
               <a:graphicFrameLocks noChangeAspect="1"/>
             </wp:cNvGraphicFramePr>
@@ -3071,7 +2607,7 @@
               <a:graphicData uri="http://schemas.openxmlformats.org/drawingml/2006/picture">
                 <pic:pic>
                   <pic:nvPicPr>
-                    <pic:cNvPr id="109" name="SmartPot_AI_01_Insight_Pipeline"/>
+                    <pic:cNvPr id="110" name="SmartPot_AI_01_Insight_Pipeline"/>
                     <pic:cNvPicPr/>
                   </pic:nvPicPr>
                   <pic:blipFill>
@@ -3121,400 +2657,6 @@
         </w:rPr>
         <w:t xml:space="preserve">  ·  De la lectura a la respuesta</w:t>
       </w:r>
-    </w:p>
-    <w:p>
-      <w:pPr>
-        <w:spacing w:before="80" w:after="0" w:line="240" w:lineRule="auto"/>
-        <w:rPr>
-          <w:sz w:val="8"/>
-        </w:rPr>
-      </w:pPr>
-    </w:p>
-    <w:tbl>
-      <w:tblPr>
-        <w:tblW w:w="9360" w:type="dxa"/>
-        <w:tblInd w:w="0" w:type="dxa"/>
-        <w:tblBorders>
-          <w:top w:val="nil"/>
-          <w:left w:val="nil"/>
-          <w:bottom w:val="nil"/>
-          <w:right w:val="nil"/>
-          <w:insideH w:val="nil"/>
-          <w:insideV w:val="nil"/>
-        </w:tblBorders>
-        <w:tblLayout w:type="fixed"/>
-        <w:tblCellMar>
-          <w:left w:w="0" w:type="dxa"/>
-          <w:right w:w="0" w:type="dxa"/>
-        </w:tblCellMar>
-        <w:tblLook w:val="0000" w:firstRow="0" w:lastRow="0" w:firstColumn="0" w:lastColumn="0" w:noHBand="1" w:noVBand="1"/>
-      </w:tblPr>
-      <w:tblGrid>
-        <w:gridCol w:w="9360"/>
-      </w:tblGrid>
-      <w:tr>
-        <w:trPr>
-          <w:cantSplit/>
-        </w:trPr>
-        <w:tc>
-          <w:tcPr>
-            <w:tcW w:w="9360" w:type="dxa"/>
-            <w:shd w:val="clear" w:color="auto" w:fill="0B3D2B"/>
-            <w:tcMar>
-              <w:top w:w="60" w:type="dxa"/>
-              <w:left w:w="200" w:type="dxa"/>
-              <w:bottom w:w="60" w:type="dxa"/>
-              <w:right w:w="200" w:type="dxa"/>
-            </w:tcMar>
-            <w:vAlign w:val="top"/>
-          </w:tcPr>
-          <w:p>
-            <w:pPr>
-              <w:spacing w:before="0" w:after="0" w:line="240" w:lineRule="auto"/>
-            </w:pPr>
-            <w:r>
-              <w:rPr>
-                <w:b/>
-                <w:bCs/>
-                <w:color w:val="7FDBB0"/>
-                <w:spacing w:val="40"/>
-                <w:sz w:val="14"/>
-                <w:szCs w:val="14"/>
-              </w:rPr>
-              <w:t xml:space="preserve">MERMAID</w:t>
-            </w:r>
-          </w:p>
-        </w:tc>
-      </w:tr>
-    </w:tbl>
-    <w:tbl>
-      <w:tblPr>
-        <w:tblW w:w="9360" w:type="dxa"/>
-        <w:tblInd w:w="0" w:type="dxa"/>
-        <w:tblBorders>
-          <w:top w:val="nil"/>
-          <w:left w:val="nil"/>
-          <w:bottom w:val="nil"/>
-          <w:right w:val="nil"/>
-          <w:insideH w:val="nil"/>
-          <w:insideV w:val="nil"/>
-        </w:tblBorders>
-        <w:tblLayout w:type="fixed"/>
-        <w:tblCellMar>
-          <w:left w:w="0" w:type="dxa"/>
-          <w:right w:w="0" w:type="dxa"/>
-        </w:tblCellMar>
-        <w:tblLook w:val="0000" w:firstRow="0" w:lastRow="0" w:firstColumn="0" w:lastColumn="0" w:noHBand="1" w:noVBand="1"/>
-      </w:tblPr>
-      <w:tblGrid>
-        <w:gridCol w:w="9360"/>
-      </w:tblGrid>
-      <w:tr>
-        <w:trPr>
-          <w:cantSplit/>
-        </w:trPr>
-        <w:tc>
-          <w:tcPr>
-            <w:tcW w:w="9360" w:type="dxa"/>
-            <w:shd w:val="clear" w:color="auto" w:fill="F7FAF8"/>
-            <w:tcMar>
-              <w:top w:w="120" w:type="dxa"/>
-              <w:left w:w="200" w:type="dxa"/>
-              <w:bottom w:w="120" w:type="dxa"/>
-              <w:right w:w="200" w:type="dxa"/>
-            </w:tcMar>
-            <w:vAlign w:val="top"/>
-          </w:tcPr>
-          <w:p>
-            <w:pPr>
-              <w:spacing w:before="0" w:after="0" w:line="252" w:lineRule="auto"/>
-            </w:pPr>
-            <w:r>
-              <w:rPr>
-                <w:rFonts w:ascii="JetBrains Mono" w:hAnsi="JetBrains Mono" w:eastAsia="JetBrains Mono" w:cs="JetBrains Mono"/>
-                <w:color w:val="17261F"/>
-                <w:sz w:val="16"/>
-                <w:szCs w:val="16"/>
-              </w:rPr>
-              <w:t xml:space="preserve">%%{init: {"theme": "base", "fontFamily": "Segoe UI, Arial, sans-serif", "themeVariables": {"fontFamily": "Segoe UI, Arial, sans-serif", "fontSize": "15px", "primaryColor": "#DDF5EA", "primaryTextColor": "#17261F", "primaryBorderColor": "#067A52", "secondaryColor": "#E3F2FB", "secondaryTextColor": "#17261F", "secondaryBorderColor": "#1F6FA0", "tertiaryColor": "#F2F7F4", "tertiaryTextColor": "#17261F", "tertiaryBorderColor": "#D5E3DC", "lineColor": "#5B6B63", "textColor": "#17261F", "mainBkg": "#DDF5EA", "nodeBorder": "#067A52", "clusterBkg": "#F7FAF8", "clusterBorder": "#D5E3DC", "edgeLabelBackground": "#FFFFFF", "actorBkg": "#067A52", "actorBorder": "#0B3D2B", "actorTextColor": "#FFFFFF", "actorLineColor": "#5B6B63", "signalColor": "#17261F", "signalTextColor": "#17261F", "labelBoxBkgColor": "#0B3D2B", "labelBoxBorderColor": "#0B3D2B", "labelTextColor": "#FFFFFF", "loopTextColor": "#0B3D2B", "noteBkgColor": "#FDF4DD", "noteBorderColor": "#C98D12", "noteTextColor": "#17261F", "activationBkgColor": "#DDF5EA", "activationBorderColor": "#067A52", "attributeBackgroundColorOdd": "#FFFFFF", "attributeBackgroundColorEven": "#F2F7F4"}}}%%</w:t>
-            </w:r>
-          </w:p>
-          <w:p>
-            <w:pPr>
-              <w:spacing w:before="0" w:after="0" w:line="252" w:lineRule="auto"/>
-            </w:pPr>
-            <w:r>
-              <w:rPr>
-                <w:rFonts w:ascii="JetBrains Mono" w:hAnsi="JetBrains Mono" w:eastAsia="JetBrains Mono" w:cs="JetBrains Mono"/>
-                <w:color w:val="17261F"/>
-                <w:sz w:val="16"/>
-                <w:szCs w:val="16"/>
-              </w:rPr>
-              <w:t xml:space="preserve">flowchart TB</w:t>
-            </w:r>
-          </w:p>
-          <w:p>
-            <w:pPr>
-              <w:spacing w:before="0" w:after="0" w:line="252" w:lineRule="auto"/>
-            </w:pPr>
-            <w:r>
-              <w:rPr>
-                <w:rFonts w:ascii="JetBrains Mono" w:hAnsi="JetBrains Mono" w:eastAsia="JetBrains Mono" w:cs="JetBrains Mono"/>
-                <w:color w:val="17261F"/>
-                <w:sz w:val="16"/>
-                <w:szCs w:val="16"/>
-              </w:rPr>
-              <w:t xml:space="preserve">  req(["POST /v1/insights&lt;br/&gt;especie · medidas · historial · actuadores · hora local&lt;br/&gt;lugar y clima de afuera"])</w:t>
-            </w:r>
-          </w:p>
-          <w:p>
-            <w:pPr>
-              <w:spacing w:before="0" w:after="0" w:line="252" w:lineRule="auto"/>
-            </w:pPr>
-            <w:r>
-              <w:rPr>
-                <w:rFonts w:ascii="JetBrains Mono" w:hAnsi="JetBrains Mono" w:eastAsia="JetBrains Mono" w:cs="JetBrains Mono"/>
-                <w:color w:val="17261F"/>
-                <w:sz w:val="16"/>
-                <w:szCs w:val="16"/>
-              </w:rPr>
-              <w:t xml:space="preserve">  req --&gt; diag["1 · Diagnóstico por variable&lt;br/&gt;LOW · OPTIMAL · HIGH · REST de noche&lt;br/&gt;severidad en tolerancias"]</w:t>
-            </w:r>
-          </w:p>
-          <w:p>
-            <w:pPr>
-              <w:spacing w:before="0" w:after="0" w:line="252" w:lineRule="auto"/>
-            </w:pPr>
-            <w:r>
-              <w:rPr>
-                <w:rFonts w:ascii="JetBrains Mono" w:hAnsi="JetBrains Mono" w:eastAsia="JetBrains Mono" w:cs="JetBrains Mono"/>
-                <w:color w:val="17261F"/>
-                <w:sz w:val="16"/>
-                <w:szCs w:val="16"/>
-              </w:rPr>
-              <w:t xml:space="preserve">  diag --&gt; fc["2 · Pronóstico Theil-Sen&lt;br/&gt;pendiente por hora · valor en 3 h&lt;br/&gt;horas hasta salir del rango"]</w:t>
-            </w:r>
-          </w:p>
-          <w:p>
-            <w:pPr>
-              <w:spacing w:before="0" w:after="0" w:line="252" w:lineRule="auto"/>
-            </w:pPr>
-            <w:r>
-              <w:rPr>
-                <w:rFonts w:ascii="JetBrains Mono" w:hAnsi="JetBrains Mono" w:eastAsia="JetBrains Mono" w:cs="JetBrains Mono"/>
-                <w:color w:val="17261F"/>
-                <w:sz w:val="16"/>
-                <w:szCs w:val="16"/>
-              </w:rPr>
-              <w:t xml:space="preserve">  fc --&gt; ml["3 · Modelos&lt;br/&gt;base sintéticos: logística, MLP, Isolation Forest&lt;br/&gt;aprendidos de cultivos reales si existen"]</w:t>
-            </w:r>
-          </w:p>
-          <w:p>
-            <w:pPr>
-              <w:spacing w:before="0" w:after="0" w:line="252" w:lineRule="auto"/>
-            </w:pPr>
-            <w:r>
-              <w:rPr>
-                <w:rFonts w:ascii="JetBrains Mono" w:hAnsi="JetBrains Mono" w:eastAsia="JetBrains Mono" w:cs="JetBrains Mono"/>
-                <w:color w:val="17261F"/>
-                <w:sz w:val="16"/>
-                <w:szCs w:val="16"/>
-              </w:rPr>
-              <w:t xml:space="preserve">  ml --&gt; es["4 · Sistema experto&lt;br/&gt;encadenamiento hacia adelante&lt;br/&gt;primer y segundo nivel · sensor_fault bloquea&lt;br/&gt;rain_outside y sensor_vs_outside"]</w:t>
-            </w:r>
-          </w:p>
-          <w:p>
-            <w:pPr>
-              <w:spacing w:before="0" w:after="0" w:line="252" w:lineRule="auto"/>
-            </w:pPr>
-            <w:r>
-              <w:rPr>
-                <w:rFonts w:ascii="JetBrains Mono" w:hAnsi="JetBrains Mono" w:eastAsia="JetBrains Mono" w:cs="JetBrains Mono"/>
-                <w:color w:val="17261F"/>
-                <w:sz w:val="16"/>
-                <w:szCs w:val="16"/>
-              </w:rPr>
-              <w:t xml:space="preserve">  es --&gt; fz["5 · Lógica difusa&lt;br/&gt;salud por variable · índice ponderado&lt;br/&gt;peor caso si algo es crítico"]</w:t>
-            </w:r>
-          </w:p>
-          <w:p>
-            <w:pPr>
-              <w:spacing w:before="0" w:after="0" w:line="252" w:lineRule="auto"/>
-            </w:pPr>
-            <w:r>
-              <w:rPr>
-                <w:rFonts w:ascii="JetBrains Mono" w:hAnsi="JetBrains Mono" w:eastAsia="JetBrains Mono" w:cs="JetBrains Mono"/>
-                <w:color w:val="17261F"/>
-                <w:sz w:val="16"/>
-                <w:szCs w:val="16"/>
-              </w:rPr>
-              <w:t xml:space="preserve">  fz --&gt; ag["6 · Agente reactivo&lt;br/&gt;solo actuadores del cultivo&lt;br/&gt;preventivo si el pronóstico o lo aprendido lo anticipa"]</w:t>
-            </w:r>
-          </w:p>
-          <w:p>
-            <w:pPr>
-              <w:spacing w:before="0" w:after="0" w:line="252" w:lineRule="auto"/>
-            </w:pPr>
-            <w:r>
-              <w:rPr>
-                <w:rFonts w:ascii="JetBrains Mono" w:hAnsi="JetBrains Mono" w:eastAsia="JetBrains Mono" w:cs="JetBrains Mono"/>
-                <w:color w:val="17261F"/>
-                <w:sz w:val="16"/>
-                <w:szCs w:val="16"/>
-              </w:rPr>
-              <w:t xml:space="preserve">  ag --&gt; place["7 · Consejo de lugar&lt;br/&gt;OK · UNKNOWN · TIP · MOVE"]</w:t>
-            </w:r>
-          </w:p>
-          <w:p>
-            <w:pPr>
-              <w:spacing w:before="0" w:after="0" w:line="252" w:lineRule="auto"/>
-            </w:pPr>
-            <w:r>
-              <w:rPr>
-                <w:rFonts w:ascii="JetBrains Mono" w:hAnsi="JetBrains Mono" w:eastAsia="JetBrains Mono" w:cs="JetBrains Mono"/>
-                <w:color w:val="17261F"/>
-                <w:sz w:val="16"/>
-                <w:szCs w:val="16"/>
-              </w:rPr>
-              <w:t xml:space="preserve">  place --&gt; out(["Respuesta&lt;br/&gt;health · diagnosis · conclusions · predictions&lt;br/&gt;forecasts · learning · placement · actions · summary"])</w:t>
-            </w:r>
-          </w:p>
-          <w:p>
-            <w:pPr>
-              <w:spacing w:before="0" w:after="0" w:line="252" w:lineRule="auto"/>
-            </w:pPr>
-            <w:r>
-              <w:rPr>
-                <w:rFonts w:ascii="JetBrains Mono" w:hAnsi="JetBrains Mono" w:eastAsia="JetBrains Mono" w:cs="JetBrains Mono"/>
-                <w:color w:val="17261F"/>
-                <w:sz w:val="16"/>
-                <w:szCs w:val="16"/>
-              </w:rPr>
-              <w:t xml:space="preserve">  classDef leaf fill:#DDF5EA,stroke:#067A52,color:#17261F</w:t>
-            </w:r>
-          </w:p>
-          <w:p>
-            <w:pPr>
-              <w:spacing w:before="0" w:after="0" w:line="252" w:lineRule="auto"/>
-            </w:pPr>
-            <w:r>
-              <w:rPr>
-                <w:rFonts w:ascii="JetBrains Mono" w:hAnsi="JetBrains Mono" w:eastAsia="JetBrains Mono" w:cs="JetBrains Mono"/>
-                <w:color w:val="17261F"/>
-                <w:sz w:val="16"/>
-                <w:szCs w:val="16"/>
-              </w:rPr>
-              <w:t xml:space="preserve">  classDef water fill:#E3F2FB,stroke:#1F6FA0,color:#17261F</w:t>
-            </w:r>
-          </w:p>
-          <w:p>
-            <w:pPr>
-              <w:spacing w:before="0" w:after="0" w:line="252" w:lineRule="auto"/>
-            </w:pPr>
-            <w:r>
-              <w:rPr>
-                <w:rFonts w:ascii="JetBrains Mono" w:hAnsi="JetBrains Mono" w:eastAsia="JetBrains Mono" w:cs="JetBrains Mono"/>
-                <w:color w:val="17261F"/>
-                <w:sz w:val="16"/>
-                <w:szCs w:val="16"/>
-              </w:rPr>
-              <w:t xml:space="preserve">  classDef sun fill:#FDF4DD,stroke:#C98D12,color:#17261F</w:t>
-            </w:r>
-          </w:p>
-          <w:p>
-            <w:pPr>
-              <w:spacing w:before="0" w:after="0" w:line="252" w:lineRule="auto"/>
-            </w:pPr>
-            <w:r>
-              <w:rPr>
-                <w:rFonts w:ascii="JetBrains Mono" w:hAnsi="JetBrains Mono" w:eastAsia="JetBrains Mono" w:cs="JetBrains Mono"/>
-                <w:color w:val="17261F"/>
-                <w:sz w:val="16"/>
-                <w:szCs w:val="16"/>
-              </w:rPr>
-              <w:t xml:space="preserve">  classDef clay fill:#FBE9E1,stroke:#B85A38,color:#17261F</w:t>
-            </w:r>
-          </w:p>
-          <w:p>
-            <w:pPr>
-              <w:spacing w:before="0" w:after="0" w:line="252" w:lineRule="auto"/>
-            </w:pPr>
-            <w:r>
-              <w:rPr>
-                <w:rFonts w:ascii="JetBrains Mono" w:hAnsi="JetBrains Mono" w:eastAsia="JetBrains Mono" w:cs="JetBrains Mono"/>
-                <w:color w:val="17261F"/>
-                <w:sz w:val="16"/>
-                <w:szCs w:val="16"/>
-              </w:rPr>
-              <w:t xml:space="preserve">  classDef core fill:#067A52,stroke:#0B3D2B,color:#FFFFFF</w:t>
-            </w:r>
-          </w:p>
-          <w:p>
-            <w:pPr>
-              <w:spacing w:before="0" w:after="0" w:line="252" w:lineRule="auto"/>
-            </w:pPr>
-            <w:r>
-              <w:rPr>
-                <w:rFonts w:ascii="JetBrains Mono" w:hAnsi="JetBrains Mono" w:eastAsia="JetBrains Mono" w:cs="JetBrains Mono"/>
-                <w:color w:val="17261F"/>
-                <w:sz w:val="16"/>
-                <w:szCs w:val="16"/>
-              </w:rPr>
-              <w:t xml:space="preserve">  classDef deep fill:#0B3D2B,stroke:#06281C,color:#FFFFFF</w:t>
-            </w:r>
-          </w:p>
-          <w:p>
-            <w:pPr>
-              <w:spacing w:before="0" w:after="0" w:line="252" w:lineRule="auto"/>
-            </w:pPr>
-            <w:r>
-              <w:rPr>
-                <w:rFonts w:ascii="JetBrains Mono" w:hAnsi="JetBrains Mono" w:eastAsia="JetBrains Mono" w:cs="JetBrains Mono"/>
-                <w:color w:val="17261F"/>
-                <w:sz w:val="16"/>
-                <w:szCs w:val="16"/>
-              </w:rPr>
-              <w:t xml:space="preserve">  classDef muted fill:#F2F7F4,stroke:#5B6B63,color:#17261F</w:t>
-            </w:r>
-          </w:p>
-          <w:p>
-            <w:pPr>
-              <w:spacing w:before="0" w:after="0" w:line="252" w:lineRule="auto"/>
-            </w:pPr>
-            <w:r>
-              <w:rPr>
-                <w:rFonts w:ascii="JetBrains Mono" w:hAnsi="JetBrains Mono" w:eastAsia="JetBrains Mono" w:cs="JetBrains Mono"/>
-                <w:color w:val="17261F"/>
-                <w:sz w:val="16"/>
-                <w:szCs w:val="16"/>
-              </w:rPr>
-              <w:t xml:space="preserve">  class req,out core</w:t>
-            </w:r>
-          </w:p>
-          <w:p>
-            <w:pPr>
-              <w:spacing w:before="0" w:after="0" w:line="252" w:lineRule="auto"/>
-            </w:pPr>
-            <w:r>
-              <w:rPr>
-                <w:rFonts w:ascii="JetBrains Mono" w:hAnsi="JetBrains Mono" w:eastAsia="JetBrains Mono" w:cs="JetBrains Mono"/>
-                <w:color w:val="17261F"/>
-                <w:sz w:val="16"/>
-                <w:szCs w:val="16"/>
-              </w:rPr>
-              <w:t xml:space="preserve">  class diag,fc,ml,es,fz,ag,place leaf</w:t>
-            </w:r>
-          </w:p>
-        </w:tc>
-      </w:tr>
-    </w:tbl>
-    <w:p>
-      <w:pPr>
-        <w:spacing w:before="160" w:after="0" w:line="240" w:lineRule="auto"/>
-        <w:rPr>
-          <w:sz w:val="8"/>
-        </w:rPr>
-      </w:pPr>
     </w:p>
     <w:p>
       <w:pPr>
@@ -4197,7 +3339,7 @@
       <w:pPr>
         <w:pStyle w:val="Heading1"/>
       </w:pPr>
-      <w:bookmarkStart w:id="110" w:name="sec_110"/>
+      <w:bookmarkStart w:id="111" w:name="sec_111"/>
       <w:r>
         <w:rPr>
           <w:b/>
@@ -4208,7 +3350,7 @@
         </w:rPr>
         <w:t xml:space="preserve">Aprendizaje continuo</w:t>
       </w:r>
-      <w:bookmarkEnd w:id="110"/>
+      <w:bookmarkEnd w:id="111"/>
     </w:p>
     <w:p>
       <w:pPr>
@@ -4220,7 +3362,7 @@
         <w:drawing>
           <wp:inline distT="0" distB="0" distL="0" distR="0">
             <wp:extent cx="8229600" cy="1067126"/>
-            <wp:docPr id="111" name="SmartPot_AI_02_Learning_Cycle"/>
+            <wp:docPr id="112" name="SmartPot_AI_02_Learning_Cycle"/>
             <wp:cNvGraphicFramePr>
               <a:graphicFrameLocks noChangeAspect="1"/>
             </wp:cNvGraphicFramePr>
@@ -4228,7 +3370,7 @@
               <a:graphicData uri="http://schemas.openxmlformats.org/drawingml/2006/picture">
                 <pic:pic>
                   <pic:nvPicPr>
-                    <pic:cNvPr id="111" name="SmartPot_AI_02_Learning_Cycle"/>
+                    <pic:cNvPr id="112" name="SmartPot_AI_02_Learning_Cycle"/>
                     <pic:cNvPicPr/>
                   </pic:nvPicPr>
                   <pic:blipFill>
@@ -4296,9 +3438,144 @@
     </w:p>
     <w:p>
       <w:pPr>
-        <w:spacing w:before="80" w:after="0" w:line="240" w:lineRule="auto"/>
-        <w:rPr>
-          <w:sz w:val="8"/>
+        <w:spacing w:before="0" w:after="140" w:line="288" w:lineRule="auto"/>
+      </w:pPr>
+      <w:r>
+        <w:rPr>
+          <w:color w:val="17261F"/>
+          <w:sz w:val="20"/>
+          <w:szCs w:val="20"/>
+        </w:rPr>
+        <w:t xml:space="preserve">Solo aprende de cultivos </w:t>
+      </w:r>
+      <w:r>
+        <w:rPr>
+          <w:b/>
+          <w:bCs/>
+          <w:color w:val="17261F"/>
+          <w:sz w:val="20"/>
+          <w:szCs w:val="20"/>
+        </w:rPr>
+        <w:t xml:space="preserve">reales</w:t>
+      </w:r>
+      <w:r>
+        <w:rPr>
+          <w:color w:val="17261F"/>
+          <w:sz w:val="20"/>
+          <w:szCs w:val="20"/>
+        </w:rPr>
+        <w:t xml:space="preserve">: la API no envía las lecturas de los cultivos virtuales, que son sintéticas. Cada especie entrena por separado y en un proceso aparte para no frenar las evaluaciones; una tarea queda pendiente, con su razón, mientras falten datos o casos. Borrar un cultivo borra sus lecturas.</w:t>
+      </w:r>
+    </w:p>
+    <w:p>
+      <w:pPr>
+        <w:keepNext/>
+        <w:spacing w:before="360" w:after="40" w:line="288" w:lineRule="auto"/>
+      </w:pPr>
+      <w:r>
+        <w:rPr>
+          <w:b/>
+          <w:bCs/>
+          <w:color w:val="009A64"/>
+          <w:spacing w:val="60"/>
+          <w:sz w:val="16"/>
+          <w:szCs w:val="16"/>
+        </w:rPr>
+        <w:t xml:space="preserve">SECCIÓN 05</w:t>
+      </w:r>
+    </w:p>
+    <w:p>
+      <w:pPr>
+        <w:pStyle w:val="Heading1"/>
+      </w:pPr>
+      <w:bookmarkStart w:id="113" w:name="sec_113"/>
+      <w:r>
+        <w:rPr>
+          <w:b/>
+          <w:bCs/>
+          <w:color w:val="0B3D2B"/>
+          <w:sz w:val="34"/>
+          <w:szCs w:val="34"/>
+        </w:rPr>
+        <w:t xml:space="preserve">Análisis de flota</w:t>
+      </w:r>
+      <w:bookmarkEnd w:id="113"/>
+    </w:p>
+    <w:p>
+      <w:pPr>
+        <w:keepNext/>
+        <w:spacing w:before="120" w:after="60" w:line="288" w:lineRule="auto"/>
+        <w:jc w:val="center"/>
+      </w:pPr>
+      <w:r>
+        <w:drawing>
+          <wp:inline distT="0" distB="0" distL="0" distR="0">
+            <wp:extent cx="5943600" cy="3052419"/>
+            <wp:docPr id="114" name="SmartPot_AI_03_Fleet_Analysis"/>
+            <wp:cNvGraphicFramePr>
+              <a:graphicFrameLocks noChangeAspect="1"/>
+            </wp:cNvGraphicFramePr>
+            <a:graphic>
+              <a:graphicData uri="http://schemas.openxmlformats.org/drawingml/2006/picture">
+                <pic:pic>
+                  <pic:nvPicPr>
+                    <pic:cNvPr id="114" name="SmartPot_AI_03_Fleet_Analysis"/>
+                    <pic:cNvPicPr/>
+                  </pic:nvPicPr>
+                  <pic:blipFill>
+                    <a:blip r:embed="rIdImg6"/>
+                    <a:stretch>
+                      <a:fillRect/>
+                    </a:stretch>
+                  </pic:blipFill>
+                  <pic:spPr>
+                    <a:xfrm>
+                      <a:off x="0" y="0"/>
+                      <a:ext cx="5943600" cy="3052419"/>
+                    </a:xfrm>
+                    <a:prstGeom prst="rect">
+                      <a:avLst/>
+                    </a:prstGeom>
+                  </pic:spPr>
+                </pic:pic>
+              </a:graphicData>
+            </a:graphic>
+          </wp:inline>
+        </w:drawing>
+      </w:r>
+    </w:p>
+    <w:p>
+      <w:pPr>
+        <w:spacing w:before="0" w:after="240" w:line="288" w:lineRule="auto"/>
+        <w:jc w:val="center"/>
+      </w:pPr>
+      <w:r>
+        <w:rPr>
+          <w:b/>
+          <w:bCs/>
+          <w:color w:val="067A52"/>
+          <w:sz w:val="16"/>
+          <w:szCs w:val="16"/>
+        </w:rPr>
+        <w:t xml:space="preserve">Figura 4</w:t>
+      </w:r>
+      <w:r>
+        <w:rPr>
+          <w:i/>
+          <w:iCs/>
+          <w:color w:val="5B6B63"/>
+          <w:sz w:val="16"/>
+          <w:szCs w:val="16"/>
+        </w:rPr>
+        <w:t xml:space="preserve">  ·  Análisis de todos los cultivos de una cuenta</w:t>
+      </w:r>
+    </w:p>
+    <w:p>
+      <w:pPr>
+        <w:pageBreakBefore/>
+        <w:spacing w:before="0" w:after="0" w:line="20" w:lineRule="exact"/>
+        <w:rPr>
+          <w:sz w:val="2"/>
         </w:rPr>
       </w:pPr>
     </w:p>
@@ -4333,461 +3610,56 @@
             <w:tcW w:w="9360" w:type="dxa"/>
             <w:shd w:val="clear" w:color="auto" w:fill="0B3D2B"/>
             <w:tcMar>
-              <w:top w:w="60" w:type="dxa"/>
-              <w:left w:w="200" w:type="dxa"/>
-              <w:bottom w:w="60" w:type="dxa"/>
-              <w:right w:w="200" w:type="dxa"/>
+              <w:top w:w="420" w:type="dxa"/>
+              <w:left w:w="480" w:type="dxa"/>
+              <w:bottom w:w="420" w:type="dxa"/>
+              <w:right w:w="480" w:type="dxa"/>
             </w:tcMar>
             <w:vAlign w:val="top"/>
           </w:tcPr>
           <w:p>
             <w:pPr>
+              <w:spacing w:before="0" w:after="80" w:line="288" w:lineRule="auto"/>
+            </w:pPr>
+            <w:r>
+              <w:rPr>
+                <w:b/>
+                <w:bCs/>
+                <w:caps/>
+                <w:color w:val="F2B632"/>
+                <w:spacing w:val="60"/>
+                <w:sz w:val="17"/>
+                <w:szCs w:val="17"/>
+              </w:rPr>
+              <w:t xml:space="preserve">PARTE III</w:t>
+            </w:r>
+          </w:p>
+          <w:p>
+            <w:pPr>
               <w:spacing w:before="0" w:after="0" w:line="240" w:lineRule="auto"/>
             </w:pPr>
             <w:r>
               <w:rPr>
-                <w:b/>
-                <w:bCs/>
-                <w:color w:val="7FDBB0"/>
-                <w:spacing w:val="40"/>
-                <w:sz w:val="14"/>
-                <w:szCs w:val="14"/>
-              </w:rPr>
-              <w:t xml:space="preserve">MERMAID</w:t>
+                <w:rFonts w:ascii="Century Gothic" w:hAnsi="Century Gothic" w:eastAsia="Century Gothic" w:cs="Century Gothic"/>
+                <w:b/>
+                <w:bCs/>
+                <w:color w:val="FFFFFF"/>
+                <w:sz w:val="44"/>
+                <w:szCs w:val="44"/>
+              </w:rPr>
+              <w:t xml:space="preserve">Operación</w:t>
             </w:r>
           </w:p>
         </w:tc>
       </w:tr>
     </w:tbl>
-    <w:tbl>
-      <w:tblPr>
-        <w:tblW w:w="9360" w:type="dxa"/>
-        <w:tblInd w:w="0" w:type="dxa"/>
-        <w:tblBorders>
-          <w:top w:val="nil"/>
-          <w:left w:val="nil"/>
-          <w:bottom w:val="nil"/>
-          <w:right w:val="nil"/>
-          <w:insideH w:val="nil"/>
-          <w:insideV w:val="nil"/>
-        </w:tblBorders>
-        <w:tblLayout w:type="fixed"/>
-        <w:tblCellMar>
-          <w:left w:w="0" w:type="dxa"/>
-          <w:right w:w="0" w:type="dxa"/>
-        </w:tblCellMar>
-        <w:tblLook w:val="0000" w:firstRow="0" w:lastRow="0" w:firstColumn="0" w:lastColumn="0" w:noHBand="1" w:noVBand="1"/>
-      </w:tblPr>
-      <w:tblGrid>
-        <w:gridCol w:w="9360"/>
-      </w:tblGrid>
-      <w:tr>
-        <w:trPr>
-          <w:cantSplit/>
-        </w:trPr>
-        <w:tc>
-          <w:tcPr>
-            <w:tcW w:w="9360" w:type="dxa"/>
-            <w:shd w:val="clear" w:color="auto" w:fill="F7FAF8"/>
-            <w:tcMar>
-              <w:top w:w="120" w:type="dxa"/>
-              <w:left w:w="200" w:type="dxa"/>
-              <w:bottom w:w="120" w:type="dxa"/>
-              <w:right w:w="200" w:type="dxa"/>
-            </w:tcMar>
-            <w:vAlign w:val="top"/>
-          </w:tcPr>
-          <w:p>
-            <w:pPr>
-              <w:spacing w:before="0" w:after="0" w:line="252" w:lineRule="auto"/>
-            </w:pPr>
-            <w:r>
-              <w:rPr>
-                <w:rFonts w:ascii="JetBrains Mono" w:hAnsi="JetBrains Mono" w:eastAsia="JetBrains Mono" w:cs="JetBrains Mono"/>
-                <w:color w:val="17261F"/>
-                <w:sz w:val="16"/>
-                <w:szCs w:val="16"/>
-              </w:rPr>
-              <w:t xml:space="preserve">%%{init: {"theme": "base", "fontFamily": "Segoe UI, Arial, sans-serif", "themeVariables": {"fontFamily": "Segoe UI, Arial, sans-serif", "fontSize": "15px", "primaryColor": "#DDF5EA", "primaryTextColor": "#17261F", "primaryBorderColor": "#067A52", "secondaryColor": "#E3F2FB", "secondaryTextColor": "#17261F", "secondaryBorderColor": "#1F6FA0", "tertiaryColor": "#F2F7F4", "tertiaryTextColor": "#17261F", "tertiaryBorderColor": "#D5E3DC", "lineColor": "#5B6B63", "textColor": "#17261F", "mainBkg": "#DDF5EA", "nodeBorder": "#067A52", "clusterBkg": "#F7FAF8", "clusterBorder": "#D5E3DC", "edgeLabelBackground": "#FFFFFF", "actorBkg": "#067A52", "actorBorder": "#0B3D2B", "actorTextColor": "#FFFFFF", "actorLineColor": "#5B6B63", "signalColor": "#17261F", "signalTextColor": "#17261F", "labelBoxBkgColor": "#0B3D2B", "labelBoxBorderColor": "#0B3D2B", "labelTextColor": "#FFFFFF", "loopTextColor": "#0B3D2B", "noteBkgColor": "#FDF4DD", "noteBorderColor": "#C98D12", "noteTextColor": "#17261F", "activationBkgColor": "#DDF5EA", "activationBorderColor": "#067A52", "attributeBackgroundColorOdd": "#FFFFFF", "attributeBackgroundColorEven": "#F2F7F4"}}}%%</w:t>
-            </w:r>
-          </w:p>
-          <w:p>
-            <w:pPr>
-              <w:spacing w:before="0" w:after="0" w:line="252" w:lineRule="auto"/>
-            </w:pPr>
-            <w:r>
-              <w:rPr>
-                <w:rFonts w:ascii="JetBrains Mono" w:hAnsi="JetBrains Mono" w:eastAsia="JetBrains Mono" w:cs="JetBrains Mono"/>
-                <w:color w:val="17261F"/>
-                <w:sz w:val="16"/>
-                <w:szCs w:val="16"/>
-              </w:rPr>
-              <w:t xml:space="preserve">flowchart LR</w:t>
-            </w:r>
-          </w:p>
-          <w:p>
-            <w:pPr>
-              <w:spacing w:before="0" w:after="0" w:line="252" w:lineRule="auto"/>
-            </w:pPr>
-            <w:r>
-              <w:rPr>
-                <w:rFonts w:ascii="JetBrains Mono" w:hAnsi="JetBrains Mono" w:eastAsia="JetBrains Mono" w:cs="JetBrains Mono"/>
-                <w:color w:val="17261F"/>
-                <w:sz w:val="16"/>
-                <w:szCs w:val="16"/>
-              </w:rPr>
-              <w:t xml:space="preserve">  batch(["Lote de la API&lt;br/&gt;solo cultivos reales · hasta 2000"]) --&gt; store["store&lt;br/&gt;SQLite en /data · cultivo seudonimizado SHA-256&lt;br/&gt;retención por días y tope de filas"]</w:t>
-            </w:r>
-          </w:p>
-          <w:p>
-            <w:pPr>
-              <w:spacing w:before="0" w:after="0" w:line="252" w:lineRule="auto"/>
-            </w:pPr>
-            <w:r>
-              <w:rPr>
-                <w:rFonts w:ascii="JetBrains Mono" w:hAnsi="JetBrains Mono" w:eastAsia="JetBrains Mono" w:cs="JetBrains Mono"/>
-                <w:color w:val="17261F"/>
-                <w:sz w:val="16"/>
-                <w:szCs w:val="16"/>
-              </w:rPr>
-              <w:t xml:space="preserve">  store --&gt; trigger{"¿Toca entrenar?&lt;br/&gt;desde 200 etiquetadas&lt;br/&gt;cada 300 nuevas"}</w:t>
-            </w:r>
-          </w:p>
-          <w:p>
-            <w:pPr>
-              <w:spacing w:before="0" w:after="0" w:line="252" w:lineRule="auto"/>
-            </w:pPr>
-            <w:r>
-              <w:rPr>
-                <w:rFonts w:ascii="JetBrains Mono" w:hAnsi="JetBrains Mono" w:eastAsia="JetBrains Mono" w:cs="JetBrains Mono"/>
-                <w:color w:val="17261F"/>
-                <w:sz w:val="16"/>
-                <w:szCs w:val="16"/>
-              </w:rPr>
-              <w:t xml:space="preserve">  trigger --&gt;|"No"| wait(["Espera más lecturas"])</w:t>
-            </w:r>
-          </w:p>
-          <w:p>
-            <w:pPr>
-              <w:spacing w:before="0" w:after="0" w:line="252" w:lineRule="auto"/>
-            </w:pPr>
-            <w:r>
-              <w:rPr>
-                <w:rFonts w:ascii="JetBrains Mono" w:hAnsi="JetBrains Mono" w:eastAsia="JetBrains Mono" w:cs="JetBrains Mono"/>
-                <w:color w:val="17261F"/>
-                <w:sz w:val="16"/>
-                <w:szCs w:val="16"/>
-              </w:rPr>
-              <w:t xml:space="preserve">  trigger --&gt;|"Sí"| quality["quality&lt;br/&gt;completitud · validez física&lt;br/&gt;atípicos IQR k = 3 · DQS"]</w:t>
-            </w:r>
-          </w:p>
-          <w:p>
-            <w:pPr>
-              <w:spacing w:before="0" w:after="0" w:line="252" w:lineRule="auto"/>
-            </w:pPr>
-            <w:r>
-              <w:rPr>
-                <w:rFonts w:ascii="JetBrains Mono" w:hAnsi="JetBrains Mono" w:eastAsia="JetBrains Mono" w:cs="JetBrains Mono"/>
-                <w:color w:val="17261F"/>
-                <w:sz w:val="16"/>
-                <w:szCs w:val="16"/>
-              </w:rPr>
-              <w:t xml:space="preserve">  quality --&gt; features["features&lt;br/&gt;posición en el rango · hora circular&lt;br/&gt;tendencia · etiquetas de la hora siguiente"]</w:t>
-            </w:r>
-          </w:p>
-          <w:p>
-            <w:pPr>
-              <w:spacing w:before="0" w:after="0" w:line="252" w:lineRule="auto"/>
-            </w:pPr>
-            <w:r>
-              <w:rPr>
-                <w:rFonts w:ascii="JetBrains Mono" w:hAnsi="JetBrains Mono" w:eastAsia="JetBrains Mono" w:cs="JetBrains Mono"/>
-                <w:color w:val="17261F"/>
-                <w:sz w:val="16"/>
-                <w:szCs w:val="16"/>
-              </w:rPr>
-              <w:t xml:space="preserve">  features --&gt; compare["trainer&lt;br/&gt;línea base y seis modelos&lt;br/&gt;TimeSeriesSplit de 4 cortes"]</w:t>
-            </w:r>
-          </w:p>
-          <w:p>
-            <w:pPr>
-              <w:spacing w:before="0" w:after="0" w:line="252" w:lineRule="auto"/>
-            </w:pPr>
-            <w:r>
-              <w:rPr>
-                <w:rFonts w:ascii="JetBrains Mono" w:hAnsi="JetBrains Mono" w:eastAsia="JetBrains Mono" w:cs="JetBrains Mono"/>
-                <w:color w:val="17261F"/>
-                <w:sz w:val="16"/>
-                <w:szCs w:val="16"/>
-              </w:rPr>
-              <w:t xml:space="preserve">  compare --&gt; tune["GridSearchCV&lt;br/&gt;sobre el mejor candidato"]</w:t>
-            </w:r>
-          </w:p>
-          <w:p>
-            <w:pPr>
-              <w:spacing w:before="0" w:after="0" w:line="252" w:lineRule="auto"/>
-            </w:pPr>
-            <w:r>
-              <w:rPr>
-                <w:rFonts w:ascii="JetBrains Mono" w:hAnsi="JetBrains Mono" w:eastAsia="JetBrains Mono" w:cs="JetBrains Mono"/>
-                <w:color w:val="17261F"/>
-                <w:sz w:val="16"/>
-                <w:szCs w:val="16"/>
-              </w:rPr>
-              <w:t xml:space="preserve">  tune --&gt; duel{"¿Supera al campeón&lt;br/&gt;y a la línea base en el&lt;br/&gt;20 % más reciente?"}</w:t>
-            </w:r>
-          </w:p>
-          <w:p>
-            <w:pPr>
-              <w:spacing w:before="0" w:after="0" w:line="252" w:lineRule="auto"/>
-            </w:pPr>
-            <w:r>
-              <w:rPr>
-                <w:rFonts w:ascii="JetBrains Mono" w:hAnsi="JetBrains Mono" w:eastAsia="JetBrains Mono" w:cs="JetBrains Mono"/>
-                <w:color w:val="17261F"/>
-                <w:sz w:val="16"/>
-                <w:szCs w:val="16"/>
-              </w:rPr>
-              <w:t xml:space="preserve">  duel --&gt;|"Sí"| champion["Nuevo campeón&lt;br/&gt;models/*.joblib"]</w:t>
-            </w:r>
-          </w:p>
-          <w:p>
-            <w:pPr>
-              <w:spacing w:before="0" w:after="0" w:line="252" w:lineRule="auto"/>
-            </w:pPr>
-            <w:r>
-              <w:rPr>
-                <w:rFonts w:ascii="JetBrains Mono" w:hAnsi="JetBrains Mono" w:eastAsia="JetBrains Mono" w:cs="JetBrains Mono"/>
-                <w:color w:val="17261F"/>
-                <w:sz w:val="16"/>
-                <w:szCs w:val="16"/>
-              </w:rPr>
-              <w:t xml:space="preserve">  duel --&gt;|"No"| keep["Se conserva el vigente"]</w:t>
-            </w:r>
-          </w:p>
-          <w:p>
-            <w:pPr>
-              <w:spacing w:before="0" w:after="0" w:line="252" w:lineRule="auto"/>
-            </w:pPr>
-            <w:r>
-              <w:rPr>
-                <w:rFonts w:ascii="JetBrains Mono" w:hAnsi="JetBrains Mono" w:eastAsia="JetBrains Mono" w:cs="JetBrains Mono"/>
-                <w:color w:val="17261F"/>
-                <w:sz w:val="16"/>
-                <w:szCs w:val="16"/>
-              </w:rPr>
-              <w:t xml:space="preserve">  features --&gt; unsup["No supervisado&lt;br/&gt;K-Means por silueta · Isolation Forest"]</w:t>
-            </w:r>
-          </w:p>
-          <w:p>
-            <w:pPr>
-              <w:spacing w:before="0" w:after="0" w:line="252" w:lineRule="auto"/>
-            </w:pPr>
-            <w:r>
-              <w:rPr>
-                <w:rFonts w:ascii="JetBrains Mono" w:hAnsi="JetBrains Mono" w:eastAsia="JetBrains Mono" w:cs="JetBrains Mono"/>
-                <w:color w:val="17261F"/>
-                <w:sz w:val="16"/>
-                <w:szCs w:val="16"/>
-              </w:rPr>
-              <w:t xml:space="preserve">  champion &amp; keep &amp; unsup --&gt; use(["learning en cada evaluación&lt;br/&gt;reglas learned_* y agente preventivo"])</w:t>
-            </w:r>
-          </w:p>
-          <w:p>
-            <w:pPr>
-              <w:spacing w:before="0" w:after="0" w:line="252" w:lineRule="auto"/>
-            </w:pPr>
-            <w:r>
-              <w:rPr>
-                <w:rFonts w:ascii="JetBrains Mono" w:hAnsi="JetBrains Mono" w:eastAsia="JetBrains Mono" w:cs="JetBrains Mono"/>
-                <w:color w:val="17261F"/>
-                <w:sz w:val="16"/>
-                <w:szCs w:val="16"/>
-              </w:rPr>
-              <w:t xml:space="preserve">  classDef leaf fill:#DDF5EA,stroke:#067A52,color:#17261F</w:t>
-            </w:r>
-          </w:p>
-          <w:p>
-            <w:pPr>
-              <w:spacing w:before="0" w:after="0" w:line="252" w:lineRule="auto"/>
-            </w:pPr>
-            <w:r>
-              <w:rPr>
-                <w:rFonts w:ascii="JetBrains Mono" w:hAnsi="JetBrains Mono" w:eastAsia="JetBrains Mono" w:cs="JetBrains Mono"/>
-                <w:color w:val="17261F"/>
-                <w:sz w:val="16"/>
-                <w:szCs w:val="16"/>
-              </w:rPr>
-              <w:t xml:space="preserve">  classDef water fill:#E3F2FB,stroke:#1F6FA0,color:#17261F</w:t>
-            </w:r>
-          </w:p>
-          <w:p>
-            <w:pPr>
-              <w:spacing w:before="0" w:after="0" w:line="252" w:lineRule="auto"/>
-            </w:pPr>
-            <w:r>
-              <w:rPr>
-                <w:rFonts w:ascii="JetBrains Mono" w:hAnsi="JetBrains Mono" w:eastAsia="JetBrains Mono" w:cs="JetBrains Mono"/>
-                <w:color w:val="17261F"/>
-                <w:sz w:val="16"/>
-                <w:szCs w:val="16"/>
-              </w:rPr>
-              <w:t xml:space="preserve">  classDef sun fill:#FDF4DD,stroke:#C98D12,color:#17261F</w:t>
-            </w:r>
-          </w:p>
-          <w:p>
-            <w:pPr>
-              <w:spacing w:before="0" w:after="0" w:line="252" w:lineRule="auto"/>
-            </w:pPr>
-            <w:r>
-              <w:rPr>
-                <w:rFonts w:ascii="JetBrains Mono" w:hAnsi="JetBrains Mono" w:eastAsia="JetBrains Mono" w:cs="JetBrains Mono"/>
-                <w:color w:val="17261F"/>
-                <w:sz w:val="16"/>
-                <w:szCs w:val="16"/>
-              </w:rPr>
-              <w:t xml:space="preserve">  classDef clay fill:#FBE9E1,stroke:#B85A38,color:#17261F</w:t>
-            </w:r>
-          </w:p>
-          <w:p>
-            <w:pPr>
-              <w:spacing w:before="0" w:after="0" w:line="252" w:lineRule="auto"/>
-            </w:pPr>
-            <w:r>
-              <w:rPr>
-                <w:rFonts w:ascii="JetBrains Mono" w:hAnsi="JetBrains Mono" w:eastAsia="JetBrains Mono" w:cs="JetBrains Mono"/>
-                <w:color w:val="17261F"/>
-                <w:sz w:val="16"/>
-                <w:szCs w:val="16"/>
-              </w:rPr>
-              <w:t xml:space="preserve">  classDef core fill:#067A52,stroke:#0B3D2B,color:#FFFFFF</w:t>
-            </w:r>
-          </w:p>
-          <w:p>
-            <w:pPr>
-              <w:spacing w:before="0" w:after="0" w:line="252" w:lineRule="auto"/>
-            </w:pPr>
-            <w:r>
-              <w:rPr>
-                <w:rFonts w:ascii="JetBrains Mono" w:hAnsi="JetBrains Mono" w:eastAsia="JetBrains Mono" w:cs="JetBrains Mono"/>
-                <w:color w:val="17261F"/>
-                <w:sz w:val="16"/>
-                <w:szCs w:val="16"/>
-              </w:rPr>
-              <w:t xml:space="preserve">  classDef deep fill:#0B3D2B,stroke:#06281C,color:#FFFFFF</w:t>
-            </w:r>
-          </w:p>
-          <w:p>
-            <w:pPr>
-              <w:spacing w:before="0" w:after="0" w:line="252" w:lineRule="auto"/>
-            </w:pPr>
-            <w:r>
-              <w:rPr>
-                <w:rFonts w:ascii="JetBrains Mono" w:hAnsi="JetBrains Mono" w:eastAsia="JetBrains Mono" w:cs="JetBrains Mono"/>
-                <w:color w:val="17261F"/>
-                <w:sz w:val="16"/>
-                <w:szCs w:val="16"/>
-              </w:rPr>
-              <w:t xml:space="preserve">  classDef muted fill:#F2F7F4,stroke:#5B6B63,color:#17261F</w:t>
-            </w:r>
-          </w:p>
-          <w:p>
-            <w:pPr>
-              <w:spacing w:before="0" w:after="0" w:line="252" w:lineRule="auto"/>
-            </w:pPr>
-            <w:r>
-              <w:rPr>
-                <w:rFonts w:ascii="JetBrains Mono" w:hAnsi="JetBrains Mono" w:eastAsia="JetBrains Mono" w:cs="JetBrains Mono"/>
-                <w:color w:val="17261F"/>
-                <w:sz w:val="16"/>
-                <w:szCs w:val="16"/>
-              </w:rPr>
-              <w:t xml:space="preserve">  class batch,use core</w:t>
-            </w:r>
-          </w:p>
-          <w:p>
-            <w:pPr>
-              <w:spacing w:before="0" w:after="0" w:line="252" w:lineRule="auto"/>
-            </w:pPr>
-            <w:r>
-              <w:rPr>
-                <w:rFonts w:ascii="JetBrains Mono" w:hAnsi="JetBrains Mono" w:eastAsia="JetBrains Mono" w:cs="JetBrains Mono"/>
-                <w:color w:val="17261F"/>
-                <w:sz w:val="16"/>
-                <w:szCs w:val="16"/>
-              </w:rPr>
-              <w:t xml:space="preserve">  class store,quality,features,compare,tune,unsup leaf</w:t>
-            </w:r>
-          </w:p>
-          <w:p>
-            <w:pPr>
-              <w:spacing w:before="0" w:after="0" w:line="252" w:lineRule="auto"/>
-            </w:pPr>
-            <w:r>
-              <w:rPr>
-                <w:rFonts w:ascii="JetBrains Mono" w:hAnsi="JetBrains Mono" w:eastAsia="JetBrains Mono" w:cs="JetBrains Mono"/>
-                <w:color w:val="17261F"/>
-                <w:sz w:val="16"/>
-                <w:szCs w:val="16"/>
-              </w:rPr>
-              <w:t xml:space="preserve">  class trigger,duel sun</w:t>
-            </w:r>
-          </w:p>
-          <w:p>
-            <w:pPr>
-              <w:spacing w:before="0" w:after="0" w:line="252" w:lineRule="auto"/>
-            </w:pPr>
-            <w:r>
-              <w:rPr>
-                <w:rFonts w:ascii="JetBrains Mono" w:hAnsi="JetBrains Mono" w:eastAsia="JetBrains Mono" w:cs="JetBrains Mono"/>
-                <w:color w:val="17261F"/>
-                <w:sz w:val="16"/>
-                <w:szCs w:val="16"/>
-              </w:rPr>
-              <w:t xml:space="preserve">  class champion,keep,wait muted</w:t>
-            </w:r>
-          </w:p>
-        </w:tc>
-      </w:tr>
-    </w:tbl>
-    <w:p>
-      <w:pPr>
-        <w:spacing w:before="160" w:after="0" w:line="240" w:lineRule="auto"/>
+    <w:p>
+      <w:pPr>
+        <w:spacing w:before="240" w:after="0" w:line="240" w:lineRule="auto"/>
         <w:rPr>
           <w:sz w:val="8"/>
         </w:rPr>
       </w:pPr>
-    </w:p>
-    <w:p>
-      <w:pPr>
-        <w:spacing w:before="0" w:after="140" w:line="288" w:lineRule="auto"/>
-      </w:pPr>
-      <w:r>
-        <w:rPr>
-          <w:color w:val="17261F"/>
-          <w:sz w:val="20"/>
-          <w:szCs w:val="20"/>
-        </w:rPr>
-        <w:t xml:space="preserve">Solo aprende de cultivos </w:t>
-      </w:r>
-      <w:r>
-        <w:rPr>
-          <w:b/>
-          <w:bCs/>
-          <w:color w:val="17261F"/>
-          <w:sz w:val="20"/>
-          <w:szCs w:val="20"/>
-        </w:rPr>
-        <w:t xml:space="preserve">reales</w:t>
-      </w:r>
-      <w:r>
-        <w:rPr>
-          <w:color w:val="17261F"/>
-          <w:sz w:val="20"/>
-          <w:szCs w:val="20"/>
-        </w:rPr>
-        <w:t xml:space="preserve">: la API no envía las lecturas de los cultivos virtuales, que son sintéticas. Cada especie entrena por separado y en un proceso aparte para no frenar las evaluaciones; una tarea queda pendiente, con su razón, mientras falten datos o casos. Borrar un cultivo borra sus lecturas.</w:t>
-      </w:r>
     </w:p>
     <w:p>
       <w:pPr>
@@ -4803,14 +3675,14 @@
           <w:sz w:val="16"/>
           <w:szCs w:val="16"/>
         </w:rPr>
-        <w:t xml:space="preserve">SECCIÓN 05</w:t>
+        <w:t xml:space="preserve">SECCIÓN 06</w:t>
       </w:r>
     </w:p>
     <w:p>
       <w:pPr>
         <w:pStyle w:val="Heading1"/>
       </w:pPr>
-      <w:bookmarkStart w:id="112" w:name="sec_112"/>
+      <w:bookmarkStart w:id="115" w:name="sec_115"/>
       <w:r>
         <w:rPr>
           <w:b/>
@@ -4819,569 +3691,9 @@
           <w:sz w:val="34"/>
           <w:szCs w:val="34"/>
         </w:rPr>
-        <w:t xml:space="preserve">Análisis de flota</w:t>
-      </w:r>
-      <w:bookmarkEnd w:id="112"/>
-    </w:p>
-    <w:p>
-      <w:pPr>
-        <w:keepNext/>
-        <w:spacing w:before="120" w:after="60" w:line="288" w:lineRule="auto"/>
-        <w:jc w:val="center"/>
-      </w:pPr>
-      <w:r>
-        <w:drawing>
-          <wp:inline distT="0" distB="0" distL="0" distR="0">
-            <wp:extent cx="5943600" cy="3052419"/>
-            <wp:docPr id="113" name="SmartPot_AI_03_Fleet_Analysis"/>
-            <wp:cNvGraphicFramePr>
-              <a:graphicFrameLocks noChangeAspect="1"/>
-            </wp:cNvGraphicFramePr>
-            <a:graphic>
-              <a:graphicData uri="http://schemas.openxmlformats.org/drawingml/2006/picture">
-                <pic:pic>
-                  <pic:nvPicPr>
-                    <pic:cNvPr id="113" name="SmartPot_AI_03_Fleet_Analysis"/>
-                    <pic:cNvPicPr/>
-                  </pic:nvPicPr>
-                  <pic:blipFill>
-                    <a:blip r:embed="rIdImg6"/>
-                    <a:stretch>
-                      <a:fillRect/>
-                    </a:stretch>
-                  </pic:blipFill>
-                  <pic:spPr>
-                    <a:xfrm>
-                      <a:off x="0" y="0"/>
-                      <a:ext cx="5943600" cy="3052419"/>
-                    </a:xfrm>
-                    <a:prstGeom prst="rect">
-                      <a:avLst/>
-                    </a:prstGeom>
-                  </pic:spPr>
-                </pic:pic>
-              </a:graphicData>
-            </a:graphic>
-          </wp:inline>
-        </w:drawing>
-      </w:r>
-    </w:p>
-    <w:p>
-      <w:pPr>
-        <w:spacing w:before="0" w:after="240" w:line="288" w:lineRule="auto"/>
-        <w:jc w:val="center"/>
-      </w:pPr>
-      <w:r>
-        <w:rPr>
-          <w:b/>
-          <w:bCs/>
-          <w:color w:val="067A52"/>
-          <w:sz w:val="16"/>
-          <w:szCs w:val="16"/>
-        </w:rPr>
-        <w:t xml:space="preserve">Figura 4</w:t>
-      </w:r>
-      <w:r>
-        <w:rPr>
-          <w:i/>
-          <w:iCs/>
-          <w:color w:val="5B6B63"/>
-          <w:sz w:val="16"/>
-          <w:szCs w:val="16"/>
-        </w:rPr>
-        <w:t xml:space="preserve">  ·  Análisis de todos los cultivos de una cuenta</w:t>
-      </w:r>
-    </w:p>
-    <w:p>
-      <w:pPr>
-        <w:spacing w:before="80" w:after="0" w:line="240" w:lineRule="auto"/>
-        <w:rPr>
-          <w:sz w:val="8"/>
-        </w:rPr>
-      </w:pPr>
-    </w:p>
-    <w:tbl>
-      <w:tblPr>
-        <w:tblW w:w="9360" w:type="dxa"/>
-        <w:tblInd w:w="0" w:type="dxa"/>
-        <w:tblBorders>
-          <w:top w:val="nil"/>
-          <w:left w:val="nil"/>
-          <w:bottom w:val="nil"/>
-          <w:right w:val="nil"/>
-          <w:insideH w:val="nil"/>
-          <w:insideV w:val="nil"/>
-        </w:tblBorders>
-        <w:tblLayout w:type="fixed"/>
-        <w:tblCellMar>
-          <w:left w:w="0" w:type="dxa"/>
-          <w:right w:w="0" w:type="dxa"/>
-        </w:tblCellMar>
-        <w:tblLook w:val="0000" w:firstRow="0" w:lastRow="0" w:firstColumn="0" w:lastColumn="0" w:noHBand="1" w:noVBand="1"/>
-      </w:tblPr>
-      <w:tblGrid>
-        <w:gridCol w:w="9360"/>
-      </w:tblGrid>
-      <w:tr>
-        <w:trPr>
-          <w:cantSplit/>
-        </w:trPr>
-        <w:tc>
-          <w:tcPr>
-            <w:tcW w:w="9360" w:type="dxa"/>
-            <w:shd w:val="clear" w:color="auto" w:fill="0B3D2B"/>
-            <w:tcMar>
-              <w:top w:w="60" w:type="dxa"/>
-              <w:left w:w="200" w:type="dxa"/>
-              <w:bottom w:w="60" w:type="dxa"/>
-              <w:right w:w="200" w:type="dxa"/>
-            </w:tcMar>
-            <w:vAlign w:val="top"/>
-          </w:tcPr>
-          <w:p>
-            <w:pPr>
-              <w:spacing w:before="0" w:after="0" w:line="240" w:lineRule="auto"/>
-            </w:pPr>
-            <w:r>
-              <w:rPr>
-                <w:b/>
-                <w:bCs/>
-                <w:color w:val="7FDBB0"/>
-                <w:spacing w:val="40"/>
-                <w:sz w:val="14"/>
-                <w:szCs w:val="14"/>
-              </w:rPr>
-              <w:t xml:space="preserve">MERMAID</w:t>
-            </w:r>
-          </w:p>
-        </w:tc>
-      </w:tr>
-    </w:tbl>
-    <w:tbl>
-      <w:tblPr>
-        <w:tblW w:w="9360" w:type="dxa"/>
-        <w:tblInd w:w="0" w:type="dxa"/>
-        <w:tblBorders>
-          <w:top w:val="nil"/>
-          <w:left w:val="nil"/>
-          <w:bottom w:val="nil"/>
-          <w:right w:val="nil"/>
-          <w:insideH w:val="nil"/>
-          <w:insideV w:val="nil"/>
-        </w:tblBorders>
-        <w:tblLayout w:type="fixed"/>
-        <w:tblCellMar>
-          <w:left w:w="0" w:type="dxa"/>
-          <w:right w:w="0" w:type="dxa"/>
-        </w:tblCellMar>
-        <w:tblLook w:val="0000" w:firstRow="0" w:lastRow="0" w:firstColumn="0" w:lastColumn="0" w:noHBand="1" w:noVBand="1"/>
-      </w:tblPr>
-      <w:tblGrid>
-        <w:gridCol w:w="9360"/>
-      </w:tblGrid>
-      <w:tr>
-        <w:trPr>
-          <w:cantSplit/>
-        </w:trPr>
-        <w:tc>
-          <w:tcPr>
-            <w:tcW w:w="9360" w:type="dxa"/>
-            <w:shd w:val="clear" w:color="auto" w:fill="F7FAF8"/>
-            <w:tcMar>
-              <w:top w:w="120" w:type="dxa"/>
-              <w:left w:w="200" w:type="dxa"/>
-              <w:bottom w:w="120" w:type="dxa"/>
-              <w:right w:w="200" w:type="dxa"/>
-            </w:tcMar>
-            <w:vAlign w:val="top"/>
-          </w:tcPr>
-          <w:p>
-            <w:pPr>
-              <w:spacing w:before="0" w:after="0" w:line="252" w:lineRule="auto"/>
-            </w:pPr>
-            <w:r>
-              <w:rPr>
-                <w:rFonts w:ascii="JetBrains Mono" w:hAnsi="JetBrains Mono" w:eastAsia="JetBrains Mono" w:cs="JetBrains Mono"/>
-                <w:color w:val="17261F"/>
-                <w:sz w:val="16"/>
-                <w:szCs w:val="16"/>
-              </w:rPr>
-              <w:t xml:space="preserve">%%{init: {"theme": "base", "fontFamily": "Segoe UI, Arial, sans-serif", "themeVariables": {"fontFamily": "Segoe UI, Arial, sans-serif", "fontSize": "15px", "primaryColor": "#DDF5EA", "primaryTextColor": "#17261F", "primaryBorderColor": "#067A52", "secondaryColor": "#E3F2FB", "secondaryTextColor": "#17261F", "secondaryBorderColor": "#1F6FA0", "tertiaryColor": "#F2F7F4", "tertiaryTextColor": "#17261F", "tertiaryBorderColor": "#D5E3DC", "lineColor": "#5B6B63", "textColor": "#17261F", "mainBkg": "#DDF5EA", "nodeBorder": "#067A52", "clusterBkg": "#F7FAF8", "clusterBorder": "#D5E3DC", "edgeLabelBackground": "#FFFFFF", "actorBkg": "#067A52", "actorBorder": "#0B3D2B", "actorTextColor": "#FFFFFF", "actorLineColor": "#5B6B63", "signalColor": "#17261F", "signalTextColor": "#17261F", "labelBoxBkgColor": "#0B3D2B", "labelBoxBorderColor": "#0B3D2B", "labelTextColor": "#FFFFFF", "loopTextColor": "#0B3D2B", "noteBkgColor": "#FDF4DD", "noteBorderColor": "#C98D12", "noteTextColor": "#17261F", "activationBkgColor": "#DDF5EA", "activationBorderColor": "#067A52", "attributeBackgroundColorOdd": "#FFFFFF", "attributeBackgroundColorEven": "#F2F7F4"}}}%%</w:t>
-            </w:r>
-          </w:p>
-          <w:p>
-            <w:pPr>
-              <w:spacing w:before="0" w:after="0" w:line="252" w:lineRule="auto"/>
-            </w:pPr>
-            <w:r>
-              <w:rPr>
-                <w:rFonts w:ascii="JetBrains Mono" w:hAnsi="JetBrains Mono" w:eastAsia="JetBrains Mono" w:cs="JetBrains Mono"/>
-                <w:color w:val="17261F"/>
-                <w:sz w:val="16"/>
-                <w:szCs w:val="16"/>
-              </w:rPr>
-              <w:t xml:space="preserve">flowchart TB</w:t>
-            </w:r>
-          </w:p>
-          <w:p>
-            <w:pPr>
-              <w:spacing w:before="0" w:after="0" w:line="252" w:lineRule="auto"/>
-            </w:pPr>
-            <w:r>
-              <w:rPr>
-                <w:rFonts w:ascii="JetBrains Mono" w:hAnsi="JetBrains Mono" w:eastAsia="JetBrains Mono" w:cs="JetBrains Mono"/>
-                <w:color w:val="17261F"/>
-                <w:sz w:val="16"/>
-                <w:szCs w:val="16"/>
-              </w:rPr>
-              <w:t xml:space="preserve">  req(["POST /v1/fleet&lt;br/&gt;todos los cultivos de una cuenta"]) --&gt; each["Evaluación de cada cultivo&lt;br/&gt;como en /v1/insights"]</w:t>
-            </w:r>
-          </w:p>
-          <w:p>
-            <w:pPr>
-              <w:spacing w:before="0" w:after="0" w:line="252" w:lineRule="auto"/>
-            </w:pPr>
-            <w:r>
-              <w:rPr>
-                <w:rFonts w:ascii="JetBrains Mono" w:hAnsi="JetBrains Mono" w:eastAsia="JetBrains Mono" w:cs="JetBrains Mono"/>
-                <w:color w:val="17261F"/>
-                <w:sz w:val="16"/>
-                <w:szCs w:val="16"/>
-              </w:rPr>
-              <w:t xml:space="preserve">  each --&gt; rank["Ranking por salud"]</w:t>
-            </w:r>
-          </w:p>
-          <w:p>
-            <w:pPr>
-              <w:spacing w:before="0" w:after="0" w:line="252" w:lineRule="auto"/>
-            </w:pPr>
-            <w:r>
-              <w:rPr>
-                <w:rFonts w:ascii="JetBrains Mono" w:hAnsi="JetBrains Mono" w:eastAsia="JetBrains Mono" w:cs="JetBrains Mono"/>
-                <w:color w:val="17261F"/>
-                <w:sz w:val="16"/>
-                <w:szCs w:val="16"/>
-              </w:rPr>
-              <w:t xml:space="preserve">  each --&gt; shared["Problemas compartidos&lt;br/&gt;la misma variable fuera de rango&lt;br/&gt;en la mitad o más de los cultivos"]</w:t>
-            </w:r>
-          </w:p>
-          <w:p>
-            <w:pPr>
-              <w:spacing w:before="0" w:after="0" w:line="252" w:lineRule="auto"/>
-            </w:pPr>
-            <w:r>
-              <w:rPr>
-                <w:rFonts w:ascii="JetBrains Mono" w:hAnsi="JetBrains Mono" w:eastAsia="JetBrains Mono" w:cs="JetBrains Mono"/>
-                <w:color w:val="17261F"/>
-                <w:sz w:val="16"/>
-                <w:szCs w:val="16"/>
-              </w:rPr>
-              <w:t xml:space="preserve">  each --&gt; groups["Grupos K-Means&lt;br/&gt;número de grupos por silueta"]</w:t>
-            </w:r>
-          </w:p>
-          <w:p>
-            <w:pPr>
-              <w:spacing w:before="0" w:after="0" w:line="252" w:lineRule="auto"/>
-            </w:pPr>
-            <w:r>
-              <w:rPr>
-                <w:rFonts w:ascii="JetBrains Mono" w:hAnsi="JetBrains Mono" w:eastAsia="JetBrains Mono" w:cs="JetBrains Mono"/>
-                <w:color w:val="17261F"/>
-                <w:sz w:val="16"/>
-                <w:szCs w:val="16"/>
-              </w:rPr>
-              <w:t xml:space="preserve">  each --&gt; actions["Acciones del agente&lt;br/&gt;reunidas por actuador"]</w:t>
-            </w:r>
-          </w:p>
-          <w:p>
-            <w:pPr>
-              <w:spacing w:before="0" w:after="0" w:line="252" w:lineRule="auto"/>
-            </w:pPr>
-            <w:r>
-              <w:rPr>
-                <w:rFonts w:ascii="JetBrains Mono" w:hAnsi="JetBrains Mono" w:eastAsia="JetBrains Mono" w:cs="JetBrains Mono"/>
-                <w:color w:val="17261F"/>
-                <w:sz w:val="16"/>
-                <w:szCs w:val="16"/>
-              </w:rPr>
-              <w:t xml:space="preserve">  rank &amp; shared &amp; groups &amp; actions --&gt; out(["Resumen de la flota&lt;br/&gt;para el panel general y las órdenes en bloque"])</w:t>
-            </w:r>
-          </w:p>
-          <w:p>
-            <w:pPr>
-              <w:spacing w:before="0" w:after="0" w:line="252" w:lineRule="auto"/>
-            </w:pPr>
-            <w:r>
-              <w:rPr>
-                <w:rFonts w:ascii="JetBrains Mono" w:hAnsi="JetBrains Mono" w:eastAsia="JetBrains Mono" w:cs="JetBrains Mono"/>
-                <w:color w:val="17261F"/>
-                <w:sz w:val="16"/>
-                <w:szCs w:val="16"/>
-              </w:rPr>
-              <w:t xml:space="preserve">  classDef leaf fill:#DDF5EA,stroke:#067A52,color:#17261F</w:t>
-            </w:r>
-          </w:p>
-          <w:p>
-            <w:pPr>
-              <w:spacing w:before="0" w:after="0" w:line="252" w:lineRule="auto"/>
-            </w:pPr>
-            <w:r>
-              <w:rPr>
-                <w:rFonts w:ascii="JetBrains Mono" w:hAnsi="JetBrains Mono" w:eastAsia="JetBrains Mono" w:cs="JetBrains Mono"/>
-                <w:color w:val="17261F"/>
-                <w:sz w:val="16"/>
-                <w:szCs w:val="16"/>
-              </w:rPr>
-              <w:t xml:space="preserve">  classDef water fill:#E3F2FB,stroke:#1F6FA0,color:#17261F</w:t>
-            </w:r>
-          </w:p>
-          <w:p>
-            <w:pPr>
-              <w:spacing w:before="0" w:after="0" w:line="252" w:lineRule="auto"/>
-            </w:pPr>
-            <w:r>
-              <w:rPr>
-                <w:rFonts w:ascii="JetBrains Mono" w:hAnsi="JetBrains Mono" w:eastAsia="JetBrains Mono" w:cs="JetBrains Mono"/>
-                <w:color w:val="17261F"/>
-                <w:sz w:val="16"/>
-                <w:szCs w:val="16"/>
-              </w:rPr>
-              <w:t xml:space="preserve">  classDef sun fill:#FDF4DD,stroke:#C98D12,color:#17261F</w:t>
-            </w:r>
-          </w:p>
-          <w:p>
-            <w:pPr>
-              <w:spacing w:before="0" w:after="0" w:line="252" w:lineRule="auto"/>
-            </w:pPr>
-            <w:r>
-              <w:rPr>
-                <w:rFonts w:ascii="JetBrains Mono" w:hAnsi="JetBrains Mono" w:eastAsia="JetBrains Mono" w:cs="JetBrains Mono"/>
-                <w:color w:val="17261F"/>
-                <w:sz w:val="16"/>
-                <w:szCs w:val="16"/>
-              </w:rPr>
-              <w:t xml:space="preserve">  classDef clay fill:#FBE9E1,stroke:#B85A38,color:#17261F</w:t>
-            </w:r>
-          </w:p>
-          <w:p>
-            <w:pPr>
-              <w:spacing w:before="0" w:after="0" w:line="252" w:lineRule="auto"/>
-            </w:pPr>
-            <w:r>
-              <w:rPr>
-                <w:rFonts w:ascii="JetBrains Mono" w:hAnsi="JetBrains Mono" w:eastAsia="JetBrains Mono" w:cs="JetBrains Mono"/>
-                <w:color w:val="17261F"/>
-                <w:sz w:val="16"/>
-                <w:szCs w:val="16"/>
-              </w:rPr>
-              <w:t xml:space="preserve">  classDef core fill:#067A52,stroke:#0B3D2B,color:#FFFFFF</w:t>
-            </w:r>
-          </w:p>
-          <w:p>
-            <w:pPr>
-              <w:spacing w:before="0" w:after="0" w:line="252" w:lineRule="auto"/>
-            </w:pPr>
-            <w:r>
-              <w:rPr>
-                <w:rFonts w:ascii="JetBrains Mono" w:hAnsi="JetBrains Mono" w:eastAsia="JetBrains Mono" w:cs="JetBrains Mono"/>
-                <w:color w:val="17261F"/>
-                <w:sz w:val="16"/>
-                <w:szCs w:val="16"/>
-              </w:rPr>
-              <w:t xml:space="preserve">  classDef deep fill:#0B3D2B,stroke:#06281C,color:#FFFFFF</w:t>
-            </w:r>
-          </w:p>
-          <w:p>
-            <w:pPr>
-              <w:spacing w:before="0" w:after="0" w:line="252" w:lineRule="auto"/>
-            </w:pPr>
-            <w:r>
-              <w:rPr>
-                <w:rFonts w:ascii="JetBrains Mono" w:hAnsi="JetBrains Mono" w:eastAsia="JetBrains Mono" w:cs="JetBrains Mono"/>
-                <w:color w:val="17261F"/>
-                <w:sz w:val="16"/>
-                <w:szCs w:val="16"/>
-              </w:rPr>
-              <w:t xml:space="preserve">  classDef muted fill:#F2F7F4,stroke:#5B6B63,color:#17261F</w:t>
-            </w:r>
-          </w:p>
-          <w:p>
-            <w:pPr>
-              <w:spacing w:before="0" w:after="0" w:line="252" w:lineRule="auto"/>
-            </w:pPr>
-            <w:r>
-              <w:rPr>
-                <w:rFonts w:ascii="JetBrains Mono" w:hAnsi="JetBrains Mono" w:eastAsia="JetBrains Mono" w:cs="JetBrains Mono"/>
-                <w:color w:val="17261F"/>
-                <w:sz w:val="16"/>
-                <w:szCs w:val="16"/>
-              </w:rPr>
-              <w:t xml:space="preserve">  class req,out core</w:t>
-            </w:r>
-          </w:p>
-          <w:p>
-            <w:pPr>
-              <w:spacing w:before="0" w:after="0" w:line="252" w:lineRule="auto"/>
-            </w:pPr>
-            <w:r>
-              <w:rPr>
-                <w:rFonts w:ascii="JetBrains Mono" w:hAnsi="JetBrains Mono" w:eastAsia="JetBrains Mono" w:cs="JetBrains Mono"/>
-                <w:color w:val="17261F"/>
-                <w:sz w:val="16"/>
-                <w:szCs w:val="16"/>
-              </w:rPr>
-              <w:t xml:space="preserve">  class each sun</w:t>
-            </w:r>
-          </w:p>
-          <w:p>
-            <w:pPr>
-              <w:spacing w:before="0" w:after="0" w:line="252" w:lineRule="auto"/>
-            </w:pPr>
-            <w:r>
-              <w:rPr>
-                <w:rFonts w:ascii="JetBrains Mono" w:hAnsi="JetBrains Mono" w:eastAsia="JetBrains Mono" w:cs="JetBrains Mono"/>
-                <w:color w:val="17261F"/>
-                <w:sz w:val="16"/>
-                <w:szCs w:val="16"/>
-              </w:rPr>
-              <w:t xml:space="preserve">  class rank,shared,groups,actions leaf</w:t>
-            </w:r>
-          </w:p>
-        </w:tc>
-      </w:tr>
-    </w:tbl>
-    <w:p>
-      <w:pPr>
-        <w:spacing w:before="160" w:after="0" w:line="240" w:lineRule="auto"/>
-        <w:rPr>
-          <w:sz w:val="8"/>
-        </w:rPr>
-      </w:pPr>
-    </w:p>
-    <w:p>
-      <w:pPr>
-        <w:pageBreakBefore/>
-        <w:spacing w:before="0" w:after="0" w:line="20" w:lineRule="exact"/>
-        <w:rPr>
-          <w:sz w:val="2"/>
-        </w:rPr>
-      </w:pPr>
-    </w:p>
-    <w:tbl>
-      <w:tblPr>
-        <w:tblW w:w="9360" w:type="dxa"/>
-        <w:tblInd w:w="0" w:type="dxa"/>
-        <w:tblBorders>
-          <w:top w:val="nil"/>
-          <w:left w:val="nil"/>
-          <w:bottom w:val="nil"/>
-          <w:right w:val="nil"/>
-          <w:insideH w:val="nil"/>
-          <w:insideV w:val="nil"/>
-        </w:tblBorders>
-        <w:tblLayout w:type="fixed"/>
-        <w:tblCellMar>
-          <w:left w:w="0" w:type="dxa"/>
-          <w:right w:w="0" w:type="dxa"/>
-        </w:tblCellMar>
-        <w:tblLook w:val="0000" w:firstRow="0" w:lastRow="0" w:firstColumn="0" w:lastColumn="0" w:noHBand="1" w:noVBand="1"/>
-      </w:tblPr>
-      <w:tblGrid>
-        <w:gridCol w:w="9360"/>
-      </w:tblGrid>
-      <w:tr>
-        <w:trPr>
-          <w:cantSplit/>
-        </w:trPr>
-        <w:tc>
-          <w:tcPr>
-            <w:tcW w:w="9360" w:type="dxa"/>
-            <w:shd w:val="clear" w:color="auto" w:fill="0B3D2B"/>
-            <w:tcMar>
-              <w:top w:w="420" w:type="dxa"/>
-              <w:left w:w="480" w:type="dxa"/>
-              <w:bottom w:w="420" w:type="dxa"/>
-              <w:right w:w="480" w:type="dxa"/>
-            </w:tcMar>
-            <w:vAlign w:val="top"/>
-          </w:tcPr>
-          <w:p>
-            <w:pPr>
-              <w:spacing w:before="0" w:after="80" w:line="288" w:lineRule="auto"/>
-            </w:pPr>
-            <w:r>
-              <w:rPr>
-                <w:b/>
-                <w:bCs/>
-                <w:caps/>
-                <w:color w:val="F2B632"/>
-                <w:spacing w:val="60"/>
-                <w:sz w:val="17"/>
-                <w:szCs w:val="17"/>
-              </w:rPr>
-              <w:t xml:space="preserve">PARTE III</w:t>
-            </w:r>
-          </w:p>
-          <w:p>
-            <w:pPr>
-              <w:spacing w:before="0" w:after="0" w:line="240" w:lineRule="auto"/>
-            </w:pPr>
-            <w:r>
-              <w:rPr>
-                <w:rFonts w:ascii="Century Gothic" w:hAnsi="Century Gothic" w:eastAsia="Century Gothic" w:cs="Century Gothic"/>
-                <w:b/>
-                <w:bCs/>
-                <w:color w:val="FFFFFF"/>
-                <w:sz w:val="44"/>
-                <w:szCs w:val="44"/>
-              </w:rPr>
-              <w:t xml:space="preserve">Operación</w:t>
-            </w:r>
-          </w:p>
-        </w:tc>
-      </w:tr>
-    </w:tbl>
-    <w:p>
-      <w:pPr>
-        <w:spacing w:before="240" w:after="0" w:line="240" w:lineRule="auto"/>
-        <w:rPr>
-          <w:sz w:val="8"/>
-        </w:rPr>
-      </w:pPr>
-    </w:p>
-    <w:p>
-      <w:pPr>
-        <w:keepNext/>
-        <w:spacing w:before="360" w:after="40" w:line="288" w:lineRule="auto"/>
-      </w:pPr>
-      <w:r>
-        <w:rPr>
-          <w:b/>
-          <w:bCs/>
-          <w:color w:val="009A64"/>
-          <w:spacing w:val="60"/>
-          <w:sz w:val="16"/>
-          <w:szCs w:val="16"/>
-        </w:rPr>
-        <w:t xml:space="preserve">SECCIÓN 06</w:t>
-      </w:r>
-    </w:p>
-    <w:p>
-      <w:pPr>
-        <w:pStyle w:val="Heading1"/>
-      </w:pPr>
-      <w:bookmarkStart w:id="114" w:name="sec_114"/>
-      <w:r>
-        <w:rPr>
-          <w:b/>
-          <w:bCs/>
-          <w:color w:val="0B3D2B"/>
-          <w:sz w:val="34"/>
-          <w:szCs w:val="34"/>
-        </w:rPr>
         <w:t xml:space="preserve">Contrato</w:t>
       </w:r>
-      <w:bookmarkEnd w:id="114"/>
+      <w:bookmarkEnd w:id="115"/>
     </w:p>
     <w:p>
       <w:pPr>
@@ -5960,7 +4272,7 @@
                 <w:sz w:val="17"/>
                 <w:szCs w:val="17"/>
               </w:rPr>
-              <w:t xml:space="preserve">POST, GET</w:t>
+              <w:t xml:space="preserve">GET</w:t>
             </w:r>
           </w:p>
         </w:tc>
@@ -5987,24 +4299,7 @@
                 <w:sz w:val="15"/>
                 <w:szCs w:val="15"/>
               </w:rPr>
-              <w:t xml:space="preserve">/v1/learning/readings</w:t>
-            </w:r>
-            <w:r>
-              <w:rPr>
-                <w:color w:val="17261F"/>
-                <w:sz w:val="17"/>
-                <w:szCs w:val="17"/>
-              </w:rPr>
-              <w:t xml:space="preserve">, </w:t>
-            </w:r>
-            <w:r>
-              <w:rPr>
-                <w:rFonts w:ascii="JetBrains Mono" w:hAnsi="JetBrains Mono" w:eastAsia="JetBrains Mono" w:cs="JetBrains Mono"/>
-                <w:color w:val="0A5A3C"/>
-                <w:sz w:val="15"/>
-                <w:szCs w:val="15"/>
-              </w:rPr>
-              <w:t xml:space="preserve">/v1/learning/status</w:t>
+              <w:t xml:space="preserve">/v1/engine</w:t>
             </w:r>
           </w:p>
         </w:tc>
@@ -6030,7 +4325,7 @@
                 <w:sz w:val="17"/>
                 <w:szCs w:val="17"/>
               </w:rPr>
-              <w:t xml:space="preserve">Recibe lecturas reales por lote; informa lo aprendido por especie</w:t>
+              <w:t xml:space="preserve">Telemetría, versión y compilación del motor C++20</w:t>
             </w:r>
           </w:p>
         </w:tc>
@@ -6063,7 +4358,7 @@
                 <w:sz w:val="17"/>
                 <w:szCs w:val="17"/>
               </w:rPr>
-              <w:t xml:space="preserve">POST, DELETE</w:t>
+              <w:t xml:space="preserve">POST, GET</w:t>
             </w:r>
           </w:p>
         </w:tc>
@@ -6090,7 +4385,7 @@
                 <w:sz w:val="15"/>
                 <w:szCs w:val="15"/>
               </w:rPr>
-              <w:t xml:space="preserve">/v1/learning/train</w:t>
+              <w:t xml:space="preserve">/v1/learning/readings</w:t>
             </w:r>
             <w:r>
               <w:rPr>
@@ -6107,7 +4402,7 @@
                 <w:sz w:val="15"/>
                 <w:szCs w:val="15"/>
               </w:rPr>
-              <w:t xml:space="preserve">/v1/learning/crops/{cropId}</w:t>
+              <w:t xml:space="preserve">/v1/learning/status</w:t>
             </w:r>
           </w:p>
         </w:tc>
@@ -6115,6 +4410,109 @@
           <w:tcPr>
             <w:tcW w:w="4271" w:type="dxa"/>
             <w:shd w:val="clear" w:color="auto" w:fill="F2F7F4"/>
+            <w:tcMar>
+              <w:top w:w="70" w:type="dxa"/>
+              <w:left w:w="110" w:type="dxa"/>
+              <w:bottom w:w="70" w:type="dxa"/>
+              <w:right w:w="110" w:type="dxa"/>
+            </w:tcMar>
+            <w:vAlign w:val="center"/>
+          </w:tcPr>
+          <w:p>
+            <w:pPr>
+              <w:spacing w:before="0" w:after="0" w:line="252" w:lineRule="auto"/>
+            </w:pPr>
+            <w:r>
+              <w:rPr>
+                <w:color w:val="17261F"/>
+                <w:sz w:val="17"/>
+                <w:szCs w:val="17"/>
+              </w:rPr>
+              <w:t xml:space="preserve">Recibe lecturas reales por lote; informa lo aprendido por especie</w:t>
+            </w:r>
+          </w:p>
+        </w:tc>
+      </w:tr>
+      <w:tr>
+        <w:trPr>
+          <w:cantSplit/>
+        </w:trPr>
+        <w:tc>
+          <w:tcPr>
+            <w:tcW w:w="1183" w:type="dxa"/>
+            <w:shd w:val="clear" w:color="auto" w:fill="FFFFFF"/>
+            <w:tcMar>
+              <w:top w:w="70" w:type="dxa"/>
+              <w:left w:w="110" w:type="dxa"/>
+              <w:bottom w:w="70" w:type="dxa"/>
+              <w:right w:w="110" w:type="dxa"/>
+            </w:tcMar>
+            <w:vAlign w:val="center"/>
+          </w:tcPr>
+          <w:p>
+            <w:pPr>
+              <w:spacing w:before="0" w:after="0" w:line="252" w:lineRule="auto"/>
+            </w:pPr>
+            <w:r>
+              <w:rPr>
+                <w:b/>
+                <w:bCs/>
+                <w:color w:val="0A5A3C"/>
+                <w:sz w:val="17"/>
+                <w:szCs w:val="17"/>
+              </w:rPr>
+              <w:t xml:space="preserve">POST, DELETE</w:t>
+            </w:r>
+          </w:p>
+        </w:tc>
+        <w:tc>
+          <w:tcPr>
+            <w:tcW w:w="3906" w:type="dxa"/>
+            <w:shd w:val="clear" w:color="auto" w:fill="FFFFFF"/>
+            <w:tcMar>
+              <w:top w:w="70" w:type="dxa"/>
+              <w:left w:w="110" w:type="dxa"/>
+              <w:bottom w:w="70" w:type="dxa"/>
+              <w:right w:w="110" w:type="dxa"/>
+            </w:tcMar>
+            <w:vAlign w:val="center"/>
+          </w:tcPr>
+          <w:p>
+            <w:pPr>
+              <w:spacing w:before="0" w:after="0" w:line="252" w:lineRule="auto"/>
+            </w:pPr>
+            <w:r>
+              <w:rPr>
+                <w:rFonts w:ascii="JetBrains Mono" w:hAnsi="JetBrains Mono" w:eastAsia="JetBrains Mono" w:cs="JetBrains Mono"/>
+                <w:color w:val="0A5A3C"/>
+                <w:sz w:val="15"/>
+                <w:szCs w:val="15"/>
+              </w:rPr>
+              <w:t xml:space="preserve">/v1/learning/train</w:t>
+            </w:r>
+            <w:r>
+              <w:rPr>
+                <w:color w:val="17261F"/>
+                <w:sz w:val="17"/>
+                <w:szCs w:val="17"/>
+              </w:rPr>
+              <w:t xml:space="preserve">, </w:t>
+            </w:r>
+            <w:r>
+              <w:rPr>
+                <w:rFonts w:ascii="JetBrains Mono" w:hAnsi="JetBrains Mono" w:eastAsia="JetBrains Mono" w:cs="JetBrains Mono"/>
+                <w:color w:val="0A5A3C"/>
+                <w:sz w:val="15"/>
+                <w:szCs w:val="15"/>
+              </w:rPr>
+              <w:t xml:space="preserve">/v1/learning/crops/{cropId}</w:t>
+            </w:r>
+          </w:p>
+        </w:tc>
+        <w:tc>
+          <w:tcPr>
+            <w:tcW w:w="4271" w:type="dxa"/>
+            <w:shd w:val="clear" w:color="auto" w:fill="FFFFFF"/>
             <w:tcMar>
               <w:top w:w="70" w:type="dxa"/>
               <w:left w:w="110" w:type="dxa"/>
@@ -6168,7 +4566,7 @@
       <w:pPr>
         <w:pStyle w:val="Heading1"/>
       </w:pPr>
-      <w:bookmarkStart w:id="115" w:name="sec_115"/>
+      <w:bookmarkStart w:id="116" w:name="sec_116"/>
       <w:r>
         <w:rPr>
           <w:b/>
@@ -6179,7 +4577,7 @@
         </w:rPr>
         <w:t xml:space="preserve">Configuración</w:t>
       </w:r>
-      <w:bookmarkEnd w:id="115"/>
+      <w:bookmarkEnd w:id="116"/>
     </w:p>
     <w:p>
       <w:pPr>
@@ -6746,7 +5144,7 @@
       <w:pPr>
         <w:pStyle w:val="Heading1"/>
       </w:pPr>
-      <w:bookmarkStart w:id="116" w:name="sec_116"/>
+      <w:bookmarkStart w:id="117" w:name="sec_117"/>
       <w:r>
         <w:rPr>
           <w:b/>
@@ -6757,7 +5155,7 @@
         </w:rPr>
         <w:t xml:space="preserve">Pruebas</w:t>
       </w:r>
-      <w:bookmarkEnd w:id="116"/>
+      <w:bookmarkEnd w:id="117"/>
     </w:p>
     <w:p>
       <w:pPr>
@@ -6795,7 +5193,24 @@
           <w:sz w:val="20"/>
           <w:szCs w:val="20"/>
         </w:rPr>
-        <w:t xml:space="preserve">: 84 pruebas sobre la base de conocimiento, el encadenamiento de reglas, la monotonía del índice difuso, la exactitud mínima de los modelos, el pronóstico, el agente, la lluvia y el sensor frente al clima, el consejo de lugar, la flota, el contrato HTTP y el aprendizaje continuo (seudonimización, poda, calidad, etiquetas, modelos que superan a la línea base, campeón y retador, persistencia).</w:t>
+        <w:t xml:space="preserve">: 92 pruebas sobre la base de conocimiento, paridad matemática y numérica exacta entre Python y C++ (&lt; 10⁻⁶), encadenamiento de reglas, la monotonía del índice difuso, la exactitud mínima de los modelos, el pronóstico, el agente, la lluvia y el sensor frente al clima, el consejo de lugar, la flota, el contrato HTTP, telemetría del motor (</w:t>
+      </w:r>
+      <w:r>
+        <w:rPr>
+          <w:rFonts w:ascii="JetBrains Mono" w:hAnsi="JetBrains Mono" w:eastAsia="JetBrains Mono" w:cs="JetBrains Mono"/>
+          <w:color w:val="0A5A3C"/>
+          <w:sz w:val="18"/>
+          <w:szCs w:val="18"/>
+        </w:rPr>
+        <w:t xml:space="preserve">/v1/engine</w:t>
+      </w:r>
+      <w:r>
+        <w:rPr>
+          <w:color w:val="17261F"/>
+          <w:sz w:val="20"/>
+          <w:szCs w:val="20"/>
+        </w:rPr>
+        <w:t xml:space="preserve">) y el aprendizaje continuo (seudonimización, poda, calidad, etiquetas, modelos que superan a la línea base, campeón y retador, persistencia).</w:t>
       </w:r>
     </w:p>
     <w:p>
@@ -6819,7 +5234,7 @@
       <w:pPr>
         <w:pStyle w:val="Heading1"/>
       </w:pPr>
-      <w:bookmarkStart w:id="117" w:name="sec_117"/>
+      <w:bookmarkStart w:id="118" w:name="sec_118"/>
       <w:r>
         <w:rPr>
           <w:b/>
@@ -6830,7 +5245,7 @@
         </w:rPr>
         <w:t xml:space="preserve">Operación</w:t>
       </w:r>
-      <w:bookmarkEnd w:id="117"/>
+      <w:bookmarkEnd w:id="118"/>
     </w:p>
     <w:p>
       <w:pPr>
@@ -7347,7 +5762,7 @@
             <w:drawing>
               <wp:inline distT="0" distB="0" distL="0" distR="0">
                 <wp:extent cx="180000" cy="180000"/>
-                <wp:docPr id="118" name="Icono"/>
+                <wp:docPr id="119" name="Icono"/>
                 <wp:cNvGraphicFramePr>
                   <a:graphicFrameLocks noChangeAspect="1"/>
                 </wp:cNvGraphicFramePr>
@@ -7355,7 +5770,7 @@
                   <a:graphicData uri="http://schemas.openxmlformats.org/drawingml/2006/picture">
                     <pic:pic>
                       <pic:nvPicPr>
-                        <pic:cNvPr id="118" name="Icono"/>
+                        <pic:cNvPr id="119" name="Icono"/>
                         <pic:cNvPicPr/>
                       </pic:nvPicPr>
                       <pic:blipFill>
@@ -7428,7 +5843,7 @@
               <w:sz w:val="14"/>
               <w:szCs w:val="14"/>
             </w:rPr>
-            <w:t xml:space="preserve">SMARTPOT-AI · V1.1</w:t>
+            <w:t xml:space="preserve">SMARTPOT-AI · V1.2</w:t>
           </w:r>
         </w:p>
       </w:tc>

</xml_diff>